<commit_message>
Fix count badge bug, time column format, CCCD in student list; update user guide to v1.1
- api/class-counts: support admin sessions (return counts for all published classes)
- admin/enrollment.html: fix [object Object]/25 by extracting .count from API response object
- admin/enrollment.html: fix time column format to "Thứ X - Sáng/Chiều - Tiết X–Y"
- admin/enrollment/<id>/students: include cccd field in response
- admin/enrollment.html: reorder Khối before Lớp in student list modal
- generate_huongdan.py + docx: v1.1 – update guide with password policy, reset-password flow,
  status/email columns, live search, phase-based behavior for teachers/students, new time format

Co-Authored-By: Claude Sonnet 4.6 <noreply@anthropic.com>
</commit_message>
<xml_diff>
--- a/Hướng_dẫn_sử_dụng_mynhc.docx
+++ b/Hướng_dẫn_sử_dụng_mynhc.docx
@@ -144,7 +144,7 @@
           <w:color w:val="606060"/>
           <w:sz w:val="22"/>
         </w:rPr>
-        <w:t>Phiên bản 1.0  |  Cập nhật: Tháng 8 năm 2026</w:t>
+        <w:t>Phiên bản 1.1  |  Cập nhật: Tháng 8 năm 2026</w:t>
       </w:r>
     </w:p>
     <w:p>
@@ -1584,7 +1584,7 @@
                 <w:i w:val="0"/>
                 <w:sz w:val="24"/>
               </w:rPr>
-              <w:t>12</w:t>
+              <w:t>13</w:t>
             </w:r>
           </w:p>
         </w:tc>
@@ -1667,7 +1667,7 @@
                 <w:i w:val="0"/>
                 <w:sz w:val="24"/>
               </w:rPr>
-              <w:t>15</w:t>
+              <w:t>16</w:t>
             </w:r>
           </w:p>
         </w:tc>
@@ -5064,711 +5064,6 @@
       <w:tr>
         <w:tc>
           <w:tcPr>
-            <w:tcW w:type="dxa" w:w="850"/>
-            <w:shd w:val="clear" w:color="auto" w:fill="2E74B5"/>
-          </w:tcPr>
-          <w:p>
-            <w:pPr>
-              <w:jc w:val="center"/>
-            </w:pPr>
-            <w:r>
-              <w:rPr>
-                <w:rFonts w:ascii="Times New Roman" w:hAnsi="Times New Roman" w:cs="Times New Roman"/>
-                <w:b/>
-                <w:i w:val="0"/>
-                <w:color w:val="FFFFFF"/>
-                <w:sz w:val="24"/>
-              </w:rPr>
-              <w:t>Cột</w:t>
-            </w:r>
-          </w:p>
-        </w:tc>
-        <w:tc>
-          <w:tcPr>
-            <w:tcW w:type="dxa" w:w="1984"/>
-            <w:shd w:val="clear" w:color="auto" w:fill="2E74B5"/>
-          </w:tcPr>
-          <w:p>
-            <w:pPr>
-              <w:jc w:val="center"/>
-            </w:pPr>
-            <w:r>
-              <w:rPr>
-                <w:rFonts w:ascii="Times New Roman" w:hAnsi="Times New Roman" w:cs="Times New Roman"/>
-                <w:b/>
-                <w:i w:val="0"/>
-                <w:color w:val="FFFFFF"/>
-                <w:sz w:val="24"/>
-              </w:rPr>
-              <w:t>Mô tả</w:t>
-            </w:r>
-          </w:p>
-        </w:tc>
-      </w:tr>
-      <w:tr>
-        <w:tc>
-          <w:tcPr>
-            <w:tcW w:type="dxa" w:w="850"/>
-          </w:tcPr>
-          <w:p>
-            <w:pPr>
-              <w:jc w:val="left"/>
-            </w:pPr>
-            <w:r>
-              <w:rPr>
-                <w:rFonts w:ascii="Times New Roman" w:hAnsi="Times New Roman" w:cs="Times New Roman"/>
-                <w:b w:val="0"/>
-                <w:i w:val="0"/>
-                <w:sz w:val="24"/>
-              </w:rPr>
-              <w:t>STT</w:t>
-            </w:r>
-          </w:p>
-        </w:tc>
-        <w:tc>
-          <w:tcPr>
-            <w:tcW w:type="dxa" w:w="1984"/>
-          </w:tcPr>
-          <w:p>
-            <w:pPr>
-              <w:jc w:val="left"/>
-            </w:pPr>
-            <w:r>
-              <w:rPr>
-                <w:rFonts w:ascii="Times New Roman" w:hAnsi="Times New Roman" w:cs="Times New Roman"/>
-                <w:b w:val="0"/>
-                <w:i w:val="0"/>
-                <w:sz w:val="24"/>
-              </w:rPr>
-              <w:t>Số thứ tự</w:t>
-            </w:r>
-          </w:p>
-        </w:tc>
-      </w:tr>
-      <w:tr>
-        <w:tc>
-          <w:tcPr>
-            <w:tcW w:type="dxa" w:w="850"/>
-            <w:shd w:val="clear" w:color="auto" w:fill="DEEAF1"/>
-          </w:tcPr>
-          <w:p>
-            <w:pPr>
-              <w:jc w:val="left"/>
-            </w:pPr>
-            <w:r>
-              <w:rPr>
-                <w:rFonts w:ascii="Times New Roman" w:hAnsi="Times New Roman" w:cs="Times New Roman"/>
-                <w:b w:val="0"/>
-                <w:i w:val="0"/>
-                <w:sz w:val="24"/>
-              </w:rPr>
-              <w:t>Mã giáo viên</w:t>
-            </w:r>
-          </w:p>
-        </w:tc>
-        <w:tc>
-          <w:tcPr>
-            <w:tcW w:type="dxa" w:w="1984"/>
-            <w:shd w:val="clear" w:color="auto" w:fill="DEEAF1"/>
-          </w:tcPr>
-          <w:p>
-            <w:pPr>
-              <w:jc w:val="left"/>
-            </w:pPr>
-            <w:r>
-              <w:rPr>
-                <w:rFonts w:ascii="Times New Roman" w:hAnsi="Times New Roman" w:cs="Times New Roman"/>
-                <w:b w:val="0"/>
-                <w:i w:val="0"/>
-                <w:sz w:val="24"/>
-              </w:rPr>
-              <w:t>Mã định danh dùng để đăng nhập</w:t>
-            </w:r>
-          </w:p>
-        </w:tc>
-      </w:tr>
-      <w:tr>
-        <w:tc>
-          <w:tcPr>
-            <w:tcW w:type="dxa" w:w="850"/>
-          </w:tcPr>
-          <w:p>
-            <w:pPr>
-              <w:jc w:val="left"/>
-            </w:pPr>
-            <w:r>
-              <w:rPr>
-                <w:rFonts w:ascii="Times New Roman" w:hAnsi="Times New Roman" w:cs="Times New Roman"/>
-                <w:b w:val="0"/>
-                <w:i w:val="0"/>
-                <w:sz w:val="24"/>
-              </w:rPr>
-              <w:t>Họ và tên</w:t>
-            </w:r>
-          </w:p>
-        </w:tc>
-        <w:tc>
-          <w:tcPr>
-            <w:tcW w:type="dxa" w:w="1984"/>
-          </w:tcPr>
-          <w:p>
-            <w:pPr>
-              <w:jc w:val="left"/>
-            </w:pPr>
-            <w:r>
-              <w:rPr>
-                <w:rFonts w:ascii="Times New Roman" w:hAnsi="Times New Roman" w:cs="Times New Roman"/>
-                <w:b w:val="0"/>
-                <w:i w:val="0"/>
-                <w:sz w:val="24"/>
-              </w:rPr>
-              <w:t>Tên đầy đủ của giáo viên</w:t>
-            </w:r>
-          </w:p>
-        </w:tc>
-      </w:tr>
-      <w:tr>
-        <w:tc>
-          <w:tcPr>
-            <w:tcW w:type="dxa" w:w="850"/>
-            <w:shd w:val="clear" w:color="auto" w:fill="DEEAF1"/>
-          </w:tcPr>
-          <w:p>
-            <w:pPr>
-              <w:jc w:val="left"/>
-            </w:pPr>
-            <w:r>
-              <w:rPr>
-                <w:rFonts w:ascii="Times New Roman" w:hAnsi="Times New Roman" w:cs="Times New Roman"/>
-                <w:b w:val="0"/>
-                <w:i w:val="0"/>
-                <w:sz w:val="24"/>
-              </w:rPr>
-              <w:t>Môn dạy</w:t>
-            </w:r>
-          </w:p>
-        </w:tc>
-        <w:tc>
-          <w:tcPr>
-            <w:tcW w:type="dxa" w:w="1984"/>
-            <w:shd w:val="clear" w:color="auto" w:fill="DEEAF1"/>
-          </w:tcPr>
-          <w:p>
-            <w:pPr>
-              <w:jc w:val="left"/>
-            </w:pPr>
-            <w:r>
-              <w:rPr>
-                <w:rFonts w:ascii="Times New Roman" w:hAnsi="Times New Roman" w:cs="Times New Roman"/>
-                <w:b w:val="0"/>
-                <w:i w:val="0"/>
-                <w:sz w:val="24"/>
-              </w:rPr>
-              <w:t>Môn học giáo viên phụ trách</w:t>
-            </w:r>
-          </w:p>
-        </w:tc>
-      </w:tr>
-      <w:tr>
-        <w:tc>
-          <w:tcPr>
-            <w:tcW w:type="dxa" w:w="850"/>
-          </w:tcPr>
-          <w:p>
-            <w:pPr>
-              <w:jc w:val="left"/>
-            </w:pPr>
-            <w:r>
-              <w:rPr>
-                <w:rFonts w:ascii="Times New Roman" w:hAnsi="Times New Roman" w:cs="Times New Roman"/>
-                <w:b w:val="0"/>
-                <w:i w:val="0"/>
-                <w:sz w:val="24"/>
-              </w:rPr>
-              <w:t>Email</w:t>
-            </w:r>
-          </w:p>
-        </w:tc>
-        <w:tc>
-          <w:tcPr>
-            <w:tcW w:type="dxa" w:w="1984"/>
-          </w:tcPr>
-          <w:p>
-            <w:pPr>
-              <w:jc w:val="left"/>
-            </w:pPr>
-            <w:r>
-              <w:rPr>
-                <w:rFonts w:ascii="Times New Roman" w:hAnsi="Times New Roman" w:cs="Times New Roman"/>
-                <w:b w:val="0"/>
-                <w:i w:val="0"/>
-                <w:sz w:val="24"/>
-              </w:rPr>
-              <w:t>Địa chỉ email (nếu có)</w:t>
-            </w:r>
-          </w:p>
-        </w:tc>
-      </w:tr>
-      <w:tr>
-        <w:tc>
-          <w:tcPr>
-            <w:tcW w:type="dxa" w:w="850"/>
-            <w:shd w:val="clear" w:color="auto" w:fill="DEEAF1"/>
-          </w:tcPr>
-          <w:p>
-            <w:pPr>
-              <w:jc w:val="left"/>
-            </w:pPr>
-            <w:r>
-              <w:rPr>
-                <w:rFonts w:ascii="Times New Roman" w:hAnsi="Times New Roman" w:cs="Times New Roman"/>
-                <w:b w:val="0"/>
-                <w:i w:val="0"/>
-                <w:sz w:val="24"/>
-              </w:rPr>
-              <w:t>Thao tác</w:t>
-            </w:r>
-          </w:p>
-        </w:tc>
-        <w:tc>
-          <w:tcPr>
-            <w:tcW w:type="dxa" w:w="1984"/>
-            <w:shd w:val="clear" w:color="auto" w:fill="DEEAF1"/>
-          </w:tcPr>
-          <w:p>
-            <w:pPr>
-              <w:jc w:val="left"/>
-            </w:pPr>
-            <w:r>
-              <w:rPr>
-                <w:rFonts w:ascii="Times New Roman" w:hAnsi="Times New Roman" w:cs="Times New Roman"/>
-                <w:b w:val="0"/>
-                <w:i w:val="0"/>
-                <w:sz w:val="24"/>
-              </w:rPr>
-              <w:t>Nút Sửa và nút Xoá</w:t>
-            </w:r>
-          </w:p>
-        </w:tc>
-      </w:tr>
-    </w:tbl>
-    <w:p/>
-    <w:p>
-      <w:pPr>
-        <w:pStyle w:val="Heading3"/>
-      </w:pPr>
-      <w:r>
-        <w:rPr>
-          <w:rFonts w:ascii="Times New Roman" w:hAnsi="Times New Roman" w:cs="Times New Roman"/>
-          <w:b/>
-          <w:color w:val="1F7489"/>
-          <w:sz w:val="26"/>
-        </w:rPr>
-        <w:t>3.2.2. Thêm giáo viên mới</w:t>
-      </w:r>
-    </w:p>
-    <w:p>
-      <w:pPr>
-        <w:pStyle w:val="ListNumber"/>
-        <w:spacing w:after="60"/>
-        <w:ind w:left="567"/>
-      </w:pPr>
-      <w:r>
-        <w:rPr>
-          <w:rFonts w:ascii="Times New Roman" w:hAnsi="Times New Roman" w:cs="Times New Roman"/>
-          <w:b w:val="0"/>
-          <w:i w:val="0"/>
-          <w:sz w:val="26"/>
-        </w:rPr>
-        <w:t>Nhấn nút Thêm giáo viên (màu xanh lá) phía trên bảng danh sách.</w:t>
-      </w:r>
-    </w:p>
-    <w:p>
-      <w:pPr>
-        <w:pStyle w:val="ListNumber"/>
-        <w:spacing w:after="60"/>
-        <w:ind w:left="567"/>
-      </w:pPr>
-      <w:r>
-        <w:rPr>
-          <w:rFonts w:ascii="Times New Roman" w:hAnsi="Times New Roman" w:cs="Times New Roman"/>
-          <w:b w:val="0"/>
-          <w:i w:val="0"/>
-          <w:sz w:val="26"/>
-        </w:rPr>
-        <w:t>Điền đầy đủ thông tin trong form: Mã giáo viên, Họ và tên, Môn dạy, Email (tuỳ chọn).</w:t>
-      </w:r>
-    </w:p>
-    <w:p>
-      <w:pPr>
-        <w:pStyle w:val="ListNumber"/>
-        <w:spacing w:after="60"/>
-        <w:ind w:left="567"/>
-      </w:pPr>
-      <w:r>
-        <w:rPr>
-          <w:rFonts w:ascii="Times New Roman" w:hAnsi="Times New Roman" w:cs="Times New Roman"/>
-          <w:b w:val="0"/>
-          <w:i w:val="0"/>
-          <w:sz w:val="26"/>
-        </w:rPr>
-        <w:t>Nhập mật khẩu ban đầu cho giáo viên (mặc định có thể đặt trùng mã GV).</w:t>
-      </w:r>
-    </w:p>
-    <w:p>
-      <w:pPr>
-        <w:pStyle w:val="ListNumber"/>
-        <w:spacing w:after="60"/>
-        <w:ind w:left="567"/>
-      </w:pPr>
-      <w:r>
-        <w:rPr>
-          <w:rFonts w:ascii="Times New Roman" w:hAnsi="Times New Roman" w:cs="Times New Roman"/>
-          <w:b w:val="0"/>
-          <w:i w:val="0"/>
-          <w:sz w:val="26"/>
-        </w:rPr>
-        <w:t>Nhấn Lưu để tạo tài khoản.</w:t>
-      </w:r>
-    </w:p>
-    <w:p>
-      <w:pPr>
-        <w:pStyle w:val="ListNumber"/>
-        <w:spacing w:after="60"/>
-        <w:ind w:left="567"/>
-      </w:pPr>
-      <w:r>
-        <w:rPr>
-          <w:rFonts w:ascii="Times New Roman" w:hAnsi="Times New Roman" w:cs="Times New Roman"/>
-          <w:b w:val="0"/>
-          <w:i w:val="0"/>
-          <w:sz w:val="26"/>
-        </w:rPr>
-        <w:t>Thông báo xanh lá xác nhận tạo thành công sẽ xuất hiện ở đầu trang.</w:t>
-      </w:r>
-    </w:p>
-    <w:p>
-      <w:pPr>
-        <w:pStyle w:val="Heading3"/>
-      </w:pPr>
-      <w:r>
-        <w:rPr>
-          <w:rFonts w:ascii="Times New Roman" w:hAnsi="Times New Roman" w:cs="Times New Roman"/>
-          <w:b/>
-          <w:color w:val="1F7489"/>
-          <w:sz w:val="26"/>
-        </w:rPr>
-        <w:t>3.2.3. Sửa thông tin giáo viên</w:t>
-      </w:r>
-    </w:p>
-    <w:p>
-      <w:pPr>
-        <w:pStyle w:val="ListNumber"/>
-        <w:spacing w:after="60"/>
-        <w:ind w:left="567"/>
-      </w:pPr>
-      <w:r>
-        <w:rPr>
-          <w:rFonts w:ascii="Times New Roman" w:hAnsi="Times New Roman" w:cs="Times New Roman"/>
-          <w:b w:val="0"/>
-          <w:i w:val="0"/>
-          <w:sz w:val="26"/>
-        </w:rPr>
-        <w:t>Tìm giáo viên cần sửa trong bảng danh sách.</w:t>
-      </w:r>
-    </w:p>
-    <w:p>
-      <w:pPr>
-        <w:pStyle w:val="ListNumber"/>
-        <w:spacing w:after="60"/>
-        <w:ind w:left="567"/>
-      </w:pPr>
-      <w:r>
-        <w:rPr>
-          <w:rFonts w:ascii="Times New Roman" w:hAnsi="Times New Roman" w:cs="Times New Roman"/>
-          <w:b w:val="0"/>
-          <w:i w:val="0"/>
-          <w:sz w:val="26"/>
-        </w:rPr>
-        <w:t>Nhấn nút Sửa (biểu tượng bút chì) ở cột Thao tác.</w:t>
-      </w:r>
-    </w:p>
-    <w:p>
-      <w:pPr>
-        <w:pStyle w:val="ListNumber"/>
-        <w:spacing w:after="60"/>
-        <w:ind w:left="567"/>
-      </w:pPr>
-      <w:r>
-        <w:rPr>
-          <w:rFonts w:ascii="Times New Roman" w:hAnsi="Times New Roman" w:cs="Times New Roman"/>
-          <w:b w:val="0"/>
-          <w:i w:val="0"/>
-          <w:sz w:val="26"/>
-        </w:rPr>
-        <w:t>Cập nhật thông tin trong form hiện ra.</w:t>
-      </w:r>
-    </w:p>
-    <w:p>
-      <w:pPr>
-        <w:pStyle w:val="ListNumber"/>
-        <w:spacing w:after="60"/>
-        <w:ind w:left="567"/>
-      </w:pPr>
-      <w:r>
-        <w:rPr>
-          <w:rFonts w:ascii="Times New Roman" w:hAnsi="Times New Roman" w:cs="Times New Roman"/>
-          <w:b w:val="0"/>
-          <w:i w:val="0"/>
-          <w:sz w:val="26"/>
-        </w:rPr>
-        <w:t>Nhấn Lưu thay đổi để xác nhận.</w:t>
-      </w:r>
-    </w:p>
-    <w:p>
-      <w:pPr>
-        <w:pStyle w:val="Heading3"/>
-      </w:pPr>
-      <w:r>
-        <w:rPr>
-          <w:rFonts w:ascii="Times New Roman" w:hAnsi="Times New Roman" w:cs="Times New Roman"/>
-          <w:b/>
-          <w:color w:val="1F7489"/>
-          <w:sz w:val="26"/>
-        </w:rPr>
-        <w:t>3.2.4. Xoá giáo viên</w:t>
-      </w:r>
-    </w:p>
-    <w:p>
-      <w:pPr>
-        <w:pStyle w:val="ListNumber"/>
-        <w:spacing w:after="60"/>
-        <w:ind w:left="567"/>
-      </w:pPr>
-      <w:r>
-        <w:rPr>
-          <w:rFonts w:ascii="Times New Roman" w:hAnsi="Times New Roman" w:cs="Times New Roman"/>
-          <w:b w:val="0"/>
-          <w:i w:val="0"/>
-          <w:sz w:val="26"/>
-        </w:rPr>
-        <w:t>Nhấn nút Xoá (biểu tượng thùng rác, màu đỏ) ở cột Thao tác của giáo viên cần xoá.</w:t>
-      </w:r>
-    </w:p>
-    <w:p>
-      <w:pPr>
-        <w:pStyle w:val="ListNumber"/>
-        <w:spacing w:after="60"/>
-        <w:ind w:left="567"/>
-      </w:pPr>
-      <w:r>
-        <w:rPr>
-          <w:rFonts w:ascii="Times New Roman" w:hAnsi="Times New Roman" w:cs="Times New Roman"/>
-          <w:b w:val="0"/>
-          <w:i w:val="0"/>
-          <w:sz w:val="26"/>
-        </w:rPr>
-        <w:t>Hộp thoại xác nhận xuất hiện. Nhấn Xác nhận để tiến hành xoá.</w:t>
-      </w:r>
-    </w:p>
-    <w:p>
-      <w:pPr>
-        <w:spacing w:before="120" w:after="0"/>
-        <w:ind w:left="283" w:right="283"/>
-        <w:shd w:val="clear" w:color="auto" w:fill="FCE4D6"/>
-      </w:pPr>
-      <w:r>
-        <w:rPr>
-          <w:rFonts w:ascii="Times New Roman" w:hAnsi="Times New Roman" w:cs="Times New Roman"/>
-          <w:b/>
-          <w:i w:val="0"/>
-          <w:color w:val="C05000"/>
-          <w:sz w:val="24"/>
-        </w:rPr>
-        <w:t xml:space="preserve">  Cảnh báo</w:t>
-      </w:r>
-    </w:p>
-    <w:p>
-      <w:pPr>
-        <w:spacing w:before="0" w:after="120"/>
-        <w:ind w:left="283" w:right="283"/>
-        <w:shd w:val="clear" w:color="auto" w:fill="FCE4D6"/>
-      </w:pPr>
-      <w:r>
-        <w:rPr>
-          <w:rFonts w:ascii="Times New Roman" w:hAnsi="Times New Roman" w:cs="Times New Roman"/>
-          <w:b w:val="0"/>
-          <w:i/>
-          <w:sz w:val="24"/>
-        </w:rPr>
-        <w:t xml:space="preserve">  Xoá giáo viên sẽ xoá toàn bộ lớp học mà giáo viên đó đã đăng ký mở. Hãy chắc chắn trước khi thực hiện thao tác này.</w:t>
-      </w:r>
-    </w:p>
-    <w:p>
-      <w:pPr>
-        <w:pStyle w:val="Heading3"/>
-      </w:pPr>
-      <w:r>
-        <w:rPr>
-          <w:rFonts w:ascii="Times New Roman" w:hAnsi="Times New Roman" w:cs="Times New Roman"/>
-          <w:b/>
-          <w:color w:val="1F7489"/>
-          <w:sz w:val="26"/>
-        </w:rPr>
-        <w:t>3.2.5. Nhập danh sách giáo viên từ Excel</w:t>
-      </w:r>
-    </w:p>
-    <w:p>
-      <w:pPr>
-        <w:pStyle w:val="ListNumber"/>
-        <w:spacing w:after="60"/>
-        <w:ind w:left="567"/>
-      </w:pPr>
-      <w:r>
-        <w:rPr>
-          <w:rFonts w:ascii="Times New Roman" w:hAnsi="Times New Roman" w:cs="Times New Roman"/>
-          <w:b w:val="0"/>
-          <w:i w:val="0"/>
-          <w:sz w:val="26"/>
-        </w:rPr>
-        <w:t>Nhấn nút Nhập Excel (biểu tượng file) ở phía trên bảng.</w:t>
-      </w:r>
-    </w:p>
-    <w:p>
-      <w:pPr>
-        <w:pStyle w:val="ListNumber"/>
-        <w:spacing w:after="60"/>
-        <w:ind w:left="567"/>
-      </w:pPr>
-      <w:r>
-        <w:rPr>
-          <w:rFonts w:ascii="Times New Roman" w:hAnsi="Times New Roman" w:cs="Times New Roman"/>
-          <w:b w:val="0"/>
-          <w:i w:val="0"/>
-          <w:sz w:val="26"/>
-        </w:rPr>
-        <w:t>Tải về file mẫu Excel để biết định dạng cột cần nhập.</w:t>
-      </w:r>
-    </w:p>
-    <w:p>
-      <w:pPr>
-        <w:pStyle w:val="ListNumber"/>
-        <w:spacing w:after="60"/>
-        <w:ind w:left="567"/>
-      </w:pPr>
-      <w:r>
-        <w:rPr>
-          <w:rFonts w:ascii="Times New Roman" w:hAnsi="Times New Roman" w:cs="Times New Roman"/>
-          <w:b w:val="0"/>
-          <w:i w:val="0"/>
-          <w:sz w:val="26"/>
-        </w:rPr>
-        <w:t>Điền dữ liệu vào file mẫu theo đúng cột: Mã GV, Họ tên, Môn dạy, Email, Mật khẩu.</w:t>
-      </w:r>
-    </w:p>
-    <w:p>
-      <w:pPr>
-        <w:pStyle w:val="ListNumber"/>
-        <w:spacing w:after="60"/>
-        <w:ind w:left="567"/>
-      </w:pPr>
-      <w:r>
-        <w:rPr>
-          <w:rFonts w:ascii="Times New Roman" w:hAnsi="Times New Roman" w:cs="Times New Roman"/>
-          <w:b w:val="0"/>
-          <w:i w:val="0"/>
-          <w:sz w:val="26"/>
-        </w:rPr>
-        <w:t>Upload file Excel đã điền lên hệ thống.</w:t>
-      </w:r>
-    </w:p>
-    <w:p>
-      <w:pPr>
-        <w:pStyle w:val="ListNumber"/>
-        <w:spacing w:after="60"/>
-        <w:ind w:left="567"/>
-      </w:pPr>
-      <w:r>
-        <w:rPr>
-          <w:rFonts w:ascii="Times New Roman" w:hAnsi="Times New Roman" w:cs="Times New Roman"/>
-          <w:b w:val="0"/>
-          <w:i w:val="0"/>
-          <w:sz w:val="26"/>
-        </w:rPr>
-        <w:t>Hệ thống xử lý và báo cáo số bản ghi thành công / lỗi.</w:t>
-      </w:r>
-    </w:p>
-    <w:p>
-      <w:pPr>
-        <w:spacing w:after="80"/>
-      </w:pPr>
-      <w:r>
-        <w:rPr>
-          <w:rFonts w:ascii="Times New Roman" w:hAnsi="Times New Roman" w:cs="Times New Roman"/>
-          <w:b w:val="0"/>
-          <w:i/>
-          <w:color w:val="707070"/>
-          <w:sz w:val="26"/>
-        </w:rPr>
-        <w:t>[Hình ảnh: Modal nhập Excel với bảng kết quả import]</w:t>
-      </w:r>
-    </w:p>
-    <w:p>
-      <w:pPr>
-        <w:pStyle w:val="Heading2"/>
-      </w:pPr>
-      <w:r>
-        <w:rPr>
-          <w:rFonts w:ascii="Times New Roman" w:hAnsi="Times New Roman" w:cs="Times New Roman"/>
-          <w:b/>
-          <w:color w:val="2E74B5"/>
-          <w:sz w:val="28"/>
-        </w:rPr>
-        <w:t>3.3. Quản lý Học sinh</w:t>
-      </w:r>
-    </w:p>
-    <w:p>
-      <w:pPr>
-        <w:spacing w:after="80"/>
-      </w:pPr>
-      <w:r>
-        <w:rPr>
-          <w:rFonts w:ascii="Times New Roman" w:hAnsi="Times New Roman" w:cs="Times New Roman"/>
-          <w:b w:val="0"/>
-          <w:i w:val="0"/>
-          <w:sz w:val="26"/>
-        </w:rPr>
-        <w:t>Trang Quản lý Học sinh cung cấp đầy đủ công cụ để quản lý tài khoản học sinh, bao gồm thêm/sửa/xoá và reset mật khẩu. Truy cập từ menu Admin → Quản lý Học sinh.</w:t>
-      </w:r>
-    </w:p>
-    <w:p>
-      <w:pPr>
-        <w:pStyle w:val="Heading3"/>
-      </w:pPr>
-      <w:r>
-        <w:rPr>
-          <w:rFonts w:ascii="Times New Roman" w:hAnsi="Times New Roman" w:cs="Times New Roman"/>
-          <w:b/>
-          <w:color w:val="1F7489"/>
-          <w:sz w:val="26"/>
-        </w:rPr>
-        <w:t>3.3.1. Xem danh sách học sinh</w:t>
-      </w:r>
-    </w:p>
-    <w:tbl>
-      <w:tblPr>
-        <w:tblStyle w:val="TableGrid"/>
-        <w:tblW w:type="auto" w:w="0"/>
-        <w:jc w:val="center"/>
-        <w:tblLook w:firstColumn="1" w:firstRow="1" w:lastColumn="0" w:lastRow="0" w:noHBand="0" w:noVBand="1" w:val="04A0"/>
-      </w:tblPr>
-      <w:tblGrid>
-        <w:gridCol w:w="4702"/>
-        <w:gridCol w:w="4702"/>
-      </w:tblGrid>
-      <w:tr>
-        <w:tc>
-          <w:tcPr>
             <w:tcW w:type="dxa" w:w="680"/>
             <w:shd w:val="clear" w:color="auto" w:fill="2E74B5"/>
           </w:tcPr>
@@ -5790,7 +5085,7 @@
         </w:tc>
         <w:tc>
           <w:tcPr>
-            <w:tcW w:type="dxa" w:w="1587"/>
+            <w:tcW w:type="dxa" w:w="1701"/>
             <w:shd w:val="clear" w:color="auto" w:fill="2E74B5"/>
           </w:tcPr>
           <w:p>
@@ -5832,7 +5127,7 @@
         </w:tc>
         <w:tc>
           <w:tcPr>
-            <w:tcW w:type="dxa" w:w="1587"/>
+            <w:tcW w:type="dxa" w:w="1701"/>
           </w:tcPr>
           <w:p>
             <w:pPr>
@@ -5867,13 +5162,13 @@
                 <w:i w:val="0"/>
                 <w:sz w:val="24"/>
               </w:rPr>
-              <w:t>MSSV</w:t>
+              <w:t>Mã giáo viên</w:t>
             </w:r>
           </w:p>
         </w:tc>
         <w:tc>
           <w:tcPr>
-            <w:tcW w:type="dxa" w:w="1587"/>
+            <w:tcW w:type="dxa" w:w="1701"/>
             <w:shd w:val="clear" w:color="auto" w:fill="DEEAF1"/>
           </w:tcPr>
           <w:p>
@@ -5887,7 +5182,7 @@
                 <w:i w:val="0"/>
                 <w:sz w:val="24"/>
               </w:rPr>
-              <w:t>Mã số học sinh, dùng để đăng nhập</w:t>
+              <w:t>Mã định danh dùng để đăng nhập (CCCD)</w:t>
             </w:r>
           </w:p>
         </w:tc>
@@ -5914,7 +5209,7 @@
         </w:tc>
         <w:tc>
           <w:tcPr>
-            <w:tcW w:type="dxa" w:w="1587"/>
+            <w:tcW w:type="dxa" w:w="1701"/>
           </w:tcPr>
           <w:p>
             <w:pPr>
@@ -5927,7 +5222,7 @@
                 <w:i w:val="0"/>
                 <w:sz w:val="24"/>
               </w:rPr>
-              <w:t>Tên đầy đủ học sinh</w:t>
+              <w:t>Tên đầy đủ của giáo viên</w:t>
             </w:r>
           </w:p>
         </w:tc>
@@ -5949,13 +5244,13 @@
                 <w:i w:val="0"/>
                 <w:sz w:val="24"/>
               </w:rPr>
-              <w:t>Khối</w:t>
+              <w:t>Môn dạy</w:t>
             </w:r>
           </w:p>
         </w:tc>
         <w:tc>
           <w:tcPr>
-            <w:tcW w:type="dxa" w:w="1587"/>
+            <w:tcW w:type="dxa" w:w="1701"/>
             <w:shd w:val="clear" w:color="auto" w:fill="DEEAF1"/>
           </w:tcPr>
           <w:p>
@@ -5969,7 +5264,7 @@
                 <w:i w:val="0"/>
                 <w:sz w:val="24"/>
               </w:rPr>
-              <w:t>Khối lớp học sinh đang học (10, 11 hoặc 12)</w:t>
+              <w:t>Môn học giáo viên phụ trách</w:t>
             </w:r>
           </w:p>
         </w:tc>
@@ -5990,13 +5285,13 @@
                 <w:i w:val="0"/>
                 <w:sz w:val="24"/>
               </w:rPr>
-              <w:t>Lớp</w:t>
+              <w:t>Email</w:t>
             </w:r>
           </w:p>
         </w:tc>
         <w:tc>
           <w:tcPr>
-            <w:tcW w:type="dxa" w:w="1587"/>
+            <w:tcW w:type="dxa" w:w="1701"/>
           </w:tcPr>
           <w:p>
             <w:pPr>
@@ -6009,7 +5304,7 @@
                 <w:i w:val="0"/>
                 <w:sz w:val="24"/>
               </w:rPr>
-              <w:t>Tên lớp học (ví dụ: 10A1, 11B2...)</w:t>
+              <w:t>Địa chỉ email (nếu có)</w:t>
             </w:r>
           </w:p>
         </w:tc>
@@ -6031,13 +5326,13 @@
                 <w:i w:val="0"/>
                 <w:sz w:val="24"/>
               </w:rPr>
-              <w:t>Trạng thái MK</w:t>
+              <w:t>Trạng thái TK</w:t>
             </w:r>
           </w:p>
         </w:tc>
         <w:tc>
           <w:tcPr>
-            <w:tcW w:type="dxa" w:w="1587"/>
+            <w:tcW w:type="dxa" w:w="1701"/>
             <w:shd w:val="clear" w:color="auto" w:fill="DEEAF1"/>
           </w:tcPr>
           <w:p>
@@ -6051,7 +5346,7 @@
                 <w:i w:val="0"/>
                 <w:sz w:val="24"/>
               </w:rPr>
-              <w:t>Đã đổi / Chưa đổi mật khẩu lần đầu</w:t>
+              <w:t>Đã kích hoạt / Chưa kích hoạt (màu xanh / xám)</w:t>
             </w:r>
           </w:p>
         </w:tc>
@@ -6078,7 +5373,7 @@
         </w:tc>
         <w:tc>
           <w:tcPr>
-            <w:tcW w:type="dxa" w:w="1587"/>
+            <w:tcW w:type="dxa" w:w="1701"/>
           </w:tcPr>
           <w:p>
             <w:pPr>
@@ -6091,13 +5386,1018 @@
                 <w:i w:val="0"/>
                 <w:sz w:val="24"/>
               </w:rPr>
-              <w:t>Nút Sửa, Xoá, Reset mật khẩu</w:t>
+              <w:t>Nút icon Sửa, Xoá, Khôi phục MK (chỉ hiện khi tài khoản đã kích hoạt)</w:t>
             </w:r>
           </w:p>
         </w:tc>
       </w:tr>
     </w:tbl>
     <w:p/>
+    <w:p>
+      <w:pPr>
+        <w:spacing w:after="80"/>
+      </w:pPr>
+      <w:r>
+        <w:rPr>
+          <w:rFonts w:ascii="Times New Roman" w:hAnsi="Times New Roman" w:cs="Times New Roman"/>
+          <w:b w:val="0"/>
+          <w:i w:val="0"/>
+          <w:sz w:val="26"/>
+        </w:rPr>
+        <w:t>Ô tìm kiếm phía trên bảng cho phép lọc giáo viên theo Họ tên hoặc Mã GV (CCCD) ngay lập tức mà không cần tải lại trang.</w:t>
+      </w:r>
+    </w:p>
+    <w:p>
+      <w:pPr>
+        <w:spacing w:before="120" w:after="0"/>
+        <w:ind w:left="283" w:right="283"/>
+        <w:shd w:val="clear" w:color="auto" w:fill="FFF2CC"/>
+      </w:pPr>
+      <w:r>
+        <w:rPr>
+          <w:rFonts w:ascii="Times New Roman" w:hAnsi="Times New Roman" w:cs="Times New Roman"/>
+          <w:b/>
+          <w:i w:val="0"/>
+          <w:color w:val="BF8F00"/>
+          <w:sz w:val="24"/>
+        </w:rPr>
+        <w:t xml:space="preserve">  Lưu ý</w:t>
+      </w:r>
+    </w:p>
+    <w:p>
+      <w:pPr>
+        <w:spacing w:before="0" w:after="120"/>
+        <w:ind w:left="283" w:right="283"/>
+        <w:shd w:val="clear" w:color="auto" w:fill="FFF2CC"/>
+      </w:pPr>
+      <w:r>
+        <w:rPr>
+          <w:rFonts w:ascii="Times New Roman" w:hAnsi="Times New Roman" w:cs="Times New Roman"/>
+          <w:b w:val="0"/>
+          <w:i/>
+          <w:sz w:val="24"/>
+        </w:rPr>
+        <w:t xml:space="preserve">  Tài khoản chưa kích hoạt (is_first_login = 1) không hiển thị nút Khôi phục MK và Reset. Giáo viên phải đăng nhập lần đầu và đặt mật khẩu mới thì tài khoản mới được coi là đã kích hoạt.</w:t>
+      </w:r>
+    </w:p>
+    <w:p>
+      <w:pPr>
+        <w:pStyle w:val="Heading3"/>
+      </w:pPr>
+      <w:r>
+        <w:rPr>
+          <w:rFonts w:ascii="Times New Roman" w:hAnsi="Times New Roman" w:cs="Times New Roman"/>
+          <w:b/>
+          <w:color w:val="1F7489"/>
+          <w:sz w:val="26"/>
+        </w:rPr>
+        <w:t>3.2.2. Thêm giáo viên mới</w:t>
+      </w:r>
+    </w:p>
+    <w:p>
+      <w:pPr>
+        <w:pStyle w:val="ListNumber"/>
+        <w:spacing w:after="60"/>
+        <w:ind w:left="567"/>
+      </w:pPr>
+      <w:r>
+        <w:rPr>
+          <w:rFonts w:ascii="Times New Roman" w:hAnsi="Times New Roman" w:cs="Times New Roman"/>
+          <w:b w:val="0"/>
+          <w:i w:val="0"/>
+          <w:sz w:val="26"/>
+        </w:rPr>
+        <w:t>Nhấn nút Thêm giáo viên (màu xanh lá) phía trên bảng danh sách.</w:t>
+      </w:r>
+    </w:p>
+    <w:p>
+      <w:pPr>
+        <w:pStyle w:val="ListNumber"/>
+        <w:spacing w:after="60"/>
+        <w:ind w:left="567"/>
+      </w:pPr>
+      <w:r>
+        <w:rPr>
+          <w:rFonts w:ascii="Times New Roman" w:hAnsi="Times New Roman" w:cs="Times New Roman"/>
+          <w:b w:val="0"/>
+          <w:i w:val="0"/>
+          <w:sz w:val="26"/>
+        </w:rPr>
+        <w:t>Điền đầy đủ thông tin trong form: Mã giáo viên, Họ và tên, Môn dạy, Email (tuỳ chọn).</w:t>
+      </w:r>
+    </w:p>
+    <w:p>
+      <w:pPr>
+        <w:pStyle w:val="ListNumber"/>
+        <w:spacing w:after="60"/>
+        <w:ind w:left="567"/>
+      </w:pPr>
+      <w:r>
+        <w:rPr>
+          <w:rFonts w:ascii="Times New Roman" w:hAnsi="Times New Roman" w:cs="Times New Roman"/>
+          <w:b w:val="0"/>
+          <w:i w:val="0"/>
+          <w:sz w:val="26"/>
+        </w:rPr>
+        <w:t>Nhập mật khẩu ban đầu cho giáo viên (mặc định có thể đặt trùng mã GV).</w:t>
+      </w:r>
+    </w:p>
+    <w:p>
+      <w:pPr>
+        <w:pStyle w:val="ListNumber"/>
+        <w:spacing w:after="60"/>
+        <w:ind w:left="567"/>
+      </w:pPr>
+      <w:r>
+        <w:rPr>
+          <w:rFonts w:ascii="Times New Roman" w:hAnsi="Times New Roman" w:cs="Times New Roman"/>
+          <w:b w:val="0"/>
+          <w:i w:val="0"/>
+          <w:sz w:val="26"/>
+        </w:rPr>
+        <w:t>Nhấn Lưu để tạo tài khoản.</w:t>
+      </w:r>
+    </w:p>
+    <w:p>
+      <w:pPr>
+        <w:pStyle w:val="ListNumber"/>
+        <w:spacing w:after="60"/>
+        <w:ind w:left="567"/>
+      </w:pPr>
+      <w:r>
+        <w:rPr>
+          <w:rFonts w:ascii="Times New Roman" w:hAnsi="Times New Roman" w:cs="Times New Roman"/>
+          <w:b w:val="0"/>
+          <w:i w:val="0"/>
+          <w:sz w:val="26"/>
+        </w:rPr>
+        <w:t>Thông báo xanh lá xác nhận tạo thành công sẽ xuất hiện ở đầu trang.</w:t>
+      </w:r>
+    </w:p>
+    <w:p>
+      <w:pPr>
+        <w:pStyle w:val="Heading3"/>
+      </w:pPr>
+      <w:r>
+        <w:rPr>
+          <w:rFonts w:ascii="Times New Roman" w:hAnsi="Times New Roman" w:cs="Times New Roman"/>
+          <w:b/>
+          <w:color w:val="1F7489"/>
+          <w:sz w:val="26"/>
+        </w:rPr>
+        <w:t>3.2.3. Sửa thông tin giáo viên</w:t>
+      </w:r>
+    </w:p>
+    <w:p>
+      <w:pPr>
+        <w:pStyle w:val="ListNumber"/>
+        <w:spacing w:after="60"/>
+        <w:ind w:left="567"/>
+      </w:pPr>
+      <w:r>
+        <w:rPr>
+          <w:rFonts w:ascii="Times New Roman" w:hAnsi="Times New Roman" w:cs="Times New Roman"/>
+          <w:b w:val="0"/>
+          <w:i w:val="0"/>
+          <w:sz w:val="26"/>
+        </w:rPr>
+        <w:t>Tìm giáo viên cần sửa trong bảng danh sách.</w:t>
+      </w:r>
+    </w:p>
+    <w:p>
+      <w:pPr>
+        <w:pStyle w:val="ListNumber"/>
+        <w:spacing w:after="60"/>
+        <w:ind w:left="567"/>
+      </w:pPr>
+      <w:r>
+        <w:rPr>
+          <w:rFonts w:ascii="Times New Roman" w:hAnsi="Times New Roman" w:cs="Times New Roman"/>
+          <w:b w:val="0"/>
+          <w:i w:val="0"/>
+          <w:sz w:val="26"/>
+        </w:rPr>
+        <w:t>Nhấn nút Sửa (biểu tượng bút chì) ở cột Thao tác.</w:t>
+      </w:r>
+    </w:p>
+    <w:p>
+      <w:pPr>
+        <w:pStyle w:val="ListNumber"/>
+        <w:spacing w:after="60"/>
+        <w:ind w:left="567"/>
+      </w:pPr>
+      <w:r>
+        <w:rPr>
+          <w:rFonts w:ascii="Times New Roman" w:hAnsi="Times New Roman" w:cs="Times New Roman"/>
+          <w:b w:val="0"/>
+          <w:i w:val="0"/>
+          <w:sz w:val="26"/>
+        </w:rPr>
+        <w:t>Cập nhật thông tin trong form hiện ra.</w:t>
+      </w:r>
+    </w:p>
+    <w:p>
+      <w:pPr>
+        <w:pStyle w:val="ListNumber"/>
+        <w:spacing w:after="60"/>
+        <w:ind w:left="567"/>
+      </w:pPr>
+      <w:r>
+        <w:rPr>
+          <w:rFonts w:ascii="Times New Roman" w:hAnsi="Times New Roman" w:cs="Times New Roman"/>
+          <w:b w:val="0"/>
+          <w:i w:val="0"/>
+          <w:sz w:val="26"/>
+        </w:rPr>
+        <w:t>Nhấn Lưu thay đổi để xác nhận.</w:t>
+      </w:r>
+    </w:p>
+    <w:p>
+      <w:pPr>
+        <w:pStyle w:val="Heading3"/>
+      </w:pPr>
+      <w:r>
+        <w:rPr>
+          <w:rFonts w:ascii="Times New Roman" w:hAnsi="Times New Roman" w:cs="Times New Roman"/>
+          <w:b/>
+          <w:color w:val="1F7489"/>
+          <w:sz w:val="26"/>
+        </w:rPr>
+        <w:t>3.2.4. Xoá giáo viên</w:t>
+      </w:r>
+    </w:p>
+    <w:p>
+      <w:pPr>
+        <w:pStyle w:val="ListNumber"/>
+        <w:spacing w:after="60"/>
+        <w:ind w:left="567"/>
+      </w:pPr>
+      <w:r>
+        <w:rPr>
+          <w:rFonts w:ascii="Times New Roman" w:hAnsi="Times New Roman" w:cs="Times New Roman"/>
+          <w:b w:val="0"/>
+          <w:i w:val="0"/>
+          <w:sz w:val="26"/>
+        </w:rPr>
+        <w:t>Nhấn nút Xoá (biểu tượng thùng rác, màu đỏ) ở cột Thao tác của giáo viên cần xoá.</w:t>
+      </w:r>
+    </w:p>
+    <w:p>
+      <w:pPr>
+        <w:pStyle w:val="ListNumber"/>
+        <w:spacing w:after="60"/>
+        <w:ind w:left="567"/>
+      </w:pPr>
+      <w:r>
+        <w:rPr>
+          <w:rFonts w:ascii="Times New Roman" w:hAnsi="Times New Roman" w:cs="Times New Roman"/>
+          <w:b w:val="0"/>
+          <w:i w:val="0"/>
+          <w:sz w:val="26"/>
+        </w:rPr>
+        <w:t>Hộp thoại xác nhận xuất hiện. Nhấn Xác nhận để tiến hành xoá.</w:t>
+      </w:r>
+    </w:p>
+    <w:p>
+      <w:pPr>
+        <w:spacing w:before="120" w:after="0"/>
+        <w:ind w:left="283" w:right="283"/>
+        <w:shd w:val="clear" w:color="auto" w:fill="FCE4D6"/>
+      </w:pPr>
+      <w:r>
+        <w:rPr>
+          <w:rFonts w:ascii="Times New Roman" w:hAnsi="Times New Roman" w:cs="Times New Roman"/>
+          <w:b/>
+          <w:i w:val="0"/>
+          <w:color w:val="C05000"/>
+          <w:sz w:val="24"/>
+        </w:rPr>
+        <w:t xml:space="preserve">  Cảnh báo</w:t>
+      </w:r>
+    </w:p>
+    <w:p>
+      <w:pPr>
+        <w:spacing w:before="0" w:after="120"/>
+        <w:ind w:left="283" w:right="283"/>
+        <w:shd w:val="clear" w:color="auto" w:fill="FCE4D6"/>
+      </w:pPr>
+      <w:r>
+        <w:rPr>
+          <w:rFonts w:ascii="Times New Roman" w:hAnsi="Times New Roman" w:cs="Times New Roman"/>
+          <w:b w:val="0"/>
+          <w:i/>
+          <w:sz w:val="24"/>
+        </w:rPr>
+        <w:t xml:space="preserve">  Xoá giáo viên sẽ xoá toàn bộ lớp học mà giáo viên đó đã đăng ký mở. Hãy chắc chắn trước khi thực hiện thao tác này.</w:t>
+      </w:r>
+    </w:p>
+    <w:p>
+      <w:pPr>
+        <w:pStyle w:val="Heading3"/>
+      </w:pPr>
+      <w:r>
+        <w:rPr>
+          <w:rFonts w:ascii="Times New Roman" w:hAnsi="Times New Roman" w:cs="Times New Roman"/>
+          <w:b/>
+          <w:color w:val="1F7489"/>
+          <w:sz w:val="26"/>
+        </w:rPr>
+        <w:t>3.2.5. Khôi phục mật khẩu giáo viên</w:t>
+      </w:r>
+    </w:p>
+    <w:p>
+      <w:pPr>
+        <w:spacing w:after="80"/>
+      </w:pPr>
+      <w:r>
+        <w:rPr>
+          <w:rFonts w:ascii="Times New Roman" w:hAnsi="Times New Roman" w:cs="Times New Roman"/>
+          <w:b w:val="0"/>
+          <w:i w:val="0"/>
+          <w:sz w:val="26"/>
+        </w:rPr>
+        <w:t>Khi giáo viên quên mật khẩu, quản trị viên tạo mật khẩu tạm thời và buộc đổi khi đăng nhập lần sau:</w:t>
+      </w:r>
+    </w:p>
+    <w:p>
+      <w:pPr>
+        <w:pStyle w:val="ListNumber"/>
+        <w:spacing w:after="60"/>
+        <w:ind w:left="567"/>
+      </w:pPr>
+      <w:r>
+        <w:rPr>
+          <w:rFonts w:ascii="Times New Roman" w:hAnsi="Times New Roman" w:cs="Times New Roman"/>
+          <w:b w:val="0"/>
+          <w:i w:val="0"/>
+          <w:sz w:val="26"/>
+        </w:rPr>
+        <w:t>Tìm giáo viên đã kích hoạt trong danh sách.</w:t>
+      </w:r>
+    </w:p>
+    <w:p>
+      <w:pPr>
+        <w:pStyle w:val="ListNumber"/>
+        <w:spacing w:after="60"/>
+        <w:ind w:left="567"/>
+      </w:pPr>
+      <w:r>
+        <w:rPr>
+          <w:rFonts w:ascii="Times New Roman" w:hAnsi="Times New Roman" w:cs="Times New Roman"/>
+          <w:b w:val="0"/>
+          <w:i w:val="0"/>
+          <w:sz w:val="26"/>
+        </w:rPr>
+        <w:t>Nhấn nút Khôi phục MK (biểu tượng chìa khoá, màu cam) ở cột Thao tác.</w:t>
+      </w:r>
+    </w:p>
+    <w:p>
+      <w:pPr>
+        <w:pStyle w:val="ListNumber"/>
+        <w:spacing w:after="60"/>
+        <w:ind w:left="567"/>
+      </w:pPr>
+      <w:r>
+        <w:rPr>
+          <w:rFonts w:ascii="Times New Roman" w:hAnsi="Times New Roman" w:cs="Times New Roman"/>
+          <w:b w:val="0"/>
+          <w:i w:val="0"/>
+          <w:sz w:val="26"/>
+        </w:rPr>
+        <w:t>Hộp thoại xác nhận xuất hiện. Nhấn Xác nhận.</w:t>
+      </w:r>
+    </w:p>
+    <w:p>
+      <w:pPr>
+        <w:pStyle w:val="ListNumber"/>
+        <w:spacing w:after="60"/>
+        <w:ind w:left="567"/>
+      </w:pPr>
+      <w:r>
+        <w:rPr>
+          <w:rFonts w:ascii="Times New Roman" w:hAnsi="Times New Roman" w:cs="Times New Roman"/>
+          <w:b w:val="0"/>
+          <w:i w:val="0"/>
+          <w:sz w:val="26"/>
+        </w:rPr>
+        <w:t>Hệ thống tạo mật khẩu tạm thời ngẫu nhiên 12 ký tự và hiển thị trong modal màu vàng.</w:t>
+      </w:r>
+    </w:p>
+    <w:p>
+      <w:pPr>
+        <w:pStyle w:val="ListNumber"/>
+        <w:spacing w:after="60"/>
+        <w:ind w:left="567"/>
+      </w:pPr>
+      <w:r>
+        <w:rPr>
+          <w:rFonts w:ascii="Times New Roman" w:hAnsi="Times New Roman" w:cs="Times New Roman"/>
+          <w:b w:val="0"/>
+          <w:i w:val="0"/>
+          <w:sz w:val="26"/>
+        </w:rPr>
+        <w:t>Sao chép mật khẩu tạm thời (có nút Copy) và cung cấp cho giáo viên.</w:t>
+      </w:r>
+    </w:p>
+    <w:p>
+      <w:pPr>
+        <w:pStyle w:val="ListNumber"/>
+        <w:spacing w:after="60"/>
+        <w:ind w:left="567"/>
+      </w:pPr>
+      <w:r>
+        <w:rPr>
+          <w:rFonts w:ascii="Times New Roman" w:hAnsi="Times New Roman" w:cs="Times New Roman"/>
+          <w:b w:val="0"/>
+          <w:i w:val="0"/>
+          <w:sz w:val="26"/>
+        </w:rPr>
+        <w:t>Khi giáo viên đăng nhập bằng mật khẩu tạm thời, hệ thống tự động chuyển đến trang Đổi mật khẩu bắt buộc.</w:t>
+      </w:r>
+    </w:p>
+    <w:p>
+      <w:pPr>
+        <w:spacing w:before="120" w:after="0"/>
+        <w:ind w:left="283" w:right="283"/>
+        <w:shd w:val="clear" w:color="auto" w:fill="FCE4D6"/>
+      </w:pPr>
+      <w:r>
+        <w:rPr>
+          <w:rFonts w:ascii="Times New Roman" w:hAnsi="Times New Roman" w:cs="Times New Roman"/>
+          <w:b/>
+          <w:i w:val="0"/>
+          <w:color w:val="C05000"/>
+          <w:sz w:val="24"/>
+        </w:rPr>
+        <w:t xml:space="preserve">  Quan trọng</w:t>
+      </w:r>
+    </w:p>
+    <w:p>
+      <w:pPr>
+        <w:spacing w:before="0" w:after="120"/>
+        <w:ind w:left="283" w:right="283"/>
+        <w:shd w:val="clear" w:color="auto" w:fill="FCE4D6"/>
+      </w:pPr>
+      <w:r>
+        <w:rPr>
+          <w:rFonts w:ascii="Times New Roman" w:hAnsi="Times New Roman" w:cs="Times New Roman"/>
+          <w:b w:val="0"/>
+          <w:i/>
+          <w:sz w:val="24"/>
+        </w:rPr>
+        <w:t xml:space="preserve">  Mật khẩu tạm thời CHỈ hiển thị một lần duy nhất trong modal ngay sau khi tạo. Hệ thống không lưu lại mật khẩu này ở dạng văn bản thuần, nên hãy sao chép ngay trước khi đóng modal.</w:t>
+      </w:r>
+    </w:p>
+    <w:p>
+      <w:pPr>
+        <w:pStyle w:val="Heading3"/>
+      </w:pPr>
+      <w:r>
+        <w:rPr>
+          <w:rFonts w:ascii="Times New Roman" w:hAnsi="Times New Roman" w:cs="Times New Roman"/>
+          <w:b/>
+          <w:color w:val="1F7489"/>
+          <w:sz w:val="26"/>
+        </w:rPr>
+        <w:t>3.2.6. Nhập danh sách giáo viên từ Excel</w:t>
+      </w:r>
+    </w:p>
+    <w:p>
+      <w:pPr>
+        <w:pStyle w:val="ListNumber"/>
+        <w:spacing w:after="60"/>
+        <w:ind w:left="567"/>
+      </w:pPr>
+      <w:r>
+        <w:rPr>
+          <w:rFonts w:ascii="Times New Roman" w:hAnsi="Times New Roman" w:cs="Times New Roman"/>
+          <w:b w:val="0"/>
+          <w:i w:val="0"/>
+          <w:sz w:val="26"/>
+        </w:rPr>
+        <w:t>Nhấn nút Nhập Excel (biểu tượng file) ở phía trên bảng.</w:t>
+      </w:r>
+    </w:p>
+    <w:p>
+      <w:pPr>
+        <w:pStyle w:val="ListNumber"/>
+        <w:spacing w:after="60"/>
+        <w:ind w:left="567"/>
+      </w:pPr>
+      <w:r>
+        <w:rPr>
+          <w:rFonts w:ascii="Times New Roman" w:hAnsi="Times New Roman" w:cs="Times New Roman"/>
+          <w:b w:val="0"/>
+          <w:i w:val="0"/>
+          <w:sz w:val="26"/>
+        </w:rPr>
+        <w:t>Tải về file mẫu Excel để biết định dạng cột cần nhập.</w:t>
+      </w:r>
+    </w:p>
+    <w:p>
+      <w:pPr>
+        <w:pStyle w:val="ListNumber"/>
+        <w:spacing w:after="60"/>
+        <w:ind w:left="567"/>
+      </w:pPr>
+      <w:r>
+        <w:rPr>
+          <w:rFonts w:ascii="Times New Roman" w:hAnsi="Times New Roman" w:cs="Times New Roman"/>
+          <w:b w:val="0"/>
+          <w:i w:val="0"/>
+          <w:sz w:val="26"/>
+        </w:rPr>
+        <w:t>Điền dữ liệu vào file mẫu theo đúng cột: Mã GV, Họ tên, Môn dạy, Email, Mật khẩu.</w:t>
+      </w:r>
+    </w:p>
+    <w:p>
+      <w:pPr>
+        <w:pStyle w:val="ListNumber"/>
+        <w:spacing w:after="60"/>
+        <w:ind w:left="567"/>
+      </w:pPr>
+      <w:r>
+        <w:rPr>
+          <w:rFonts w:ascii="Times New Roman" w:hAnsi="Times New Roman" w:cs="Times New Roman"/>
+          <w:b w:val="0"/>
+          <w:i w:val="0"/>
+          <w:sz w:val="26"/>
+        </w:rPr>
+        <w:t>Upload file Excel đã điền lên hệ thống.</w:t>
+      </w:r>
+    </w:p>
+    <w:p>
+      <w:pPr>
+        <w:pStyle w:val="ListNumber"/>
+        <w:spacing w:after="60"/>
+        <w:ind w:left="567"/>
+      </w:pPr>
+      <w:r>
+        <w:rPr>
+          <w:rFonts w:ascii="Times New Roman" w:hAnsi="Times New Roman" w:cs="Times New Roman"/>
+          <w:b w:val="0"/>
+          <w:i w:val="0"/>
+          <w:sz w:val="26"/>
+        </w:rPr>
+        <w:t>Hệ thống xử lý và báo cáo số bản ghi thành công / lỗi.</w:t>
+      </w:r>
+    </w:p>
+    <w:p>
+      <w:pPr>
+        <w:spacing w:after="80"/>
+      </w:pPr>
+      <w:r>
+        <w:rPr>
+          <w:rFonts w:ascii="Times New Roman" w:hAnsi="Times New Roman" w:cs="Times New Roman"/>
+          <w:b w:val="0"/>
+          <w:i/>
+          <w:color w:val="707070"/>
+          <w:sz w:val="26"/>
+        </w:rPr>
+        <w:t>[Hình ảnh: Modal nhập Excel với bảng kết quả import]</w:t>
+      </w:r>
+    </w:p>
+    <w:p>
+      <w:pPr>
+        <w:pStyle w:val="Heading2"/>
+      </w:pPr>
+      <w:r>
+        <w:rPr>
+          <w:rFonts w:ascii="Times New Roman" w:hAnsi="Times New Roman" w:cs="Times New Roman"/>
+          <w:b/>
+          <w:color w:val="2E74B5"/>
+          <w:sz w:val="28"/>
+        </w:rPr>
+        <w:t>3.3. Quản lý Học sinh</w:t>
+      </w:r>
+    </w:p>
+    <w:p>
+      <w:pPr>
+        <w:spacing w:after="80"/>
+      </w:pPr>
+      <w:r>
+        <w:rPr>
+          <w:rFonts w:ascii="Times New Roman" w:hAnsi="Times New Roman" w:cs="Times New Roman"/>
+          <w:b w:val="0"/>
+          <w:i w:val="0"/>
+          <w:sz w:val="26"/>
+        </w:rPr>
+        <w:t>Trang Quản lý Học sinh cung cấp đầy đủ công cụ để quản lý tài khoản học sinh, bao gồm thêm/sửa/xoá và reset mật khẩu. Truy cập từ menu Admin → Quản lý Học sinh.</w:t>
+      </w:r>
+    </w:p>
+    <w:p>
+      <w:pPr>
+        <w:pStyle w:val="Heading3"/>
+      </w:pPr>
+      <w:r>
+        <w:rPr>
+          <w:rFonts w:ascii="Times New Roman" w:hAnsi="Times New Roman" w:cs="Times New Roman"/>
+          <w:b/>
+          <w:color w:val="1F7489"/>
+          <w:sz w:val="26"/>
+        </w:rPr>
+        <w:t>3.3.1. Xem danh sách học sinh</w:t>
+      </w:r>
+    </w:p>
+    <w:tbl>
+      <w:tblPr>
+        <w:tblStyle w:val="TableGrid"/>
+        <w:tblW w:type="auto" w:w="0"/>
+        <w:jc w:val="center"/>
+        <w:tblLook w:firstColumn="1" w:firstRow="1" w:lastColumn="0" w:lastRow="0" w:noHBand="0" w:noVBand="1" w:val="04A0"/>
+      </w:tblPr>
+      <w:tblGrid>
+        <w:gridCol w:w="4702"/>
+        <w:gridCol w:w="4702"/>
+      </w:tblGrid>
+      <w:tr>
+        <w:tc>
+          <w:tcPr>
+            <w:tcW w:type="dxa" w:w="567"/>
+            <w:shd w:val="clear" w:color="auto" w:fill="2E74B5"/>
+          </w:tcPr>
+          <w:p>
+            <w:pPr>
+              <w:jc w:val="center"/>
+            </w:pPr>
+            <w:r>
+              <w:rPr>
+                <w:rFonts w:ascii="Times New Roman" w:hAnsi="Times New Roman" w:cs="Times New Roman"/>
+                <w:b/>
+                <w:i w:val="0"/>
+                <w:color w:val="FFFFFF"/>
+                <w:sz w:val="24"/>
+              </w:rPr>
+              <w:t>Cột</w:t>
+            </w:r>
+          </w:p>
+        </w:tc>
+        <w:tc>
+          <w:tcPr>
+            <w:tcW w:type="dxa" w:w="1701"/>
+            <w:shd w:val="clear" w:color="auto" w:fill="2E74B5"/>
+          </w:tcPr>
+          <w:p>
+            <w:pPr>
+              <w:jc w:val="center"/>
+            </w:pPr>
+            <w:r>
+              <w:rPr>
+                <w:rFonts w:ascii="Times New Roman" w:hAnsi="Times New Roman" w:cs="Times New Roman"/>
+                <w:b/>
+                <w:i w:val="0"/>
+                <w:color w:val="FFFFFF"/>
+                <w:sz w:val="24"/>
+              </w:rPr>
+              <w:t>Mô tả</w:t>
+            </w:r>
+          </w:p>
+        </w:tc>
+      </w:tr>
+      <w:tr>
+        <w:tc>
+          <w:tcPr>
+            <w:tcW w:type="dxa" w:w="567"/>
+          </w:tcPr>
+          <w:p>
+            <w:pPr>
+              <w:jc w:val="left"/>
+            </w:pPr>
+            <w:r>
+              <w:rPr>
+                <w:rFonts w:ascii="Times New Roman" w:hAnsi="Times New Roman" w:cs="Times New Roman"/>
+                <w:b w:val="0"/>
+                <w:i w:val="0"/>
+                <w:sz w:val="24"/>
+              </w:rPr>
+              <w:t>STT</w:t>
+            </w:r>
+          </w:p>
+        </w:tc>
+        <w:tc>
+          <w:tcPr>
+            <w:tcW w:type="dxa" w:w="1701"/>
+          </w:tcPr>
+          <w:p>
+            <w:pPr>
+              <w:jc w:val="left"/>
+            </w:pPr>
+            <w:r>
+              <w:rPr>
+                <w:rFonts w:ascii="Times New Roman" w:hAnsi="Times New Roman" w:cs="Times New Roman"/>
+                <w:b w:val="0"/>
+                <w:i w:val="0"/>
+                <w:sz w:val="24"/>
+              </w:rPr>
+              <w:t>Số thứ tự</w:t>
+            </w:r>
+          </w:p>
+        </w:tc>
+      </w:tr>
+      <w:tr>
+        <w:tc>
+          <w:tcPr>
+            <w:tcW w:type="dxa" w:w="567"/>
+            <w:shd w:val="clear" w:color="auto" w:fill="DEEAF1"/>
+          </w:tcPr>
+          <w:p>
+            <w:pPr>
+              <w:jc w:val="left"/>
+            </w:pPr>
+            <w:r>
+              <w:rPr>
+                <w:rFonts w:ascii="Times New Roman" w:hAnsi="Times New Roman" w:cs="Times New Roman"/>
+                <w:b w:val="0"/>
+                <w:i w:val="0"/>
+                <w:sz w:val="24"/>
+              </w:rPr>
+              <w:t>CCCD</w:t>
+            </w:r>
+          </w:p>
+        </w:tc>
+        <w:tc>
+          <w:tcPr>
+            <w:tcW w:type="dxa" w:w="1701"/>
+            <w:shd w:val="clear" w:color="auto" w:fill="DEEAF1"/>
+          </w:tcPr>
+          <w:p>
+            <w:pPr>
+              <w:jc w:val="left"/>
+            </w:pPr>
+            <w:r>
+              <w:rPr>
+                <w:rFonts w:ascii="Times New Roman" w:hAnsi="Times New Roman" w:cs="Times New Roman"/>
+                <w:b w:val="0"/>
+                <w:i w:val="0"/>
+                <w:sz w:val="24"/>
+              </w:rPr>
+              <w:t>Số CCCD, dùng để đăng nhập</w:t>
+            </w:r>
+          </w:p>
+        </w:tc>
+      </w:tr>
+      <w:tr>
+        <w:tc>
+          <w:tcPr>
+            <w:tcW w:type="dxa" w:w="567"/>
+          </w:tcPr>
+          <w:p>
+            <w:pPr>
+              <w:jc w:val="left"/>
+            </w:pPr>
+            <w:r>
+              <w:rPr>
+                <w:rFonts w:ascii="Times New Roman" w:hAnsi="Times New Roman" w:cs="Times New Roman"/>
+                <w:b w:val="0"/>
+                <w:i w:val="0"/>
+                <w:sz w:val="24"/>
+              </w:rPr>
+              <w:t>Họ và tên</w:t>
+            </w:r>
+          </w:p>
+        </w:tc>
+        <w:tc>
+          <w:tcPr>
+            <w:tcW w:type="dxa" w:w="1701"/>
+          </w:tcPr>
+          <w:p>
+            <w:pPr>
+              <w:jc w:val="left"/>
+            </w:pPr>
+            <w:r>
+              <w:rPr>
+                <w:rFonts w:ascii="Times New Roman" w:hAnsi="Times New Roman" w:cs="Times New Roman"/>
+                <w:b w:val="0"/>
+                <w:i w:val="0"/>
+                <w:sz w:val="24"/>
+              </w:rPr>
+              <w:t>Tên đầy đủ học sinh</w:t>
+            </w:r>
+          </w:p>
+        </w:tc>
+      </w:tr>
+      <w:tr>
+        <w:tc>
+          <w:tcPr>
+            <w:tcW w:type="dxa" w:w="567"/>
+            <w:shd w:val="clear" w:color="auto" w:fill="DEEAF1"/>
+          </w:tcPr>
+          <w:p>
+            <w:pPr>
+              <w:jc w:val="left"/>
+            </w:pPr>
+            <w:r>
+              <w:rPr>
+                <w:rFonts w:ascii="Times New Roman" w:hAnsi="Times New Roman" w:cs="Times New Roman"/>
+                <w:b w:val="0"/>
+                <w:i w:val="0"/>
+                <w:sz w:val="24"/>
+              </w:rPr>
+              <w:t>Khối</w:t>
+            </w:r>
+          </w:p>
+        </w:tc>
+        <w:tc>
+          <w:tcPr>
+            <w:tcW w:type="dxa" w:w="1701"/>
+            <w:shd w:val="clear" w:color="auto" w:fill="DEEAF1"/>
+          </w:tcPr>
+          <w:p>
+            <w:pPr>
+              <w:jc w:val="left"/>
+            </w:pPr>
+            <w:r>
+              <w:rPr>
+                <w:rFonts w:ascii="Times New Roman" w:hAnsi="Times New Roman" w:cs="Times New Roman"/>
+                <w:b w:val="0"/>
+                <w:i w:val="0"/>
+                <w:sz w:val="24"/>
+              </w:rPr>
+              <w:t>Khối lớp học sinh đang học (10, 11 hoặc 12)</w:t>
+            </w:r>
+          </w:p>
+        </w:tc>
+      </w:tr>
+      <w:tr>
+        <w:tc>
+          <w:tcPr>
+            <w:tcW w:type="dxa" w:w="567"/>
+          </w:tcPr>
+          <w:p>
+            <w:pPr>
+              <w:jc w:val="left"/>
+            </w:pPr>
+            <w:r>
+              <w:rPr>
+                <w:rFonts w:ascii="Times New Roman" w:hAnsi="Times New Roman" w:cs="Times New Roman"/>
+                <w:b w:val="0"/>
+                <w:i w:val="0"/>
+                <w:sz w:val="24"/>
+              </w:rPr>
+              <w:t>Lớp</w:t>
+            </w:r>
+          </w:p>
+        </w:tc>
+        <w:tc>
+          <w:tcPr>
+            <w:tcW w:type="dxa" w:w="1701"/>
+          </w:tcPr>
+          <w:p>
+            <w:pPr>
+              <w:jc w:val="left"/>
+            </w:pPr>
+            <w:r>
+              <w:rPr>
+                <w:rFonts w:ascii="Times New Roman" w:hAnsi="Times New Roman" w:cs="Times New Roman"/>
+                <w:b w:val="0"/>
+                <w:i w:val="0"/>
+                <w:sz w:val="24"/>
+              </w:rPr>
+              <w:t>Tên lớp học (ví dụ: 10A1, 11B2...)</w:t>
+            </w:r>
+          </w:p>
+        </w:tc>
+      </w:tr>
+      <w:tr>
+        <w:tc>
+          <w:tcPr>
+            <w:tcW w:type="dxa" w:w="567"/>
+            <w:shd w:val="clear" w:color="auto" w:fill="DEEAF1"/>
+          </w:tcPr>
+          <w:p>
+            <w:pPr>
+              <w:jc w:val="left"/>
+            </w:pPr>
+            <w:r>
+              <w:rPr>
+                <w:rFonts w:ascii="Times New Roman" w:hAnsi="Times New Roman" w:cs="Times New Roman"/>
+                <w:b w:val="0"/>
+                <w:i w:val="0"/>
+                <w:sz w:val="24"/>
+              </w:rPr>
+              <w:t>Email</w:t>
+            </w:r>
+          </w:p>
+        </w:tc>
+        <w:tc>
+          <w:tcPr>
+            <w:tcW w:type="dxa" w:w="1701"/>
+            <w:shd w:val="clear" w:color="auto" w:fill="DEEAF1"/>
+          </w:tcPr>
+          <w:p>
+            <w:pPr>
+              <w:jc w:val="left"/>
+            </w:pPr>
+            <w:r>
+              <w:rPr>
+                <w:rFonts w:ascii="Times New Roman" w:hAnsi="Times New Roman" w:cs="Times New Roman"/>
+                <w:b w:val="0"/>
+                <w:i w:val="0"/>
+                <w:sz w:val="24"/>
+              </w:rPr>
+              <w:t>Địa chỉ email học sinh (nếu có)</w:t>
+            </w:r>
+          </w:p>
+        </w:tc>
+      </w:tr>
+      <w:tr>
+        <w:tc>
+          <w:tcPr>
+            <w:tcW w:type="dxa" w:w="567"/>
+          </w:tcPr>
+          <w:p>
+            <w:pPr>
+              <w:jc w:val="left"/>
+            </w:pPr>
+            <w:r>
+              <w:rPr>
+                <w:rFonts w:ascii="Times New Roman" w:hAnsi="Times New Roman" w:cs="Times New Roman"/>
+                <w:b w:val="0"/>
+                <w:i w:val="0"/>
+                <w:sz w:val="24"/>
+              </w:rPr>
+              <w:t>Trạng thái TK</w:t>
+            </w:r>
+          </w:p>
+        </w:tc>
+        <w:tc>
+          <w:tcPr>
+            <w:tcW w:type="dxa" w:w="1701"/>
+          </w:tcPr>
+          <w:p>
+            <w:pPr>
+              <w:jc w:val="left"/>
+            </w:pPr>
+            <w:r>
+              <w:rPr>
+                <w:rFonts w:ascii="Times New Roman" w:hAnsi="Times New Roman" w:cs="Times New Roman"/>
+                <w:b w:val="0"/>
+                <w:i w:val="0"/>
+                <w:sz w:val="24"/>
+              </w:rPr>
+              <w:t>Đã kích hoạt / Chưa kích hoạt (màu xanh / xám)</w:t>
+            </w:r>
+          </w:p>
+        </w:tc>
+      </w:tr>
+      <w:tr>
+        <w:tc>
+          <w:tcPr>
+            <w:tcW w:type="dxa" w:w="567"/>
+            <w:shd w:val="clear" w:color="auto" w:fill="DEEAF1"/>
+          </w:tcPr>
+          <w:p>
+            <w:pPr>
+              <w:jc w:val="left"/>
+            </w:pPr>
+            <w:r>
+              <w:rPr>
+                <w:rFonts w:ascii="Times New Roman" w:hAnsi="Times New Roman" w:cs="Times New Roman"/>
+                <w:b w:val="0"/>
+                <w:i w:val="0"/>
+                <w:sz w:val="24"/>
+              </w:rPr>
+              <w:t>Thao tác</w:t>
+            </w:r>
+          </w:p>
+        </w:tc>
+        <w:tc>
+          <w:tcPr>
+            <w:tcW w:type="dxa" w:w="1701"/>
+            <w:shd w:val="clear" w:color="auto" w:fill="DEEAF1"/>
+          </w:tcPr>
+          <w:p>
+            <w:pPr>
+              <w:jc w:val="left"/>
+            </w:pPr>
+            <w:r>
+              <w:rPr>
+                <w:rFonts w:ascii="Times New Roman" w:hAnsi="Times New Roman" w:cs="Times New Roman"/>
+                <w:b w:val="0"/>
+                <w:i w:val="0"/>
+                <w:sz w:val="24"/>
+              </w:rPr>
+              <w:t>Nút icon Sửa, Xoá, Khôi phục MK (chỉ hiện khi tài khoản đã kích hoạt)</w:t>
+            </w:r>
+          </w:p>
+        </w:tc>
+      </w:tr>
+    </w:tbl>
+    <w:p/>
+    <w:p>
+      <w:pPr>
+        <w:spacing w:after="80"/>
+      </w:pPr>
+      <w:r>
+        <w:rPr>
+          <w:rFonts w:ascii="Times New Roman" w:hAnsi="Times New Roman" w:cs="Times New Roman"/>
+          <w:b w:val="0"/>
+          <w:i w:val="0"/>
+          <w:sz w:val="26"/>
+        </w:rPr>
+        <w:t>Ô tìm kiếm phía trên bảng cho phép lọc học sinh theo Họ tên hoặc CCCD ngay lập tức.</w:t>
+      </w:r>
+    </w:p>
     <w:p>
       <w:pPr>
         <w:pStyle w:val="Heading3"/>
@@ -6187,7 +6487,7 @@
           <w:color w:val="1F7489"/>
           <w:sz w:val="26"/>
         </w:rPr>
-        <w:t>3.3.3. Reset mật khẩu học sinh</w:t>
+        <w:t>3.3.3. Khôi phục mật khẩu học sinh</w:t>
       </w:r>
     </w:p>
     <w:p>
@@ -6201,7 +6501,7 @@
           <w:i w:val="0"/>
           <w:sz w:val="26"/>
         </w:rPr>
-        <w:t>Khi học sinh quên mật khẩu, quản trị viên reset mật khẩu về mặc định (MSSV):</w:t>
+        <w:t>Khi học sinh quên mật khẩu, quản trị viên tạo mật khẩu tạm thời ngẫu nhiên:</w:t>
       </w:r>
     </w:p>
     <w:p>
@@ -6217,7 +6517,7 @@
           <w:i w:val="0"/>
           <w:sz w:val="26"/>
         </w:rPr>
-        <w:t>Tìm học sinh trong danh sách.</w:t>
+        <w:t>Tìm học sinh đã kích hoạt trong danh sách.</w:t>
       </w:r>
     </w:p>
     <w:p>
@@ -6233,7 +6533,7 @@
           <w:i w:val="0"/>
           <w:sz w:val="26"/>
         </w:rPr>
-        <w:t>Nhấn nút Reset MK (biểu tượng chìa khoá, màu cam) ở cột Thao tác.</w:t>
+        <w:t>Nhấn nút Khôi phục MK (biểu tượng chìa khoá, màu cam) ở cột Thao tác.</w:t>
       </w:r>
     </w:p>
     <w:p>
@@ -6249,7 +6549,7 @@
           <w:i w:val="0"/>
           <w:sz w:val="26"/>
         </w:rPr>
-        <w:t>Xác nhận trong hộp thoại hiện ra.</w:t>
+        <w:t>Hộp thoại xác nhận xuất hiện. Nhấn Xác nhận.</w:t>
       </w:r>
     </w:p>
     <w:p>
@@ -6265,7 +6565,72 @@
           <w:i w:val="0"/>
           <w:sz w:val="26"/>
         </w:rPr>
-        <w:t>Mật khẩu được đặt lại về MSSV. Học sinh phải đổi mật khẩu khi đăng nhập lần tiếp theo.</w:t>
+        <w:t>Hệ thống sinh mật khẩu tạm thời ngẫu nhiên 12 ký tự và hiển thị trong modal màu vàng.</w:t>
+      </w:r>
+    </w:p>
+    <w:p>
+      <w:pPr>
+        <w:pStyle w:val="ListNumber"/>
+        <w:spacing w:after="60"/>
+        <w:ind w:left="567"/>
+      </w:pPr>
+      <w:r>
+        <w:rPr>
+          <w:rFonts w:ascii="Times New Roman" w:hAnsi="Times New Roman" w:cs="Times New Roman"/>
+          <w:b w:val="0"/>
+          <w:i w:val="0"/>
+          <w:sz w:val="26"/>
+        </w:rPr>
+        <w:t>Sao chép mật khẩu tạm thời (có nút Copy) và cung cấp cho học sinh.</w:t>
+      </w:r>
+    </w:p>
+    <w:p>
+      <w:pPr>
+        <w:pStyle w:val="ListNumber"/>
+        <w:spacing w:after="60"/>
+        <w:ind w:left="567"/>
+      </w:pPr>
+      <w:r>
+        <w:rPr>
+          <w:rFonts w:ascii="Times New Roman" w:hAnsi="Times New Roman" w:cs="Times New Roman"/>
+          <w:b w:val="0"/>
+          <w:i w:val="0"/>
+          <w:sz w:val="26"/>
+        </w:rPr>
+        <w:t>Học sinh đăng nhập bằng mật khẩu tạm thời → hệ thống tự chuyển đến trang Đổi mật khẩu bắt buộc.</w:t>
+      </w:r>
+    </w:p>
+    <w:p>
+      <w:pPr>
+        <w:spacing w:before="120" w:after="0"/>
+        <w:ind w:left="283" w:right="283"/>
+        <w:shd w:val="clear" w:color="auto" w:fill="FCE4D6"/>
+      </w:pPr>
+      <w:r>
+        <w:rPr>
+          <w:rFonts w:ascii="Times New Roman" w:hAnsi="Times New Roman" w:cs="Times New Roman"/>
+          <w:b/>
+          <w:i w:val="0"/>
+          <w:color w:val="C05000"/>
+          <w:sz w:val="24"/>
+        </w:rPr>
+        <w:t xml:space="preserve">  Quan trọng</w:t>
+      </w:r>
+    </w:p>
+    <w:p>
+      <w:pPr>
+        <w:spacing w:before="0" w:after="120"/>
+        <w:ind w:left="283" w:right="283"/>
+        <w:shd w:val="clear" w:color="auto" w:fill="FCE4D6"/>
+      </w:pPr>
+      <w:r>
+        <w:rPr>
+          <w:rFonts w:ascii="Times New Roman" w:hAnsi="Times New Roman" w:cs="Times New Roman"/>
+          <w:b w:val="0"/>
+          <w:i/>
+          <w:sz w:val="24"/>
+        </w:rPr>
+        <w:t xml:space="preserve">  Mật khẩu tạm thời chỉ hiển thị một lần. Hãy sao chép ngay trước khi đóng modal.</w:t>
       </w:r>
     </w:p>
     <w:p>
@@ -7383,7 +7748,7 @@
           <w:i w:val="0"/>
           <w:sz w:val="26"/>
         </w:rPr>
-        <w:t>Trang hiển thị các lớp đã mở (accordion theo giáo viên). Mở rộng từng lớp để xem:</w:t>
+        <w:t>Trang hiển thị các lớp đã publish dưới dạng bảng. Mỗi dòng hiển thị thông tin:</w:t>
       </w:r>
     </w:p>
     <w:tbl>
@@ -7400,7 +7765,7 @@
       <w:tr>
         <w:tc>
           <w:tcPr>
-            <w:tcW w:type="dxa" w:w="2268"/>
+            <w:tcW w:type="dxa" w:w="850"/>
             <w:shd w:val="clear" w:color="auto" w:fill="2E74B5"/>
           </w:tcPr>
           <w:p>
@@ -7421,7 +7786,7 @@
         </w:tc>
         <w:tc>
           <w:tcPr>
-            <w:tcW w:type="dxa" w:w="7087"/>
+            <w:tcW w:type="dxa" w:w="1984"/>
             <w:shd w:val="clear" w:color="auto" w:fill="2E74B5"/>
           </w:tcPr>
           <w:p>
@@ -7444,7 +7809,7 @@
       <w:tr>
         <w:tc>
           <w:tcPr>
-            <w:tcW w:type="dxa" w:w="2268"/>
+            <w:tcW w:type="dxa" w:w="850"/>
           </w:tcPr>
           <w:p>
             <w:pPr>
@@ -7457,13 +7822,13 @@
                 <w:i w:val="0"/>
                 <w:sz w:val="24"/>
               </w:rPr>
-              <w:t>Tên lớp / Môn</w:t>
+              <w:t>#ID</w:t>
             </w:r>
           </w:p>
         </w:tc>
         <w:tc>
           <w:tcPr>
-            <w:tcW w:type="dxa" w:w="7087"/>
+            <w:tcW w:type="dxa" w:w="1984"/>
           </w:tcPr>
           <w:p>
             <w:pPr>
@@ -7476,7 +7841,7 @@
                 <w:i w:val="0"/>
                 <w:sz w:val="24"/>
               </w:rPr>
-              <w:t>Tên môn học và giáo viên phụ trách</w:t>
+              <w:t>Mã số lớp trong hệ thống</w:t>
             </w:r>
           </w:p>
         </w:tc>
@@ -7484,7 +7849,7 @@
       <w:tr>
         <w:tc>
           <w:tcPr>
-            <w:tcW w:type="dxa" w:w="2268"/>
+            <w:tcW w:type="dxa" w:w="850"/>
             <w:shd w:val="clear" w:color="auto" w:fill="DEEAF1"/>
           </w:tcPr>
           <w:p>
@@ -7498,13 +7863,13 @@
                 <w:i w:val="0"/>
                 <w:sz w:val="24"/>
               </w:rPr>
-              <w:t>Lịch học</w:t>
+              <w:t>Giáo viên</w:t>
             </w:r>
           </w:p>
         </w:tc>
         <w:tc>
           <w:tcPr>
-            <w:tcW w:type="dxa" w:w="7087"/>
+            <w:tcW w:type="dxa" w:w="1984"/>
             <w:shd w:val="clear" w:color="auto" w:fill="DEEAF1"/>
           </w:tcPr>
           <w:p>
@@ -7518,7 +7883,7 @@
                 <w:i w:val="0"/>
                 <w:sz w:val="24"/>
               </w:rPr>
-              <w:t>Thứ, buổi, tiết cụ thể</w:t>
+              <w:t>Họ tên giáo viên phụ trách</w:t>
             </w:r>
           </w:p>
         </w:tc>
@@ -7526,7 +7891,7 @@
       <w:tr>
         <w:tc>
           <w:tcPr>
-            <w:tcW w:type="dxa" w:w="2268"/>
+            <w:tcW w:type="dxa" w:w="850"/>
           </w:tcPr>
           <w:p>
             <w:pPr>
@@ -7539,13 +7904,13 @@
                 <w:i w:val="0"/>
                 <w:sz w:val="24"/>
               </w:rPr>
-              <w:t>Phòng học</w:t>
+              <w:t>Môn / Nhóm</w:t>
             </w:r>
           </w:p>
         </w:tc>
         <w:tc>
           <w:tcPr>
-            <w:tcW w:type="dxa" w:w="7087"/>
+            <w:tcW w:type="dxa" w:w="1984"/>
           </w:tcPr>
           <w:p>
             <w:pPr>
@@ -7558,7 +7923,7 @@
                 <w:i w:val="0"/>
                 <w:sz w:val="24"/>
               </w:rPr>
-              <w:t>Phòng đã phân công</w:t>
+              <w:t>Tên môn học</w:t>
             </w:r>
           </w:p>
         </w:tc>
@@ -7566,7 +7931,7 @@
       <w:tr>
         <w:tc>
           <w:tcPr>
-            <w:tcW w:type="dxa" w:w="2268"/>
+            <w:tcW w:type="dxa" w:w="850"/>
             <w:shd w:val="clear" w:color="auto" w:fill="DEEAF1"/>
           </w:tcPr>
           <w:p>
@@ -7580,13 +7945,13 @@
                 <w:i w:val="0"/>
                 <w:sz w:val="24"/>
               </w:rPr>
-              <w:t>Số HS đã đăng ký / Sĩ số</w:t>
+              <w:t>Khối</w:t>
             </w:r>
           </w:p>
         </w:tc>
         <w:tc>
           <w:tcPr>
-            <w:tcW w:type="dxa" w:w="7087"/>
+            <w:tcW w:type="dxa" w:w="1984"/>
             <w:shd w:val="clear" w:color="auto" w:fill="DEEAF1"/>
           </w:tcPr>
           <w:p>
@@ -7600,7 +7965,7 @@
                 <w:i w:val="0"/>
                 <w:sz w:val="24"/>
               </w:rPr>
-              <w:t>VD: 18/30 (18 học sinh / tối đa 30)</w:t>
+              <w:t>Khối dành cho lớp (10/11/12)</w:t>
             </w:r>
           </w:p>
         </w:tc>
@@ -7608,7 +7973,7 @@
       <w:tr>
         <w:tc>
           <w:tcPr>
-            <w:tcW w:type="dxa" w:w="2268"/>
+            <w:tcW w:type="dxa" w:w="850"/>
           </w:tcPr>
           <w:p>
             <w:pPr>
@@ -7621,13 +7986,13 @@
                 <w:i w:val="0"/>
                 <w:sz w:val="24"/>
               </w:rPr>
-              <w:t>Danh sách HS</w:t>
+              <w:t>Thời gian</w:t>
             </w:r>
           </w:p>
         </w:tc>
         <w:tc>
           <w:tcPr>
-            <w:tcW w:type="dxa" w:w="7087"/>
+            <w:tcW w:type="dxa" w:w="1984"/>
           </w:tcPr>
           <w:p>
             <w:pPr>
@@ -7640,13 +8005,184 @@
                 <w:i w:val="0"/>
                 <w:sz w:val="24"/>
               </w:rPr>
-              <w:t>MSSV, Họ tên, Lớp của từng học sinh đã đăng ký</w:t>
+              <w:t>Định dạng: Thứ X - Sáng/Chiều - Tiết X–Y</w:t>
+            </w:r>
+          </w:p>
+        </w:tc>
+      </w:tr>
+      <w:tr>
+        <w:tc>
+          <w:tcPr>
+            <w:tcW w:type="dxa" w:w="850"/>
+            <w:shd w:val="clear" w:color="auto" w:fill="DEEAF1"/>
+          </w:tcPr>
+          <w:p>
+            <w:pPr>
+              <w:jc w:val="left"/>
+            </w:pPr>
+            <w:r>
+              <w:rPr>
+                <w:rFonts w:ascii="Times New Roman" w:hAnsi="Times New Roman" w:cs="Times New Roman"/>
+                <w:b w:val="0"/>
+                <w:i w:val="0"/>
+                <w:sz w:val="24"/>
+              </w:rPr>
+              <w:t>Địa điểm</w:t>
+            </w:r>
+          </w:p>
+        </w:tc>
+        <w:tc>
+          <w:tcPr>
+            <w:tcW w:type="dxa" w:w="1984"/>
+            <w:shd w:val="clear" w:color="auto" w:fill="DEEAF1"/>
+          </w:tcPr>
+          <w:p>
+            <w:pPr>
+              <w:jc w:val="left"/>
+            </w:pPr>
+            <w:r>
+              <w:rPr>
+                <w:rFonts w:ascii="Times New Roman" w:hAnsi="Times New Roman" w:cs="Times New Roman"/>
+                <w:b w:val="0"/>
+                <w:i w:val="0"/>
+                <w:sz w:val="24"/>
+              </w:rPr>
+              <w:t>Phòng học đã phân công</w:t>
+            </w:r>
+          </w:p>
+        </w:tc>
+      </w:tr>
+      <w:tr>
+        <w:tc>
+          <w:tcPr>
+            <w:tcW w:type="dxa" w:w="850"/>
+          </w:tcPr>
+          <w:p>
+            <w:pPr>
+              <w:jc w:val="left"/>
+            </w:pPr>
+            <w:r>
+              <w:rPr>
+                <w:rFonts w:ascii="Times New Roman" w:hAnsi="Times New Roman" w:cs="Times New Roman"/>
+                <w:b w:val="0"/>
+                <w:i w:val="0"/>
+                <w:sz w:val="24"/>
+              </w:rPr>
+              <w:t>Sĩ số</w:t>
+            </w:r>
+          </w:p>
+        </w:tc>
+        <w:tc>
+          <w:tcPr>
+            <w:tcW w:type="dxa" w:w="1984"/>
+          </w:tcPr>
+          <w:p>
+            <w:pPr>
+              <w:jc w:val="left"/>
+            </w:pPr>
+            <w:r>
+              <w:rPr>
+                <w:rFonts w:ascii="Times New Roman" w:hAnsi="Times New Roman" w:cs="Times New Roman"/>
+                <w:b w:val="0"/>
+                <w:i w:val="0"/>
+                <w:sz w:val="24"/>
+              </w:rPr>
+              <w:t>Số HS đã đăng ký / Sĩ số tối đa (VD: 18/30). Cập nhật tự động mỗi 5 giây</w:t>
+            </w:r>
+          </w:p>
+        </w:tc>
+      </w:tr>
+      <w:tr>
+        <w:tc>
+          <w:tcPr>
+            <w:tcW w:type="dxa" w:w="850"/>
+            <w:shd w:val="clear" w:color="auto" w:fill="DEEAF1"/>
+          </w:tcPr>
+          <w:p>
+            <w:pPr>
+              <w:jc w:val="left"/>
+            </w:pPr>
+            <w:r>
+              <w:rPr>
+                <w:rFonts w:ascii="Times New Roman" w:hAnsi="Times New Roman" w:cs="Times New Roman"/>
+                <w:b w:val="0"/>
+                <w:i w:val="0"/>
+                <w:sz w:val="24"/>
+              </w:rPr>
+              <w:t>Thao tác</w:t>
+            </w:r>
+          </w:p>
+        </w:tc>
+        <w:tc>
+          <w:tcPr>
+            <w:tcW w:type="dxa" w:w="1984"/>
+            <w:shd w:val="clear" w:color="auto" w:fill="DEEAF1"/>
+          </w:tcPr>
+          <w:p>
+            <w:pPr>
+              <w:jc w:val="left"/>
+            </w:pPr>
+            <w:r>
+              <w:rPr>
+                <w:rFonts w:ascii="Times New Roman" w:hAnsi="Times New Roman" w:cs="Times New Roman"/>
+                <w:b w:val="0"/>
+                <w:i w:val="0"/>
+                <w:sz w:val="24"/>
+              </w:rPr>
+              <w:t>Nút Xem HS – mở modal danh sách học sinh đã đăng ký</w:t>
             </w:r>
           </w:p>
         </w:tc>
       </w:tr>
     </w:tbl>
     <w:p/>
+    <w:p>
+      <w:pPr>
+        <w:spacing w:after="80"/>
+      </w:pPr>
+      <w:r>
+        <w:rPr>
+          <w:rFonts w:ascii="Times New Roman" w:hAnsi="Times New Roman" w:cs="Times New Roman"/>
+          <w:b w:val="0"/>
+          <w:i w:val="0"/>
+          <w:sz w:val="26"/>
+        </w:rPr>
+        <w:t>Khi nhấn Xem HS, modal hiển thị bảng gồm: STT, Họ tên, CCCD, Khối, Lớp của từng học sinh đã đăng ký vào lớp đó.</w:t>
+      </w:r>
+    </w:p>
+    <w:p>
+      <w:pPr>
+        <w:spacing w:before="120" w:after="0"/>
+        <w:ind w:left="283" w:right="283"/>
+        <w:shd w:val="clear" w:color="auto" w:fill="DEEAF1"/>
+      </w:pPr>
+      <w:r>
+        <w:rPr>
+          <w:rFonts w:ascii="Times New Roman" w:hAnsi="Times New Roman" w:cs="Times New Roman"/>
+          <w:b/>
+          <w:i w:val="0"/>
+          <w:color w:val="1F497D"/>
+          <w:sz w:val="24"/>
+        </w:rPr>
+        <w:t xml:space="preserve">  Điều kiện hiển thị lớp</w:t>
+      </w:r>
+    </w:p>
+    <w:p>
+      <w:pPr>
+        <w:spacing w:before="0" w:after="120"/>
+        <w:ind w:left="283" w:right="283"/>
+        <w:shd w:val="clear" w:color="auto" w:fill="DEEAF1"/>
+      </w:pPr>
+      <w:r>
+        <w:rPr>
+          <w:rFonts w:ascii="Times New Roman" w:hAnsi="Times New Roman" w:cs="Times New Roman"/>
+          <w:b w:val="0"/>
+          <w:i/>
+          <w:sz w:val="24"/>
+        </w:rPr>
+        <w:t xml:space="preserve">  Chỉ những lớp đã được điền đầy đủ Địa điểm và Sĩ số tối đa mới hiển thị ở trang này và trong trang đăng ký của học sinh. Lớp thiếu thông tin sẽ không được học sinh nhìn thấy.</w:t>
+      </w:r>
+    </w:p>
     <w:p>
       <w:pPr>
         <w:pStyle w:val="Heading3"/>
@@ -8253,7 +8789,242 @@
           <w:color w:val="2E74B5"/>
           <w:sz w:val="28"/>
         </w:rPr>
-        <w:t>4.2. Xem thời khoá biểu</w:t>
+        <w:t>4.2. Trạng thái giao diện theo giai đoạn</w:t>
+      </w:r>
+    </w:p>
+    <w:tbl>
+      <w:tblPr>
+        <w:tblStyle w:val="TableGrid"/>
+        <w:tblW w:type="auto" w:w="0"/>
+        <w:jc w:val="center"/>
+        <w:tblLook w:firstColumn="1" w:firstRow="1" w:lastColumn="0" w:lastRow="0" w:noHBand="0" w:noVBand="1" w:val="04A0"/>
+      </w:tblPr>
+      <w:tblGrid>
+        <w:gridCol w:w="4702"/>
+        <w:gridCol w:w="4702"/>
+      </w:tblGrid>
+      <w:tr>
+        <w:tc>
+          <w:tcPr>
+            <w:tcW w:type="dxa" w:w="2835"/>
+            <w:shd w:val="clear" w:color="auto" w:fill="2E74B5"/>
+          </w:tcPr>
+          <w:p>
+            <w:pPr>
+              <w:jc w:val="center"/>
+            </w:pPr>
+            <w:r>
+              <w:rPr>
+                <w:rFonts w:ascii="Times New Roman" w:hAnsi="Times New Roman" w:cs="Times New Roman"/>
+                <w:b/>
+                <w:i w:val="0"/>
+                <w:color w:val="FFFFFF"/>
+                <w:sz w:val="24"/>
+              </w:rPr>
+              <w:t>Trạng thái hệ thống</w:t>
+            </w:r>
+          </w:p>
+        </w:tc>
+        <w:tc>
+          <w:tcPr>
+            <w:tcW w:type="dxa" w:w="6520"/>
+            <w:shd w:val="clear" w:color="auto" w:fill="2E74B5"/>
+          </w:tcPr>
+          <w:p>
+            <w:pPr>
+              <w:jc w:val="center"/>
+            </w:pPr>
+            <w:r>
+              <w:rPr>
+                <w:rFonts w:ascii="Times New Roman" w:hAnsi="Times New Roman" w:cs="Times New Roman"/>
+                <w:b/>
+                <w:i w:val="0"/>
+                <w:color w:val="FFFFFF"/>
+                <w:sz w:val="24"/>
+              </w:rPr>
+              <w:t>Giáo viên thấy gì / làm được gì</w:t>
+            </w:r>
+          </w:p>
+        </w:tc>
+      </w:tr>
+      <w:tr>
+        <w:tc>
+          <w:tcPr>
+            <w:tcW w:type="dxa" w:w="2835"/>
+          </w:tcPr>
+          <w:p>
+            <w:pPr>
+              <w:jc w:val="left"/>
+            </w:pPr>
+            <w:r>
+              <w:rPr>
+                <w:rFonts w:ascii="Times New Roman" w:hAnsi="Times New Roman" w:cs="Times New Roman"/>
+                <w:b w:val="0"/>
+                <w:i w:val="0"/>
+                <w:sz w:val="24"/>
+              </w:rPr>
+              <w:t>Giai đoạn 1 đang MỞ</w:t>
+            </w:r>
+          </w:p>
+        </w:tc>
+        <w:tc>
+          <w:tcPr>
+            <w:tcW w:type="dxa" w:w="6520"/>
+          </w:tcPr>
+          <w:p>
+            <w:pPr>
+              <w:jc w:val="left"/>
+            </w:pPr>
+            <w:r>
+              <w:rPr>
+                <w:rFonts w:ascii="Times New Roman" w:hAnsi="Times New Roman" w:cs="Times New Roman"/>
+                <w:b w:val="0"/>
+                <w:i w:val="0"/>
+                <w:sz w:val="24"/>
+              </w:rPr>
+              <w:t>Ô lịch trống có thể click để đăng ký lớp. Ô đã có lớp hiện nút X để xoá.</w:t>
+            </w:r>
+          </w:p>
+        </w:tc>
+      </w:tr>
+      <w:tr>
+        <w:tc>
+          <w:tcPr>
+            <w:tcW w:type="dxa" w:w="2835"/>
+            <w:shd w:val="clear" w:color="auto" w:fill="DEEAF1"/>
+          </w:tcPr>
+          <w:p>
+            <w:pPr>
+              <w:jc w:val="left"/>
+            </w:pPr>
+            <w:r>
+              <w:rPr>
+                <w:rFonts w:ascii="Times New Roman" w:hAnsi="Times New Roman" w:cs="Times New Roman"/>
+                <w:b w:val="0"/>
+                <w:i w:val="0"/>
+                <w:sz w:val="24"/>
+              </w:rPr>
+              <w:t>Giai đoạn 1 đã ĐÓNG</w:t>
+            </w:r>
+          </w:p>
+        </w:tc>
+        <w:tc>
+          <w:tcPr>
+            <w:tcW w:type="dxa" w:w="6520"/>
+            <w:shd w:val="clear" w:color="auto" w:fill="DEEAF1"/>
+          </w:tcPr>
+          <w:p>
+            <w:pPr>
+              <w:jc w:val="left"/>
+            </w:pPr>
+            <w:r>
+              <w:rPr>
+                <w:rFonts w:ascii="Times New Roman" w:hAnsi="Times New Roman" w:cs="Times New Roman"/>
+                <w:b w:val="0"/>
+                <w:i w:val="0"/>
+                <w:sz w:val="24"/>
+              </w:rPr>
+              <w:t>Chỉ xem thời khoá biểu — không thể thêm hoặc xoá lớp.</w:t>
+            </w:r>
+          </w:p>
+        </w:tc>
+      </w:tr>
+      <w:tr>
+        <w:tc>
+          <w:tcPr>
+            <w:tcW w:type="dxa" w:w="2835"/>
+          </w:tcPr>
+          <w:p>
+            <w:pPr>
+              <w:jc w:val="left"/>
+            </w:pPr>
+            <w:r>
+              <w:rPr>
+                <w:rFonts w:ascii="Times New Roman" w:hAnsi="Times New Roman" w:cs="Times New Roman"/>
+                <w:b w:val="0"/>
+                <w:i w:val="0"/>
+                <w:sz w:val="24"/>
+              </w:rPr>
+              <w:t>Giai đoạn 2 đang MỞ</w:t>
+            </w:r>
+          </w:p>
+        </w:tc>
+        <w:tc>
+          <w:tcPr>
+            <w:tcW w:type="dxa" w:w="6520"/>
+          </w:tcPr>
+          <w:p>
+            <w:pPr>
+              <w:jc w:val="left"/>
+            </w:pPr>
+            <w:r>
+              <w:rPr>
+                <w:rFonts w:ascii="Times New Roman" w:hAnsi="Times New Roman" w:cs="Times New Roman"/>
+                <w:b w:val="0"/>
+                <w:i w:val="0"/>
+                <w:sz w:val="24"/>
+              </w:rPr>
+              <w:t>Xem thời khoá biểu; badge số HS/phòng cập nhật trực tiếp mỗi 5 giây.</w:t>
+            </w:r>
+          </w:p>
+        </w:tc>
+      </w:tr>
+      <w:tr>
+        <w:tc>
+          <w:tcPr>
+            <w:tcW w:type="dxa" w:w="2835"/>
+            <w:shd w:val="clear" w:color="auto" w:fill="DEEAF1"/>
+          </w:tcPr>
+          <w:p>
+            <w:pPr>
+              <w:jc w:val="left"/>
+            </w:pPr>
+            <w:r>
+              <w:rPr>
+                <w:rFonts w:ascii="Times New Roman" w:hAnsi="Times New Roman" w:cs="Times New Roman"/>
+                <w:b w:val="0"/>
+                <w:i w:val="0"/>
+                <w:sz w:val="24"/>
+              </w:rPr>
+              <w:t>Giai đoạn 2 đã ĐÓNG</w:t>
+            </w:r>
+          </w:p>
+        </w:tc>
+        <w:tc>
+          <w:tcPr>
+            <w:tcW w:type="dxa" w:w="6520"/>
+            <w:shd w:val="clear" w:color="auto" w:fill="DEEAF1"/>
+          </w:tcPr>
+          <w:p>
+            <w:pPr>
+              <w:jc w:val="left"/>
+            </w:pPr>
+            <w:r>
+              <w:rPr>
+                <w:rFonts w:ascii="Times New Roman" w:hAnsi="Times New Roman" w:cs="Times New Roman"/>
+                <w:b w:val="0"/>
+                <w:i w:val="0"/>
+                <w:sz w:val="24"/>
+              </w:rPr>
+              <w:t>Chỉ xem thời khoá biểu và số HS cuối cùng đăng ký.</w:t>
+            </w:r>
+          </w:p>
+        </w:tc>
+      </w:tr>
+    </w:tbl>
+    <w:p/>
+    <w:p>
+      <w:pPr>
+        <w:pStyle w:val="Heading2"/>
+      </w:pPr>
+      <w:r>
+        <w:rPr>
+          <w:rFonts w:ascii="Times New Roman" w:hAnsi="Times New Roman" w:cs="Times New Roman"/>
+          <w:b/>
+          <w:color w:val="2E74B5"/>
+          <w:sz w:val="28"/>
+        </w:rPr>
+        <w:t>4.4. Xem thời khoá biểu</w:t>
       </w:r>
     </w:p>
     <w:p>
@@ -8538,7 +9309,7 @@
           <w:color w:val="2E74B5"/>
           <w:sz w:val="28"/>
         </w:rPr>
-        <w:t>4.3. Đăng ký mở lớp</w:t>
+        <w:t>4.5. Đăng ký mở lớp</w:t>
       </w:r>
     </w:p>
     <w:p>
@@ -8761,7 +9532,7 @@
           <w:color w:val="2E74B5"/>
           <w:sz w:val="28"/>
         </w:rPr>
-        <w:t>4.4. Xoá lớp đã đăng ký</w:t>
+        <w:t>4.6. Xoá lớp đã đăng ký</w:t>
       </w:r>
     </w:p>
     <w:p>
@@ -8954,7 +9725,7 @@
           <w:color w:val="2E74B5"/>
           <w:sz w:val="28"/>
         </w:rPr>
-        <w:t>5.1. Đặt mật khẩu lần đầu</w:t>
+        <w:t>5.1. Đặt mật khẩu lần đầu / Đổi mật khẩu bắt buộc</w:t>
       </w:r>
     </w:p>
     <w:p>
@@ -8968,13 +9739,13 @@
           <w:i w:val="0"/>
           <w:sz w:val="26"/>
         </w:rPr>
-        <w:t>Học sinh lần đầu đăng nhập vào hệ thống bắt buộc phải đổi mật khẩu:</w:t>
-      </w:r>
-    </w:p>
-    <w:p>
-      <w:pPr>
-        <w:pStyle w:val="ListNumber"/>
-        <w:spacing w:after="60"/>
+        <w:t>Có hai trường hợp học sinh bị yêu cầu đổi mật khẩu bắt buộc:</w:t>
+      </w:r>
+    </w:p>
+    <w:p>
+      <w:pPr>
+        <w:pStyle w:val="ListBullet"/>
+        <w:spacing w:after="40"/>
         <w:ind w:left="567"/>
       </w:pPr>
       <w:r>
@@ -8984,13 +9755,13 @@
           <w:i w:val="0"/>
           <w:sz w:val="26"/>
         </w:rPr>
-        <w:t>Đăng nhập bằng MSSV và mật khẩu mặc định (thường là MSSV).</w:t>
-      </w:r>
-    </w:p>
-    <w:p>
-      <w:pPr>
-        <w:pStyle w:val="ListNumber"/>
-        <w:spacing w:after="60"/>
+        <w:t>Lần đầu đăng nhập (tài khoản mới được tạo).</w:t>
+      </w:r>
+    </w:p>
+    <w:p>
+      <w:pPr>
+        <w:pStyle w:val="ListBullet"/>
+        <w:spacing w:after="40"/>
         <w:ind w:left="567"/>
       </w:pPr>
       <w:r>
@@ -9000,14 +9771,12 @@
           <w:i w:val="0"/>
           <w:sz w:val="26"/>
         </w:rPr>
-        <w:t>Hệ thống tự động chuyển sang trang Đặt mật khẩu mới.</w:t>
-      </w:r>
-    </w:p>
-    <w:p>
-      <w:pPr>
-        <w:pStyle w:val="ListNumber"/>
-        <w:spacing w:after="60"/>
-        <w:ind w:left="567"/>
+        <w:t>Sau khi Quản trị viên đặt lại mật khẩu tạm thời.</w:t>
+      </w:r>
+    </w:p>
+    <w:p>
+      <w:pPr>
+        <w:spacing w:after="80"/>
       </w:pPr>
       <w:r>
         <w:rPr>
@@ -9016,7 +9785,7 @@
           <w:i w:val="0"/>
           <w:sz w:val="26"/>
         </w:rPr>
-        <w:t>Nhập mật khẩu mới tại ô Mật khẩu mới (tối thiểu 6 ký tự).</w:t>
+        <w:t>Trong cả hai trường hợp, sau khi xác thực thành công hệ thống tự chuyển đến trang Đổi mật khẩu bắt buộc:</w:t>
       </w:r>
     </w:p>
     <w:p>
@@ -9032,7 +9801,7 @@
           <w:i w:val="0"/>
           <w:sz w:val="26"/>
         </w:rPr>
-        <w:t>Nhập lại mật khẩu tại ô Xác nhận mật khẩu.</w:t>
+        <w:t>Đọc hộp thông tin màu xanh hiển thị yêu cầu mật khẩu.</w:t>
       </w:r>
     </w:p>
     <w:p>
@@ -9048,7 +9817,39 @@
           <w:i w:val="0"/>
           <w:sz w:val="26"/>
         </w:rPr>
-        <w:t>Nhấn Xác nhận để lưu mật khẩu mới.</w:t>
+        <w:t>Nhập mật khẩu mới tại ô Mật khẩu mới.</w:t>
+      </w:r>
+    </w:p>
+    <w:p>
+      <w:pPr>
+        <w:pStyle w:val="ListNumber"/>
+        <w:spacing w:after="60"/>
+        <w:ind w:left="567"/>
+      </w:pPr>
+      <w:r>
+        <w:rPr>
+          <w:rFonts w:ascii="Times New Roman" w:hAnsi="Times New Roman" w:cs="Times New Roman"/>
+          <w:b w:val="0"/>
+          <w:i w:val="0"/>
+          <w:sz w:val="26"/>
+        </w:rPr>
+        <w:t>Nhập lại mật khẩu tại ô Xác nhận mật khẩu (ô hiển thị ✓ Trùng khớp khi đúng).</w:t>
+      </w:r>
+    </w:p>
+    <w:p>
+      <w:pPr>
+        <w:pStyle w:val="ListNumber"/>
+        <w:spacing w:after="60"/>
+        <w:ind w:left="567"/>
+      </w:pPr>
+      <w:r>
+        <w:rPr>
+          <w:rFonts w:ascii="Times New Roman" w:hAnsi="Times New Roman" w:cs="Times New Roman"/>
+          <w:b w:val="0"/>
+          <w:i w:val="0"/>
+          <w:sz w:val="26"/>
+        </w:rPr>
+        <w:t>Nhấn Xác nhận đổi mật khẩu.</w:t>
       </w:r>
     </w:p>
     <w:p>
@@ -9065,6 +9866,39 @@
           <w:sz w:val="26"/>
         </w:rPr>
         <w:t>Hệ thống chuyển về trang chính của học sinh.</w:t>
+      </w:r>
+    </w:p>
+    <w:p>
+      <w:pPr>
+        <w:spacing w:before="120" w:after="0"/>
+        <w:ind w:left="283" w:right="283"/>
+        <w:shd w:val="clear" w:color="auto" w:fill="DEEAF1"/>
+      </w:pPr>
+      <w:r>
+        <w:rPr>
+          <w:rFonts w:ascii="Times New Roman" w:hAnsi="Times New Roman" w:cs="Times New Roman"/>
+          <w:b/>
+          <w:i w:val="0"/>
+          <w:color w:val="1F497D"/>
+          <w:sz w:val="24"/>
+        </w:rPr>
+        <w:t xml:space="preserve">  Yêu cầu mật khẩu</w:t>
+      </w:r>
+    </w:p>
+    <w:p>
+      <w:pPr>
+        <w:spacing w:before="0" w:after="120"/>
+        <w:ind w:left="283" w:right="283"/>
+        <w:shd w:val="clear" w:color="auto" w:fill="DEEAF1"/>
+      </w:pPr>
+      <w:r>
+        <w:rPr>
+          <w:rFonts w:ascii="Times New Roman" w:hAnsi="Times New Roman" w:cs="Times New Roman"/>
+          <w:b w:val="0"/>
+          <w:i/>
+          <w:sz w:val="24"/>
+        </w:rPr>
+        <w:t xml:space="preserve">  Yêu cầu mật khẩu: tối thiểu 8 ký tự; chỉ dùng chữ hoa (A–Z), chữ thường (a–z), chữ số (0–9) và ký tự đặc biệt !@#$%^&amp;*()-_+=[]{}|&lt;&gt;,.?/~; KHÔNG dùng dấu nháy đơn ('), nháy kép ("), chấm phẩy (;) hoặc gạch chéo (\).</w:t>
       </w:r>
     </w:p>
     <w:p>
@@ -9097,7 +9931,7 @@
           <w:i/>
           <w:sz w:val="24"/>
         </w:rPr>
-        <w:t xml:space="preserve">  Sau khi đặt mật khẩu mới, học sinh dùng mật khẩu mới này cho tất cả các lần đăng nhập tiếp theo. Nếu quên mật khẩu, liên hệ Quản trị viên để được reset.</w:t>
+        <w:t xml:space="preserve">  Sau khi đổi mật khẩu, dùng mật khẩu mới này cho tất cả lần đăng nhập tiếp theo. Nếu quên mật khẩu, liên hệ Quản trị viên để được cấp mật khẩu tạm thời mới.</w:t>
       </w:r>
     </w:p>
     <w:p>
@@ -9111,7 +9945,233 @@
           <w:color w:val="2E74B5"/>
           <w:sz w:val="28"/>
         </w:rPr>
-        <w:t>5.2. Tab Thời khoá biểu</w:t>
+        <w:t>5.2. Trạng thái giao diện theo giai đoạn</w:t>
+      </w:r>
+    </w:p>
+    <w:tbl>
+      <w:tblPr>
+        <w:tblStyle w:val="TableGrid"/>
+        <w:tblW w:type="auto" w:w="0"/>
+        <w:jc w:val="center"/>
+        <w:tblLook w:firstColumn="1" w:firstRow="1" w:lastColumn="0" w:lastRow="0" w:noHBand="0" w:noVBand="1" w:val="04A0"/>
+      </w:tblPr>
+      <w:tblGrid>
+        <w:gridCol w:w="4702"/>
+        <w:gridCol w:w="4702"/>
+      </w:tblGrid>
+      <w:tr>
+        <w:tc>
+          <w:tcPr>
+            <w:tcW w:type="dxa" w:w="2835"/>
+            <w:shd w:val="clear" w:color="auto" w:fill="2E74B5"/>
+          </w:tcPr>
+          <w:p>
+            <w:pPr>
+              <w:jc w:val="center"/>
+            </w:pPr>
+            <w:r>
+              <w:rPr>
+                <w:rFonts w:ascii="Times New Roman" w:hAnsi="Times New Roman" w:cs="Times New Roman"/>
+                <w:b/>
+                <w:i w:val="0"/>
+                <w:color w:val="FFFFFF"/>
+                <w:sz w:val="24"/>
+              </w:rPr>
+              <w:t>Trạng thái hệ thống</w:t>
+            </w:r>
+          </w:p>
+        </w:tc>
+        <w:tc>
+          <w:tcPr>
+            <w:tcW w:type="dxa" w:w="6520"/>
+            <w:shd w:val="clear" w:color="auto" w:fill="2E74B5"/>
+          </w:tcPr>
+          <w:p>
+            <w:pPr>
+              <w:jc w:val="center"/>
+            </w:pPr>
+            <w:r>
+              <w:rPr>
+                <w:rFonts w:ascii="Times New Roman" w:hAnsi="Times New Roman" w:cs="Times New Roman"/>
+                <w:b/>
+                <w:i w:val="0"/>
+                <w:color w:val="FFFFFF"/>
+                <w:sz w:val="24"/>
+              </w:rPr>
+              <w:t>Học sinh thấy gì / làm được gì</w:t>
+            </w:r>
+          </w:p>
+        </w:tc>
+      </w:tr>
+      <w:tr>
+        <w:tc>
+          <w:tcPr>
+            <w:tcW w:type="dxa" w:w="2835"/>
+          </w:tcPr>
+          <w:p>
+            <w:pPr>
+              <w:jc w:val="left"/>
+            </w:pPr>
+            <w:r>
+              <w:rPr>
+                <w:rFonts w:ascii="Times New Roman" w:hAnsi="Times New Roman" w:cs="Times New Roman"/>
+                <w:b w:val="0"/>
+                <w:i w:val="0"/>
+                <w:sz w:val="24"/>
+              </w:rPr>
+              <w:t>Giai đoạn 2 chưa mở</w:t>
+            </w:r>
+          </w:p>
+        </w:tc>
+        <w:tc>
+          <w:tcPr>
+            <w:tcW w:type="dxa" w:w="6520"/>
+          </w:tcPr>
+          <w:p>
+            <w:pPr>
+              <w:jc w:val="left"/>
+            </w:pPr>
+            <w:r>
+              <w:rPr>
+                <w:rFonts w:ascii="Times New Roman" w:hAnsi="Times New Roman" w:cs="Times New Roman"/>
+                <w:b w:val="0"/>
+                <w:i w:val="0"/>
+                <w:sz w:val="24"/>
+              </w:rPr>
+              <w:t>Chỉ xem Tab Thời khoá biểu. Nút Đăng ký bị ẩn hoặc vô hiệu hoá.</w:t>
+            </w:r>
+          </w:p>
+        </w:tc>
+      </w:tr>
+      <w:tr>
+        <w:tc>
+          <w:tcPr>
+            <w:tcW w:type="dxa" w:w="2835"/>
+            <w:shd w:val="clear" w:color="auto" w:fill="DEEAF1"/>
+          </w:tcPr>
+          <w:p>
+            <w:pPr>
+              <w:jc w:val="left"/>
+            </w:pPr>
+            <w:r>
+              <w:rPr>
+                <w:rFonts w:ascii="Times New Roman" w:hAnsi="Times New Roman" w:cs="Times New Roman"/>
+                <w:b w:val="0"/>
+                <w:i w:val="0"/>
+                <w:sz w:val="24"/>
+              </w:rPr>
+              <w:t>Giai đoạn 2 đang MỞ</w:t>
+            </w:r>
+          </w:p>
+        </w:tc>
+        <w:tc>
+          <w:tcPr>
+            <w:tcW w:type="dxa" w:w="6520"/>
+            <w:shd w:val="clear" w:color="auto" w:fill="DEEAF1"/>
+          </w:tcPr>
+          <w:p>
+            <w:pPr>
+              <w:jc w:val="left"/>
+            </w:pPr>
+            <w:r>
+              <w:rPr>
+                <w:rFonts w:ascii="Times New Roman" w:hAnsi="Times New Roman" w:cs="Times New Roman"/>
+                <w:b w:val="0"/>
+                <w:i w:val="0"/>
+                <w:sz w:val="24"/>
+              </w:rPr>
+              <w:t>Có thể đăng ký và huỷ đăng ký môn học. Badge sĩ số cập nhật tự động mỗi 5 giây.</w:t>
+            </w:r>
+          </w:p>
+        </w:tc>
+      </w:tr>
+      <w:tr>
+        <w:tc>
+          <w:tcPr>
+            <w:tcW w:type="dxa" w:w="2835"/>
+          </w:tcPr>
+          <w:p>
+            <w:pPr>
+              <w:jc w:val="left"/>
+            </w:pPr>
+            <w:r>
+              <w:rPr>
+                <w:rFonts w:ascii="Times New Roman" w:hAnsi="Times New Roman" w:cs="Times New Roman"/>
+                <w:b w:val="0"/>
+                <w:i w:val="0"/>
+                <w:sz w:val="24"/>
+              </w:rPr>
+              <w:t>Giai đoạn 2 đã ĐÓNG</w:t>
+            </w:r>
+          </w:p>
+        </w:tc>
+        <w:tc>
+          <w:tcPr>
+            <w:tcW w:type="dxa" w:w="6520"/>
+          </w:tcPr>
+          <w:p>
+            <w:pPr>
+              <w:jc w:val="left"/>
+            </w:pPr>
+            <w:r>
+              <w:rPr>
+                <w:rFonts w:ascii="Times New Roman" w:hAnsi="Times New Roman" w:cs="Times New Roman"/>
+                <w:b w:val="0"/>
+                <w:i w:val="0"/>
+                <w:sz w:val="24"/>
+              </w:rPr>
+              <w:t>Chỉ xem thời khoá biểu cá nhân — không thể đăng ký, huỷ hoặc thực hiện bất kỳ thay đổi nào.</w:t>
+            </w:r>
+          </w:p>
+        </w:tc>
+      </w:tr>
+    </w:tbl>
+    <w:p/>
+    <w:p>
+      <w:pPr>
+        <w:spacing w:before="120" w:after="0"/>
+        <w:ind w:left="283" w:right="283"/>
+        <w:shd w:val="clear" w:color="auto" w:fill="E2EFDA"/>
+      </w:pPr>
+      <w:r>
+        <w:rPr>
+          <w:rFonts w:ascii="Times New Roman" w:hAnsi="Times New Roman" w:cs="Times New Roman"/>
+          <w:b/>
+          <w:i w:val="0"/>
+          <w:color w:val="378610"/>
+          <w:sz w:val="24"/>
+        </w:rPr>
+        <w:t xml:space="preserve">  Sau khi kết thúc đăng ký</w:t>
+      </w:r>
+    </w:p>
+    <w:p>
+      <w:pPr>
+        <w:spacing w:before="0" w:after="120"/>
+        <w:ind w:left="283" w:right="283"/>
+        <w:shd w:val="clear" w:color="auto" w:fill="E2EFDA"/>
+      </w:pPr>
+      <w:r>
+        <w:rPr>
+          <w:rFonts w:ascii="Times New Roman" w:hAnsi="Times New Roman" w:cs="Times New Roman"/>
+          <w:b w:val="0"/>
+          <w:i/>
+          <w:sz w:val="24"/>
+        </w:rPr>
+        <w:t xml:space="preserve">  Khi Giai đoạn 2 đã đóng, toàn bộ kết quả đăng ký được giữ nguyên và không thay đổi. Học sinh chỉ có thể xem lịch học cá nhân của mình.</w:t>
+      </w:r>
+    </w:p>
+    <w:p>
+      <w:pPr>
+        <w:pStyle w:val="Heading2"/>
+      </w:pPr>
+      <w:r>
+        <w:rPr>
+          <w:rFonts w:ascii="Times New Roman" w:hAnsi="Times New Roman" w:cs="Times New Roman"/>
+          <w:b/>
+          <w:color w:val="2E74B5"/>
+          <w:sz w:val="28"/>
+        </w:rPr>
+        <w:t>5.3. Tab Thời khoá biểu</w:t>
       </w:r>
     </w:p>
     <w:p>
@@ -9347,7 +10407,7 @@
           <w:color w:val="2E74B5"/>
           <w:sz w:val="28"/>
         </w:rPr>
-        <w:t>5.3. Tab Đăng ký môn học</w:t>
+        <w:t>5.4. Tab Đăng ký môn học</w:t>
       </w:r>
     </w:p>
     <w:p>
@@ -9917,7 +10977,7 @@
           <w:color w:val="2E74B5"/>
           <w:sz w:val="28"/>
         </w:rPr>
-        <w:t>5.4. Đăng ký môn học</w:t>
+        <w:t>5.5. Đăng ký môn học</w:t>
       </w:r>
     </w:p>
     <w:p>
@@ -10156,7 +11216,7 @@
           <w:color w:val="2E74B5"/>
           <w:sz w:val="28"/>
         </w:rPr>
-        <w:t>5.5. Huỷ đăng ký môn học</w:t>
+        <w:t>5.6. Huỷ đăng ký môn học</w:t>
       </w:r>
     </w:p>
     <w:p>
@@ -10335,7 +11395,7 @@
           <w:color w:val="2E74B5"/>
           <w:sz w:val="28"/>
         </w:rPr>
-        <w:t>5.6. Xử lý trùng lịch</w:t>
+        <w:t>5.7. Xử lý trùng lịch</w:t>
       </w:r>
     </w:p>
     <w:p>
@@ -12629,7 +13689,7 @@
           <w:color w:val="606060"/>
           <w:sz w:val="22"/>
         </w:rPr>
-        <w:t>Phiên bản 1.0 – Năm học 2026–2027 – Hệ thống mynhc (ClassReg)</w:t>
+        <w:t>Phiên bản 1.1 – Năm học 2026–2027 – Hệ thống mynhc (ClassReg)</w:t>
       </w:r>
     </w:p>
     <w:sectPr>

</xml_diff>

<commit_message>
Rooms management, CCCD→Mã đăng nhập, default capacity 50, warn ≥30
- Rename CCCD to Mã đăng nhập in all UI labels (DB column unchanged)
- Add rooms table + admin upload/clear from Excel (Danhsachphong.xlsx)
- GET /api/available-rooms: filter out rooms booked at overlapping slots
- Teacher modal: select room after picking tiết (only shows free rooms)
- New classes default max_capacity=50 instead of None
- Warning badge (⚠ yellow) when enrollment ≥30, red when at full capacity
  — in both admin enrollment page and teacher calendar view

Co-Authored-By: Claude Sonnet 4.6 <noreply@anthropic.com>
</commit_message>
<xml_diff>
--- a/Hướng_dẫn_sử_dụng_mynhc.docx
+++ b/Hướng_dẫn_sử_dụng_mynhc.docx
@@ -58,7 +58,7 @@
           <w:b/>
           <w:i w:val="0"/>
           <w:color w:val="1F497D"/>
-          <w:sz w:val="40"/>
+          <w:sz w:val="44"/>
         </w:rPr>
         <w:t>HỆ THỐNG ĐĂNG KÝ LỚP HỌC</w:t>
       </w:r>
@@ -73,7 +73,7 @@
           <w:b/>
           <w:i w:val="0"/>
           <w:color w:val="2E74B5"/>
-          <w:sz w:val="56"/>
+          <w:sz w:val="60"/>
         </w:rPr>
         <w:t>mynhc</w:t>
       </w:r>
@@ -89,9 +89,9 @@
           <w:b/>
           <w:i w:val="0"/>
           <w:color w:val="BF8F00"/>
-          <w:sz w:val="32"/>
+          <w:sz w:val="36"/>
         </w:rPr>
-        <w:t>HƯỚNG DẪN SỬ DỤNG NHANH</w:t>
+        <w:t>HƯỚNG DẪN SỬ DỤNG</w:t>
       </w:r>
     </w:p>
     <w:p>
@@ -104,7 +104,7 @@
           <w:b w:val="0"/>
           <w:i/>
           <w:color w:val="404040"/>
-          <w:sz w:val="24"/>
+          <w:sz w:val="26"/>
         </w:rPr>
         <w:t>Dành cho Quản trị viên – Giáo viên – Học sinh</w:t>
       </w:r>
@@ -123,7 +123,7 @@
           <w:rFonts w:ascii="Times New Roman" w:hAnsi="Times New Roman" w:cs="Times New Roman"/>
           <w:b/>
           <w:i w:val="0"/>
-          <w:sz w:val="26"/>
+          <w:sz w:val="28"/>
         </w:rPr>
         <w:t>Năm học 2026 – 2027</w:t>
       </w:r>
@@ -159,7 +159,7 @@
           <w:color w:val="1F497D"/>
           <w:sz w:val="28"/>
         </w:rPr>
-        <w:t>1. TỔNG QUAN</w:t>
+        <w:t>1. TỔNG QUAN HỆ THỐNG</w:t>
       </w:r>
     </w:p>
     <w:p>
@@ -173,7 +173,7 @@
           <w:i w:val="0"/>
           <w:sz w:val="24"/>
         </w:rPr>
-        <w:t>Hệ thống mynhc hỗ trợ đăng ký lớp học tự chọn theo hai giai đoạn:</w:t>
+        <w:t>Hệ thống mynhc là nền tảng đăng ký lớp học tự chọn trực tuyến dành riêng cho Trường THPT Nguyễn Hữu Cầu. Quy trình vận hành gồm hai giai đoạn:</w:t>
       </w:r>
     </w:p>
     <w:p>
@@ -189,7 +189,7 @@
           <w:i w:val="0"/>
           <w:sz w:val="24"/>
         </w:rPr>
-        <w:t>Giai đoạn 1: Giáo viên đăng ký mở lớp → Admin điền phòng &amp; sĩ số.</w:t>
+        <w:t>Giai đoạn 1: Giáo viên đăng ký lịch mở lớp → Quản trị viên điền phòng học &amp; sĩ số tối đa.</w:t>
       </w:r>
     </w:p>
     <w:p>
@@ -205,7 +205,7 @@
           <w:i w:val="0"/>
           <w:sz w:val="24"/>
         </w:rPr>
-        <w:t>Giai đoạn 2: Học sinh đăng ký môn học theo khối, hệ thống kiểm tra trùng lịch tự động.</w:t>
+        <w:t>Giai đoạn 2: Học sinh đăng ký môn học theo khối; hệ thống kiểm tra trùng lịch tự động.</w:t>
       </w:r>
     </w:p>
     <w:tbl>
@@ -244,7 +244,7 @@
         </w:tc>
         <w:tc>
           <w:tcPr>
-            <w:tcW w:type="dxa" w:w="2551"/>
+            <w:tcW w:type="dxa" w:w="2268"/>
             <w:shd w:val="clear" w:color="auto" w:fill="1E4FA3"/>
           </w:tcPr>
           <w:p>
@@ -259,13 +259,13 @@
                 <w:color w:val="FFFFFF"/>
                 <w:sz w:val="22"/>
               </w:rPr>
-              <w:t>URL đăng nhập</w:t>
+              <w:t>URL truy cập</w:t>
             </w:r>
           </w:p>
         </w:tc>
         <w:tc>
           <w:tcPr>
-            <w:tcW w:type="dxa" w:w="4819"/>
+            <w:tcW w:type="dxa" w:w="5102"/>
             <w:shd w:val="clear" w:color="auto" w:fill="1E4FA3"/>
           </w:tcPr>
           <w:p>
@@ -304,7 +304,7 @@
         </w:tc>
         <w:tc>
           <w:tcPr>
-            <w:tcW w:type="dxa" w:w="2551"/>
+            <w:tcW w:type="dxa" w:w="2268"/>
           </w:tcPr>
           <w:p>
             <w:r>
@@ -314,13 +314,13 @@
                 <w:i w:val="0"/>
                 <w:sz w:val="22"/>
               </w:rPr>
-              <w:t>/admin</w:t>
+              <w:t>/admin/login</w:t>
             </w:r>
           </w:p>
         </w:tc>
         <w:tc>
           <w:tcPr>
-            <w:tcW w:type="dxa" w:w="4819"/>
+            <w:tcW w:type="dxa" w:w="5102"/>
           </w:tcPr>
           <w:p>
             <w:r>
@@ -330,7 +330,7 @@
                 <w:i w:val="0"/>
                 <w:sz w:val="22"/>
               </w:rPr>
-              <w:t>Quản lý GV, HS, điều phối giai đoạn, phân phòng, xuất Excel</w:t>
+              <w:t>Quản lý GV, HS; điều phối giai đoạn; phân phòng; xuất Excel</w:t>
             </w:r>
           </w:p>
         </w:tc>
@@ -355,7 +355,7 @@
         </w:tc>
         <w:tc>
           <w:tcPr>
-            <w:tcW w:type="dxa" w:w="2551"/>
+            <w:tcW w:type="dxa" w:w="2268"/>
             <w:shd w:val="clear" w:color="auto" w:fill="EEF4FB"/>
           </w:tcPr>
           <w:p>
@@ -366,13 +366,13 @@
                 <w:i w:val="0"/>
                 <w:sz w:val="22"/>
               </w:rPr>
-              <w:t>/login (chọn GV)</w:t>
+              <w:t>Địa chỉ web (tự redirect)</w:t>
             </w:r>
           </w:p>
         </w:tc>
         <w:tc>
           <w:tcPr>
-            <w:tcW w:type="dxa" w:w="4819"/>
+            <w:tcW w:type="dxa" w:w="5102"/>
             <w:shd w:val="clear" w:color="auto" w:fill="EEF4FB"/>
           </w:tcPr>
           <w:p>
@@ -383,7 +383,7 @@
                 <w:i w:val="0"/>
                 <w:sz w:val="22"/>
               </w:rPr>
-              <w:t>Đăng ký lịch mở lớp, xem số HS &amp; phòng cập nhật trực tiếp</w:t>
+              <w:t>Đăng ký lịch mở lớp; xem số HS &amp; phòng học theo thời gian thực</w:t>
             </w:r>
           </w:p>
         </w:tc>
@@ -407,7 +407,7 @@
         </w:tc>
         <w:tc>
           <w:tcPr>
-            <w:tcW w:type="dxa" w:w="2551"/>
+            <w:tcW w:type="dxa" w:w="2268"/>
           </w:tcPr>
           <w:p>
             <w:r>
@@ -417,13 +417,13 @@
                 <w:i w:val="0"/>
                 <w:sz w:val="22"/>
               </w:rPr>
-              <w:t>/login (chọn HS)</w:t>
+              <w:t>Địa chỉ web (tự redirect)</w:t>
             </w:r>
           </w:p>
         </w:tc>
         <w:tc>
           <w:tcPr>
-            <w:tcW w:type="dxa" w:w="4819"/>
+            <w:tcW w:type="dxa" w:w="5102"/>
           </w:tcPr>
           <w:p>
             <w:r>
@@ -433,7 +433,7 @@
                 <w:i w:val="0"/>
                 <w:sz w:val="22"/>
               </w:rPr>
-              <w:t>Đăng ký / huỷ môn học, xem thời khoá biểu cá nhân</w:t>
+              <w:t>Xem thời khoá biểu; đăng ký và huỷ môn học</w:t>
             </w:r>
           </w:p>
         </w:tc>
@@ -448,24 +448,24 @@
       <w:pPr>
         <w:spacing w:before="80" w:after="0"/>
         <w:ind w:left="227" w:right="227"/>
-        <w:shd w:val="clear" w:color="auto" w:fill="DEEAF1"/>
+        <w:shd w:val="clear" w:color="auto" w:fill="FCE4D6"/>
       </w:pPr>
       <w:r>
         <w:rPr>
           <w:rFonts w:ascii="Times New Roman" w:hAnsi="Times New Roman" w:cs="Times New Roman"/>
           <w:b/>
           <w:i w:val="0"/>
-          <w:color w:val="1F497D"/>
+          <w:color w:val="C05000"/>
           <w:sz w:val="22"/>
         </w:rPr>
-        <w:t xml:space="preserve">  Điều kiện hiển thị lớp</w:t>
+        <w:t xml:space="preserve">  Quan trọng</w:t>
       </w:r>
     </w:p>
     <w:p>
       <w:pPr>
-        <w:spacing w:before="0" w:after="100"/>
+        <w:spacing w:before="0" w:after="120"/>
         <w:ind w:left="227" w:right="227"/>
-        <w:shd w:val="clear" w:color="auto" w:fill="DEEAF1"/>
+        <w:shd w:val="clear" w:color="auto" w:fill="FCE4D6"/>
       </w:pPr>
       <w:r>
         <w:rPr>
@@ -474,21 +474,7 @@
           <w:i/>
           <w:sz w:val="22"/>
         </w:rPr>
-        <w:t xml:space="preserve">  Lớp chỉ xuất hiện cho học sinh khi đã được điền đầy đủ Địa điểm VÀ Sĩ số tối đa.</w:t>
-      </w:r>
-    </w:p>
-    <w:p>
-      <w:pPr>
-        <w:pStyle w:val="Heading1"/>
-      </w:pPr>
-      <w:r>
-        <w:rPr>
-          <w:rFonts w:ascii="Times New Roman" w:hAnsi="Times New Roman" w:cs="Times New Roman"/>
-          <w:b/>
-          <w:color w:val="1F497D"/>
-          <w:sz w:val="28"/>
-        </w:rPr>
-        <w:t>2. ĐĂNG NHẬP</w:t>
+        <w:t xml:space="preserve">  Lớp học chỉ hiển thị cho học sinh khi đã được điền đầy đủ Địa điểm VÀ Sĩ số tối đa.</w:t>
       </w:r>
     </w:p>
     <w:tbl>
@@ -527,7 +513,7 @@
         </w:tc>
         <w:tc>
           <w:tcPr>
-            <w:tcW w:type="dxa" w:w="4252"/>
+            <w:tcW w:type="dxa" w:w="4819"/>
             <w:shd w:val="clear" w:color="auto" w:fill="1E4FA3"/>
           </w:tcPr>
           <w:p>
@@ -548,7 +534,7 @@
         </w:tc>
         <w:tc>
           <w:tcPr>
-            <w:tcW w:type="dxa" w:w="3118"/>
+            <w:tcW w:type="dxa" w:w="2551"/>
             <w:shd w:val="clear" w:color="auto" w:fill="1E4FA3"/>
           </w:tcPr>
           <w:p>
@@ -587,7 +573,7 @@
         </w:tc>
         <w:tc>
           <w:tcPr>
-            <w:tcW w:type="dxa" w:w="4252"/>
+            <w:tcW w:type="dxa" w:w="4819"/>
           </w:tcPr>
           <w:p>
             <w:r>
@@ -597,13 +583,13 @@
                 <w:i w:val="0"/>
                 <w:sz w:val="22"/>
               </w:rPr>
-              <w:t>Chọn Quản trị viên + nhập mật khẩu</w:t>
+              <w:t>/admin/login → nhập mật khẩu quản trị</w:t>
             </w:r>
           </w:p>
         </w:tc>
         <w:tc>
           <w:tcPr>
-            <w:tcW w:type="dxa" w:w="3118"/>
+            <w:tcW w:type="dxa" w:w="2551"/>
           </w:tcPr>
           <w:p>
             <w:r>
@@ -638,7 +624,7 @@
         </w:tc>
         <w:tc>
           <w:tcPr>
-            <w:tcW w:type="dxa" w:w="4252"/>
+            <w:tcW w:type="dxa" w:w="4819"/>
             <w:shd w:val="clear" w:color="auto" w:fill="EEF4FB"/>
           </w:tcPr>
           <w:p>
@@ -649,13 +635,13 @@
                 <w:i w:val="0"/>
                 <w:sz w:val="22"/>
               </w:rPr>
-              <w:t>Chọn Giáo viên + nhập CCCD</w:t>
+              <w:t>/login → nhập Họ tên + CCCD → hệ thống tự nhận</w:t>
             </w:r>
           </w:p>
         </w:tc>
         <w:tc>
           <w:tcPr>
-            <w:tcW w:type="dxa" w:w="3118"/>
+            <w:tcW w:type="dxa" w:w="2551"/>
             <w:shd w:val="clear" w:color="auto" w:fill="EEF4FB"/>
           </w:tcPr>
           <w:p>
@@ -690,7 +676,7 @@
         </w:tc>
         <w:tc>
           <w:tcPr>
-            <w:tcW w:type="dxa" w:w="4252"/>
+            <w:tcW w:type="dxa" w:w="4819"/>
           </w:tcPr>
           <w:p>
             <w:r>
@@ -700,13 +686,13 @@
                 <w:i w:val="0"/>
                 <w:sz w:val="22"/>
               </w:rPr>
-              <w:t>Chọn Học sinh + nhập CCCD</w:t>
+              <w:t>/login → nhập Họ tên + CCCD → hệ thống tự nhận</w:t>
             </w:r>
           </w:p>
         </w:tc>
         <w:tc>
           <w:tcPr>
-            <w:tcW w:type="dxa" w:w="3118"/>
+            <w:tcW w:type="dxa" w:w="2551"/>
           </w:tcPr>
           <w:p>
             <w:r>
@@ -728,6 +714,177 @@
       </w:pPr>
     </w:p>
     <w:p>
+      <w:r>
+        <w:br w:type="page"/>
+      </w:r>
+    </w:p>
+    <w:p>
+      <w:pPr>
+        <w:pStyle w:val="Heading1"/>
+      </w:pPr>
+      <w:r>
+        <w:rPr>
+          <w:rFonts w:ascii="Times New Roman" w:hAnsi="Times New Roman" w:cs="Times New Roman"/>
+          <w:b/>
+          <w:color w:val="1F497D"/>
+          <w:sz w:val="28"/>
+        </w:rPr>
+        <w:t>2. ĐĂNG NHẬP VÀ MẬT KHẨU</w:t>
+      </w:r>
+    </w:p>
+    <w:p>
+      <w:pPr>
+        <w:pStyle w:val="Heading2"/>
+      </w:pPr>
+      <w:r>
+        <w:rPr>
+          <w:rFonts w:ascii="Times New Roman" w:hAnsi="Times New Roman" w:cs="Times New Roman"/>
+          <w:b/>
+          <w:color w:val="0E74B5"/>
+          <w:sz w:val="24"/>
+        </w:rPr>
+        <w:t>2.1. Đăng nhập</w:t>
+      </w:r>
+    </w:p>
+    <w:p>
+      <w:pPr>
+        <w:spacing w:after="60"/>
+      </w:pPr>
+      <w:r>
+        <w:rPr>
+          <w:rFonts w:ascii="Times New Roman" w:hAnsi="Times New Roman" w:cs="Times New Roman"/>
+          <w:b w:val="0"/>
+          <w:i w:val="0"/>
+          <w:sz w:val="24"/>
+        </w:rPr>
+        <w:t>Quản trị viên và giáo viên/học sinh đăng nhập tại hai URL khác nhau:</w:t>
+      </w:r>
+    </w:p>
+    <w:p>
+      <w:pPr>
+        <w:pStyle w:val="Heading3"/>
+      </w:pPr>
+      <w:r>
+        <w:rPr>
+          <w:rFonts w:ascii="Times New Roman" w:hAnsi="Times New Roman" w:cs="Times New Roman"/>
+          <w:b/>
+          <w:color w:val="1F7489"/>
+          <w:sz w:val="24"/>
+        </w:rPr>
+        <w:t>Quản trị viên</w:t>
+      </w:r>
+    </w:p>
+    <w:p>
+      <w:pPr>
+        <w:pStyle w:val="ListNumber"/>
+        <w:spacing w:after="40"/>
+        <w:ind w:left="454"/>
+      </w:pPr>
+      <w:r>
+        <w:rPr>
+          <w:rFonts w:ascii="Times New Roman" w:hAnsi="Times New Roman" w:cs="Times New Roman"/>
+          <w:b w:val="0"/>
+          <w:i w:val="0"/>
+          <w:sz w:val="24"/>
+        </w:rPr>
+        <w:t>Truy cập https://mynhc.onrender.com/admin/login.</w:t>
+      </w:r>
+    </w:p>
+    <w:p>
+      <w:pPr>
+        <w:pStyle w:val="ListNumber"/>
+        <w:spacing w:after="40"/>
+        <w:ind w:left="454"/>
+      </w:pPr>
+      <w:r>
+        <w:rPr>
+          <w:rFonts w:ascii="Times New Roman" w:hAnsi="Times New Roman" w:cs="Times New Roman"/>
+          <w:b w:val="0"/>
+          <w:i w:val="0"/>
+          <w:sz w:val="24"/>
+        </w:rPr>
+        <w:t>Nhập mật khẩu quản trị. Nhấn Đăng nhập.</w:t>
+      </w:r>
+    </w:p>
+    <w:p>
+      <w:pPr>
+        <w:pStyle w:val="Heading3"/>
+      </w:pPr>
+      <w:r>
+        <w:rPr>
+          <w:rFonts w:ascii="Times New Roman" w:hAnsi="Times New Roman" w:cs="Times New Roman"/>
+          <w:b/>
+          <w:color w:val="1F7489"/>
+          <w:sz w:val="24"/>
+        </w:rPr>
+        <w:t>Giáo viên và Học sinh</w:t>
+      </w:r>
+    </w:p>
+    <w:p>
+      <w:pPr>
+        <w:pStyle w:val="ListNumber"/>
+        <w:spacing w:after="40"/>
+        <w:ind w:left="454"/>
+      </w:pPr>
+      <w:r>
+        <w:rPr>
+          <w:rFonts w:ascii="Times New Roman" w:hAnsi="Times New Roman" w:cs="Times New Roman"/>
+          <w:b w:val="0"/>
+          <w:i w:val="0"/>
+          <w:sz w:val="24"/>
+        </w:rPr>
+        <w:t>Truy cập địa chỉ web (ví dụ: https://mynhc.onrender.com) — hệ thống tự chuyển đến trang đăng nhập.</w:t>
+      </w:r>
+    </w:p>
+    <w:p>
+      <w:pPr>
+        <w:pStyle w:val="ListNumber"/>
+        <w:spacing w:after="40"/>
+        <w:ind w:left="454"/>
+      </w:pPr>
+      <w:r>
+        <w:rPr>
+          <w:rFonts w:ascii="Times New Roman" w:hAnsi="Times New Roman" w:cs="Times New Roman"/>
+          <w:b w:val="0"/>
+          <w:i w:val="0"/>
+          <w:sz w:val="24"/>
+        </w:rPr>
+        <w:t>Nhập Họ và tên (đúng chính tả) và Số CCCD (12 chữ số). Nhấn Tiếp theo.</w:t>
+      </w:r>
+    </w:p>
+    <w:p>
+      <w:pPr>
+        <w:pStyle w:val="ListNumber"/>
+        <w:spacing w:after="40"/>
+        <w:ind w:left="454"/>
+      </w:pPr>
+      <w:r>
+        <w:rPr>
+          <w:rFonts w:ascii="Times New Roman" w:hAnsi="Times New Roman" w:cs="Times New Roman"/>
+          <w:b w:val="0"/>
+          <w:i w:val="0"/>
+          <w:sz w:val="24"/>
+        </w:rPr>
+        <w:t>Hệ thống tự nhận dạng tài khoản (giáo viên hay học sinh) và hiển thị lời chào.</w:t>
+      </w:r>
+    </w:p>
+    <w:p>
+      <w:pPr>
+        <w:pStyle w:val="ListNumber"/>
+        <w:spacing w:after="40"/>
+        <w:ind w:left="454"/>
+      </w:pPr>
+      <w:r>
+        <w:rPr>
+          <w:rFonts w:ascii="Times New Roman" w:hAnsi="Times New Roman" w:cs="Times New Roman"/>
+          <w:b w:val="0"/>
+          <w:i w:val="0"/>
+          <w:sz w:val="24"/>
+        </w:rPr>
+        <w:t>Nhập mật khẩu. Nhấn Đăng nhập. Hệ thống chuyển đến trang tương ứng.</w:t>
+      </w:r>
+    </w:p>
+    <w:p>
       <w:pPr>
         <w:spacing w:before="80" w:after="0"/>
         <w:ind w:left="227" w:right="227"/>
@@ -746,7 +903,7 @@
     </w:p>
     <w:p>
       <w:pPr>
-        <w:spacing w:before="0" w:after="100"/>
+        <w:spacing w:before="0" w:after="120"/>
         <w:ind w:left="227" w:right="227"/>
         <w:shd w:val="clear" w:color="auto" w:fill="FFF2CC"/>
       </w:pPr>
@@ -757,22 +914,178 @@
           <w:i/>
           <w:sz w:val="22"/>
         </w:rPr>
-        <w:t xml:space="preserve">  Tài khoản mới tạo (chưa kích hoạt) phải đăng nhập lần đầu để đặt mật khẩu. Khi Admin khôi phục MK, user nhận mật khẩu tạm thời 12 ký tự ngẫu nhiên và bắt buộc đổi ngay sau khi đăng nhập.</w:t>
+        <w:t xml:space="preserve">  Nếu tài khoản chưa kích hoạt (lần đầu đăng nhập hoặc vừa được Admin khôi phục MK), hệ thống tự chuyển đến trang Đổi mật khẩu bắt buộc trước khi vào trang chính.</w:t>
       </w:r>
     </w:p>
     <w:p>
       <w:pPr>
+        <w:pStyle w:val="Heading2"/>
+      </w:pPr>
+      <w:r>
+        <w:rPr>
+          <w:rFonts w:ascii="Times New Roman" w:hAnsi="Times New Roman" w:cs="Times New Roman"/>
+          <w:b/>
+          <w:color w:val="0E74B5"/>
+          <w:sz w:val="24"/>
+        </w:rPr>
+        <w:t>2.2. Đặt / Đổi mật khẩu bắt buộc</w:t>
+      </w:r>
+    </w:p>
+    <w:p>
+      <w:pPr>
         <w:spacing w:after="60"/>
+      </w:pPr>
+      <w:r>
+        <w:rPr>
+          <w:rFonts w:ascii="Times New Roman" w:hAnsi="Times New Roman" w:cs="Times New Roman"/>
+          <w:b w:val="0"/>
+          <w:i w:val="0"/>
+          <w:sz w:val="24"/>
+        </w:rPr>
+        <w:t>Xảy ra khi: (a) đăng nhập lần đầu, hoặc (b) Admin vừa khôi phục mật khẩu.</w:t>
+      </w:r>
+    </w:p>
+    <w:p>
+      <w:pPr>
+        <w:pStyle w:val="ListNumber"/>
+        <w:spacing w:after="40"/>
+        <w:ind w:left="454"/>
+      </w:pPr>
+      <w:r>
+        <w:rPr>
+          <w:rFonts w:ascii="Times New Roman" w:hAnsi="Times New Roman" w:cs="Times New Roman"/>
+          <w:b w:val="0"/>
+          <w:i w:val="0"/>
+          <w:sz w:val="24"/>
+        </w:rPr>
+        <w:t>Đọc hộp thông tin xanh hiển thị yêu cầu mật khẩu.</w:t>
+      </w:r>
+    </w:p>
+    <w:p>
+      <w:pPr>
+        <w:pStyle w:val="ListNumber"/>
+        <w:spacing w:after="40"/>
+        <w:ind w:left="454"/>
+      </w:pPr>
+      <w:r>
+        <w:rPr>
+          <w:rFonts w:ascii="Times New Roman" w:hAnsi="Times New Roman" w:cs="Times New Roman"/>
+          <w:b w:val="0"/>
+          <w:i w:val="0"/>
+          <w:sz w:val="24"/>
+        </w:rPr>
+        <w:t>Nhập mật khẩu mới vào ô Mật khẩu mới.</w:t>
+      </w:r>
+    </w:p>
+    <w:p>
+      <w:pPr>
+        <w:pStyle w:val="ListNumber"/>
+        <w:spacing w:after="40"/>
+        <w:ind w:left="454"/>
+      </w:pPr>
+      <w:r>
+        <w:rPr>
+          <w:rFonts w:ascii="Times New Roman" w:hAnsi="Times New Roman" w:cs="Times New Roman"/>
+          <w:b w:val="0"/>
+          <w:i w:val="0"/>
+          <w:sz w:val="24"/>
+        </w:rPr>
+        <w:t>Nhập lại vào ô Xác nhận mật khẩu (ô hiển thị ✓ Trùng khớp khi đúng).</w:t>
+      </w:r>
+    </w:p>
+    <w:p>
+      <w:pPr>
+        <w:pStyle w:val="ListNumber"/>
+        <w:spacing w:after="40"/>
+        <w:ind w:left="454"/>
+      </w:pPr>
+      <w:r>
+        <w:rPr>
+          <w:rFonts w:ascii="Times New Roman" w:hAnsi="Times New Roman" w:cs="Times New Roman"/>
+          <w:b w:val="0"/>
+          <w:i w:val="0"/>
+          <w:sz w:val="24"/>
+        </w:rPr>
+        <w:t>Nhấn Xác nhận đổi mật khẩu. Hệ thống chuyển về trang chính.</w:t>
+      </w:r>
+    </w:p>
+    <w:p>
+      <w:pPr>
+        <w:spacing w:before="80" w:after="0"/>
+        <w:ind w:left="227" w:right="227"/>
+        <w:shd w:val="clear" w:color="auto" w:fill="DEEAF1"/>
+      </w:pPr>
+      <w:r>
+        <w:rPr>
+          <w:rFonts w:ascii="Times New Roman" w:hAnsi="Times New Roman" w:cs="Times New Roman"/>
+          <w:b/>
+          <w:i w:val="0"/>
+          <w:color w:val="1F497D"/>
+          <w:sz w:val="22"/>
+        </w:rPr>
+        <w:t xml:space="preserve">  Yêu cầu mật khẩu</w:t>
+      </w:r>
+    </w:p>
+    <w:p>
+      <w:pPr>
+        <w:spacing w:before="0" w:after="120"/>
+        <w:ind w:left="227" w:right="227"/>
+        <w:shd w:val="clear" w:color="auto" w:fill="DEEAF1"/>
       </w:pPr>
       <w:r>
         <w:rPr>
           <w:rFonts w:ascii="Times New Roman" w:hAnsi="Times New Roman" w:cs="Times New Roman"/>
           <w:b w:val="0"/>
           <w:i/>
-          <w:color w:val="475569"/>
+          <w:sz w:val="22"/>
+        </w:rPr>
+        <w:t xml:space="preserve">  Yêu cầu mật khẩu: tối thiểu 8 ký tự; gồm chữ hoa (A–Z), chữ thường (a–z), chữ số (0–9) và ký tự đặc biệt (!@#$%^&amp;*()-_+=[]{} |&lt;&gt;,.?/~). KHÔNG dùng: nháy đơn ('), nháy kép ("), chấm phẩy (;), gạch chéo ngược (\).</w:t>
+      </w:r>
+    </w:p>
+    <w:p>
+      <w:pPr>
+        <w:pStyle w:val="Heading2"/>
+      </w:pPr>
+      <w:r>
+        <w:rPr>
+          <w:rFonts w:ascii="Times New Roman" w:hAnsi="Times New Roman" w:cs="Times New Roman"/>
+          <w:b/>
+          <w:color w:val="0E74B5"/>
           <w:sz w:val="24"/>
         </w:rPr>
-        <w:t>Yêu cầu mật khẩu: tối thiểu 8 ký tự, gồm chữ hoa/thường/số/ký tự đặc biệt (!@#$%^&amp;*...). Không dùng: dấu nháy đơn ('), nháy kép ("), chấm phẩy (;), gạch chéo (\).</w:t>
+        <w:t>2.3. Đăng xuất</w:t>
+      </w:r>
+    </w:p>
+    <w:p>
+      <w:pPr>
+        <w:pStyle w:val="ListNumber"/>
+        <w:spacing w:after="40"/>
+        <w:ind w:left="454"/>
+      </w:pPr>
+      <w:r>
+        <w:rPr>
+          <w:rFonts w:ascii="Times New Roman" w:hAnsi="Times New Roman" w:cs="Times New Roman"/>
+          <w:b w:val="0"/>
+          <w:i w:val="0"/>
+          <w:sz w:val="24"/>
+        </w:rPr>
+        <w:t>Nhấn nút Đăng xuất ở góc phải trên cùng của trang.</w:t>
+      </w:r>
+    </w:p>
+    <w:p>
+      <w:pPr>
+        <w:pStyle w:val="ListNumber"/>
+        <w:spacing w:after="40"/>
+        <w:ind w:left="454"/>
+      </w:pPr>
+      <w:r>
+        <w:rPr>
+          <w:rFonts w:ascii="Times New Roman" w:hAnsi="Times New Roman" w:cs="Times New Roman"/>
+          <w:b w:val="0"/>
+          <w:i w:val="0"/>
+          <w:sz w:val="24"/>
+        </w:rPr>
+        <w:t>Hệ thống xoá phiên làm việc và chuyển về trang đăng nhập.</w:t>
       </w:r>
     </w:p>
     <w:p>
@@ -791,7 +1104,21 @@
           <w:color w:val="1F497D"/>
           <w:sz w:val="28"/>
         </w:rPr>
-        <w:t>3. QUẢN TRỊ VIÊN (/admin)</w:t>
+        <w:t>3. HƯỚNG DẪN QUẢN TRỊ VIÊN</w:t>
+      </w:r>
+    </w:p>
+    <w:p>
+      <w:pPr>
+        <w:spacing w:after="60"/>
+      </w:pPr>
+      <w:r>
+        <w:rPr>
+          <w:rFonts w:ascii="Times New Roman" w:hAnsi="Times New Roman" w:cs="Times New Roman"/>
+          <w:b w:val="0"/>
+          <w:i w:val="0"/>
+          <w:sz w:val="24"/>
+        </w:rPr>
+        <w:t>Sau khi đăng nhập, quản trị viên được chuyển đến trang /admin. Trang chủ hiển thị 4 thẻ thống kê (số GV, HS, lớp đã mở, lượt đăng ký) và trạng thái hai giai đoạn.</w:t>
       </w:r>
     </w:p>
     <w:p>
@@ -805,256 +1132,69 @@
           <w:color w:val="0E74B5"/>
           <w:sz w:val="24"/>
         </w:rPr>
-        <w:t>3.1. Quản lý Giáo viên &amp; Học sinh</w:t>
+        <w:t>3.0. Tạo dữ liệu mẫu (dành cho kiểm thử)</w:t>
       </w:r>
     </w:p>
-    <w:tbl>
-      <w:tblPr>
-        <w:tblStyle w:val="TableGrid"/>
-        <w:tblW w:type="auto" w:w="0"/>
-        <w:jc w:val="center"/>
-        <w:tblLook w:firstColumn="1" w:firstRow="1" w:lastColumn="0" w:lastRow="0" w:noHBand="0" w:noVBand="1" w:val="04A0"/>
-      </w:tblPr>
-      <w:tblGrid>
-        <w:gridCol w:w="4844"/>
-        <w:gridCol w:w="4844"/>
-      </w:tblGrid>
-      <w:tr>
-        <w:tc>
-          <w:tcPr>
-            <w:tcW w:type="dxa" w:w="2551"/>
-            <w:shd w:val="clear" w:color="auto" w:fill="1E4FA3"/>
-          </w:tcPr>
-          <w:p>
-            <w:pPr>
-              <w:jc w:val="center"/>
-            </w:pPr>
-            <w:r>
-              <w:rPr>
-                <w:rFonts w:ascii="Times New Roman" w:hAnsi="Times New Roman" w:cs="Times New Roman"/>
-                <w:b/>
-                <w:i w:val="0"/>
-                <w:color w:val="FFFFFF"/>
-                <w:sz w:val="22"/>
-              </w:rPr>
-              <w:t>Tính năng</w:t>
-            </w:r>
-          </w:p>
-        </w:tc>
-        <w:tc>
-          <w:tcPr>
-            <w:tcW w:type="dxa" w:w="6803"/>
-            <w:shd w:val="clear" w:color="auto" w:fill="1E4FA3"/>
-          </w:tcPr>
-          <w:p>
-            <w:pPr>
-              <w:jc w:val="center"/>
-            </w:pPr>
-            <w:r>
-              <w:rPr>
-                <w:rFonts w:ascii="Times New Roman" w:hAnsi="Times New Roman" w:cs="Times New Roman"/>
-                <w:b/>
-                <w:i w:val="0"/>
-                <w:color w:val="FFFFFF"/>
-                <w:sz w:val="22"/>
-              </w:rPr>
-              <w:t>Mô tả</w:t>
-            </w:r>
-          </w:p>
-        </w:tc>
-      </w:tr>
-      <w:tr>
-        <w:tc>
-          <w:tcPr>
-            <w:tcW w:type="dxa" w:w="2551"/>
-          </w:tcPr>
-          <w:p>
-            <w:r>
-              <w:rPr>
-                <w:rFonts w:ascii="Times New Roman" w:hAnsi="Times New Roman" w:cs="Times New Roman"/>
-                <w:b w:val="0"/>
-                <w:i w:val="0"/>
-                <w:sz w:val="22"/>
-              </w:rPr>
-              <w:t>Xem danh sách</w:t>
-            </w:r>
-          </w:p>
-        </w:tc>
-        <w:tc>
-          <w:tcPr>
-            <w:tcW w:type="dxa" w:w="6803"/>
-          </w:tcPr>
-          <w:p>
-            <w:r>
-              <w:rPr>
-                <w:rFonts w:ascii="Times New Roman" w:hAnsi="Times New Roman" w:cs="Times New Roman"/>
-                <w:b w:val="0"/>
-                <w:i w:val="0"/>
-                <w:sz w:val="22"/>
-              </w:rPr>
-              <w:t>Bảng hiển thị CCCD, Họ tên, Email, Trạng thái TK (Đã / Chưa kích hoạt)</w:t>
-            </w:r>
-          </w:p>
-        </w:tc>
-      </w:tr>
-      <w:tr>
-        <w:tc>
-          <w:tcPr>
-            <w:tcW w:type="dxa" w:w="2551"/>
-            <w:shd w:val="clear" w:color="auto" w:fill="EEF4FB"/>
-          </w:tcPr>
-          <w:p>
-            <w:r>
-              <w:rPr>
-                <w:rFonts w:ascii="Times New Roman" w:hAnsi="Times New Roman" w:cs="Times New Roman"/>
-                <w:b w:val="0"/>
-                <w:i w:val="0"/>
-                <w:sz w:val="22"/>
-              </w:rPr>
-              <w:t>Tìm kiếm</w:t>
-            </w:r>
-          </w:p>
-        </w:tc>
-        <w:tc>
-          <w:tcPr>
-            <w:tcW w:type="dxa" w:w="6803"/>
-            <w:shd w:val="clear" w:color="auto" w:fill="EEF4FB"/>
-          </w:tcPr>
-          <w:p>
-            <w:r>
-              <w:rPr>
-                <w:rFonts w:ascii="Times New Roman" w:hAnsi="Times New Roman" w:cs="Times New Roman"/>
-                <w:b w:val="0"/>
-                <w:i w:val="0"/>
-                <w:sz w:val="22"/>
-              </w:rPr>
-              <w:t>Ô search lọc theo Họ tên hoặc CCCD ngay lập tức</w:t>
-            </w:r>
-          </w:p>
-        </w:tc>
-      </w:tr>
-      <w:tr>
-        <w:tc>
-          <w:tcPr>
-            <w:tcW w:type="dxa" w:w="2551"/>
-          </w:tcPr>
-          <w:p>
-            <w:r>
-              <w:rPr>
-                <w:rFonts w:ascii="Times New Roman" w:hAnsi="Times New Roman" w:cs="Times New Roman"/>
-                <w:b w:val="0"/>
-                <w:i w:val="0"/>
-                <w:sz w:val="22"/>
-              </w:rPr>
-              <w:t>Thêm / Sửa / Xoá</w:t>
-            </w:r>
-          </w:p>
-        </w:tc>
-        <w:tc>
-          <w:tcPr>
-            <w:tcW w:type="dxa" w:w="6803"/>
-          </w:tcPr>
-          <w:p>
-            <w:r>
-              <w:rPr>
-                <w:rFonts w:ascii="Times New Roman" w:hAnsi="Times New Roman" w:cs="Times New Roman"/>
-                <w:b w:val="0"/>
-                <w:i w:val="0"/>
-                <w:sz w:val="22"/>
-              </w:rPr>
-              <w:t>Nút icon trong cột Thao tác (chỉ hiện với tài khoản đã kích hoạt)</w:t>
-            </w:r>
-          </w:p>
-        </w:tc>
-      </w:tr>
-      <w:tr>
-        <w:tc>
-          <w:tcPr>
-            <w:tcW w:type="dxa" w:w="2551"/>
-            <w:shd w:val="clear" w:color="auto" w:fill="EEF4FB"/>
-          </w:tcPr>
-          <w:p>
-            <w:r>
-              <w:rPr>
-                <w:rFonts w:ascii="Times New Roman" w:hAnsi="Times New Roman" w:cs="Times New Roman"/>
-                <w:b w:val="0"/>
-                <w:i w:val="0"/>
-                <w:sz w:val="22"/>
-              </w:rPr>
-              <w:t>Nhập Excel</w:t>
-            </w:r>
-          </w:p>
-        </w:tc>
-        <w:tc>
-          <w:tcPr>
-            <w:tcW w:type="dxa" w:w="6803"/>
-            <w:shd w:val="clear" w:color="auto" w:fill="EEF4FB"/>
-          </w:tcPr>
-          <w:p>
-            <w:r>
-              <w:rPr>
-                <w:rFonts w:ascii="Times New Roman" w:hAnsi="Times New Roman" w:cs="Times New Roman"/>
-                <w:b w:val="0"/>
-                <w:i w:val="0"/>
-                <w:sz w:val="22"/>
-              </w:rPr>
-              <w:t>Upload file .xlsx theo mẫu; hỗ trợ cả GV lẫn HS</w:t>
-            </w:r>
-          </w:p>
-        </w:tc>
-      </w:tr>
-      <w:tr>
-        <w:tc>
-          <w:tcPr>
-            <w:tcW w:type="dxa" w:w="2551"/>
-          </w:tcPr>
-          <w:p>
-            <w:r>
-              <w:rPr>
-                <w:rFonts w:ascii="Times New Roman" w:hAnsi="Times New Roman" w:cs="Times New Roman"/>
-                <w:b w:val="0"/>
-                <w:i w:val="0"/>
-                <w:sz w:val="22"/>
-              </w:rPr>
-              <w:t>Khôi phục MK</w:t>
-            </w:r>
-          </w:p>
-        </w:tc>
-        <w:tc>
-          <w:tcPr>
-            <w:tcW w:type="dxa" w:w="6803"/>
-          </w:tcPr>
-          <w:p>
-            <w:r>
-              <w:rPr>
-                <w:rFonts w:ascii="Times New Roman" w:hAnsi="Times New Roman" w:cs="Times New Roman"/>
-                <w:b w:val="0"/>
-                <w:i w:val="0"/>
-                <w:sz w:val="22"/>
-              </w:rPr>
-              <w:t>Tạo mật khẩu tạm 12 ký tự ngẫu nhiên, hiển thị 1 lần — sao chép trước khi đóng modal</w:t>
-            </w:r>
-          </w:p>
-        </w:tc>
-      </w:tr>
-    </w:tbl>
     <w:p>
       <w:pPr>
-        <w:spacing w:after="40"/>
-      </w:pPr>
-    </w:p>
-    <w:p>
-      <w:pPr>
-        <w:pStyle w:val="Heading2"/>
+        <w:spacing w:after="60"/>
       </w:pPr>
       <w:r>
         <w:rPr>
           <w:rFonts w:ascii="Times New Roman" w:hAnsi="Times New Roman" w:cs="Times New Roman"/>
-          <w:b/>
-          <w:color w:val="0E74B5"/>
+          <w:b w:val="0"/>
+          <w:i w:val="0"/>
           <w:sz w:val="24"/>
         </w:rPr>
-        <w:t>3.2. Điều phối Giai đoạn</w:t>
+        <w:t>Khi triển khai hệ thống lần đầu trên môi trường kiểm thử, Admin có thể tạo ngay bộ dữ liệu mẫu mà không cần nhập thủ công:</w:t>
+      </w:r>
+    </w:p>
+    <w:p>
+      <w:pPr>
+        <w:pStyle w:val="ListNumber"/>
+        <w:spacing w:after="40"/>
+        <w:ind w:left="454"/>
+      </w:pPr>
+      <w:r>
+        <w:rPr>
+          <w:rFonts w:ascii="Times New Roman" w:hAnsi="Times New Roman" w:cs="Times New Roman"/>
+          <w:b w:val="0"/>
+          <w:i w:val="0"/>
+          <w:sz w:val="24"/>
+        </w:rPr>
+        <w:t>Tại trang /admin, nhấn nút Tạo dữ liệu mẫu ở góc phải tiêu đề "Quản trị mynhc".</w:t>
+      </w:r>
+    </w:p>
+    <w:p>
+      <w:pPr>
+        <w:pStyle w:val="ListNumber"/>
+        <w:spacing w:after="40"/>
+        <w:ind w:left="454"/>
+      </w:pPr>
+      <w:r>
+        <w:rPr>
+          <w:rFonts w:ascii="Times New Roman" w:hAnsi="Times New Roman" w:cs="Times New Roman"/>
+          <w:b w:val="0"/>
+          <w:i w:val="0"/>
+          <w:sz w:val="24"/>
+        </w:rPr>
+        <w:t>Modal xác nhận hiển thị danh sách dữ liệu sẽ được tạo (8 GV, 14 HS, 19 lớp, 13 đăng ký).</w:t>
+      </w:r>
+    </w:p>
+    <w:p>
+      <w:pPr>
+        <w:pStyle w:val="ListNumber"/>
+        <w:spacing w:after="40"/>
+        <w:ind w:left="454"/>
+      </w:pPr>
+      <w:r>
+        <w:rPr>
+          <w:rFonts w:ascii="Times New Roman" w:hAnsi="Times New Roman" w:cs="Times New Roman"/>
+          <w:b w:val="0"/>
+          <w:i w:val="0"/>
+          <w:sz w:val="24"/>
+        </w:rPr>
+        <w:t>Nhấn Xác nhận tạo. Hệ thống tự động tạo dữ liệu và tải lại trang.</w:t>
       </w:r>
     </w:p>
     <w:tbl>
@@ -1072,7 +1212,7 @@
       <w:tr>
         <w:tc>
           <w:tcPr>
-            <w:tcW w:type="dxa" w:w="2268"/>
+            <w:tcW w:type="dxa" w:w="3118"/>
             <w:shd w:val="clear" w:color="auto" w:fill="1E4FA3"/>
           </w:tcPr>
           <w:p>
@@ -1087,13 +1227,13 @@
                 <w:color w:val="FFFFFF"/>
                 <w:sz w:val="22"/>
               </w:rPr>
-              <w:t>Giai đoạn</w:t>
+              <w:t>Loại dữ liệu</w:t>
             </w:r>
           </w:p>
         </w:tc>
         <w:tc>
           <w:tcPr>
-            <w:tcW w:type="dxa" w:w="4252"/>
+            <w:tcW w:type="dxa" w:w="1701"/>
             <w:shd w:val="clear" w:color="auto" w:fill="1E4FA3"/>
           </w:tcPr>
           <w:p>
@@ -1108,13 +1248,13 @@
                 <w:color w:val="FFFFFF"/>
                 <w:sz w:val="22"/>
               </w:rPr>
-              <w:t>Ai làm gì</w:t>
+              <w:t>Số lượng</w:t>
             </w:r>
           </w:p>
         </w:tc>
         <w:tc>
           <w:tcPr>
-            <w:tcW w:type="dxa" w:w="2835"/>
+            <w:tcW w:type="dxa" w:w="4535"/>
             <w:shd w:val="clear" w:color="auto" w:fill="1E4FA3"/>
           </w:tcPr>
           <w:p>
@@ -1129,7 +1269,7 @@
                 <w:color w:val="FFFFFF"/>
                 <w:sz w:val="22"/>
               </w:rPr>
-              <w:t>Nút điều khiển</w:t>
+              <w:t>Mật khẩu mặc định</w:t>
             </w:r>
           </w:p>
         </w:tc>
@@ -1137,7 +1277,7 @@
       <w:tr>
         <w:tc>
           <w:tcPr>
-            <w:tcW w:type="dxa" w:w="2268"/>
+            <w:tcW w:type="dxa" w:w="3118"/>
           </w:tcPr>
           <w:p>
             <w:r>
@@ -1147,13 +1287,13 @@
                 <w:i w:val="0"/>
                 <w:sz w:val="22"/>
               </w:rPr>
-              <w:t>Giai đoạn 1 – MỞ</w:t>
+              <w:t>Giáo viên (đã kích hoạt)</w:t>
             </w:r>
           </w:p>
         </w:tc>
         <w:tc>
           <w:tcPr>
-            <w:tcW w:type="dxa" w:w="4252"/>
+            <w:tcW w:type="dxa" w:w="1701"/>
           </w:tcPr>
           <w:p>
             <w:r>
@@ -1163,13 +1303,13 @@
                 <w:i w:val="0"/>
                 <w:sz w:val="22"/>
               </w:rPr>
-              <w:t>Giáo viên đăng ký lịch mở lớp</w:t>
+              <w:t>6</w:t>
             </w:r>
           </w:p>
         </w:tc>
         <w:tc>
           <w:tcPr>
-            <w:tcW w:type="dxa" w:w="2835"/>
+            <w:tcW w:type="dxa" w:w="4535"/>
           </w:tcPr>
           <w:p>
             <w:r>
@@ -1179,7 +1319,7 @@
                 <w:i w:val="0"/>
                 <w:sz w:val="22"/>
               </w:rPr>
-              <w:t>Mở đăng ký GV  →  /admin/class-reg</w:t>
+              <w:t>Nhc@2627</w:t>
             </w:r>
           </w:p>
         </w:tc>
@@ -1187,7 +1327,7 @@
       <w:tr>
         <w:tc>
           <w:tcPr>
-            <w:tcW w:type="dxa" w:w="2268"/>
+            <w:tcW w:type="dxa" w:w="3118"/>
             <w:shd w:val="clear" w:color="auto" w:fill="EEF4FB"/>
           </w:tcPr>
           <w:p>
@@ -1198,13 +1338,13 @@
                 <w:i w:val="0"/>
                 <w:sz w:val="22"/>
               </w:rPr>
-              <w:t>Giai đoạn 1 – ĐÓNG</w:t>
+              <w:t>Giáo viên (chưa có MK)</w:t>
             </w:r>
           </w:p>
         </w:tc>
         <w:tc>
           <w:tcPr>
-            <w:tcW w:type="dxa" w:w="4252"/>
+            <w:tcW w:type="dxa" w:w="1701"/>
             <w:shd w:val="clear" w:color="auto" w:fill="EEF4FB"/>
           </w:tcPr>
           <w:p>
@@ -1215,13 +1355,13 @@
                 <w:i w:val="0"/>
                 <w:sz w:val="22"/>
               </w:rPr>
-              <w:t>Admin điền phòng &amp; sĩ số tối đa cho từng lớp</w:t>
+              <w:t>2</w:t>
             </w:r>
           </w:p>
         </w:tc>
         <w:tc>
           <w:tcPr>
-            <w:tcW w:type="dxa" w:w="2835"/>
+            <w:tcW w:type="dxa" w:w="4535"/>
             <w:shd w:val="clear" w:color="auto" w:fill="EEF4FB"/>
           </w:tcPr>
           <w:p>
@@ -1232,7 +1372,7 @@
                 <w:i w:val="0"/>
                 <w:sz w:val="22"/>
               </w:rPr>
-              <w:t>Đóng đăng ký GV</w:t>
+              <w:t>(chưa thiết lập)</w:t>
             </w:r>
           </w:p>
         </w:tc>
@@ -1240,7 +1380,7 @@
       <w:tr>
         <w:tc>
           <w:tcPr>
-            <w:tcW w:type="dxa" w:w="2268"/>
+            <w:tcW w:type="dxa" w:w="3118"/>
           </w:tcPr>
           <w:p>
             <w:r>
@@ -1250,13 +1390,13 @@
                 <w:i w:val="0"/>
                 <w:sz w:val="22"/>
               </w:rPr>
-              <w:t>Giai đoạn 2 – MỞ</w:t>
+              <w:t>Học sinh (đã kích hoạt)</w:t>
             </w:r>
           </w:p>
         </w:tc>
         <w:tc>
           <w:tcPr>
-            <w:tcW w:type="dxa" w:w="4252"/>
+            <w:tcW w:type="dxa" w:w="1701"/>
           </w:tcPr>
           <w:p>
             <w:r>
@@ -1266,13 +1406,13 @@
                 <w:i w:val="0"/>
                 <w:sz w:val="22"/>
               </w:rPr>
-              <w:t>Học sinh đăng ký / huỷ môn học</w:t>
+              <w:t>7</w:t>
             </w:r>
           </w:p>
         </w:tc>
         <w:tc>
           <w:tcPr>
-            <w:tcW w:type="dxa" w:w="2835"/>
+            <w:tcW w:type="dxa" w:w="4535"/>
           </w:tcPr>
           <w:p>
             <w:r>
@@ -1282,7 +1422,7 @@
                 <w:i w:val="0"/>
                 <w:sz w:val="22"/>
               </w:rPr>
-              <w:t>Mở đăng ký HS  →  /admin/enrollment</w:t>
+              <w:t>Nhc@2627</w:t>
             </w:r>
           </w:p>
         </w:tc>
@@ -1290,7 +1430,7 @@
       <w:tr>
         <w:tc>
           <w:tcPr>
-            <w:tcW w:type="dxa" w:w="2268"/>
+            <w:tcW w:type="dxa" w:w="3118"/>
             <w:shd w:val="clear" w:color="auto" w:fill="EEF4FB"/>
           </w:tcPr>
           <w:p>
@@ -1301,13 +1441,13 @@
                 <w:i w:val="0"/>
                 <w:sz w:val="22"/>
               </w:rPr>
-              <w:t>Giai đoạn 2 – ĐÓNG</w:t>
+              <w:t>Học sinh (chưa có MK)</w:t>
             </w:r>
           </w:p>
         </w:tc>
         <w:tc>
           <w:tcPr>
-            <w:tcW w:type="dxa" w:w="4252"/>
+            <w:tcW w:type="dxa" w:w="1701"/>
             <w:shd w:val="clear" w:color="auto" w:fill="EEF4FB"/>
           </w:tcPr>
           <w:p>
@@ -1318,13 +1458,13 @@
                 <w:i w:val="0"/>
                 <w:sz w:val="22"/>
               </w:rPr>
-              <w:t>Xuất Excel kết quả; HS chỉ xem TKB, không thể thay đổi</w:t>
+              <w:t>7</w:t>
             </w:r>
           </w:p>
         </w:tc>
         <w:tc>
           <w:tcPr>
-            <w:tcW w:type="dxa" w:w="2835"/>
+            <w:tcW w:type="dxa" w:w="4535"/>
             <w:shd w:val="clear" w:color="auto" w:fill="EEF4FB"/>
           </w:tcPr>
           <w:p>
@@ -1335,7 +1475,110 @@
                 <w:i w:val="0"/>
                 <w:sz w:val="22"/>
               </w:rPr>
-              <w:t>Đóng đăng ký HS</w:t>
+              <w:t>(chưa thiết lập)</w:t>
+            </w:r>
+          </w:p>
+        </w:tc>
+      </w:tr>
+      <w:tr>
+        <w:tc>
+          <w:tcPr>
+            <w:tcW w:type="dxa" w:w="3118"/>
+          </w:tcPr>
+          <w:p>
+            <w:r>
+              <w:rPr>
+                <w:rFonts w:ascii="Times New Roman" w:hAnsi="Times New Roman" w:cs="Times New Roman"/>
+                <w:b w:val="0"/>
+                <w:i w:val="0"/>
+                <w:sz w:val="22"/>
+              </w:rPr>
+              <w:t>Lớp học (đã duyệt)</w:t>
+            </w:r>
+          </w:p>
+        </w:tc>
+        <w:tc>
+          <w:tcPr>
+            <w:tcW w:type="dxa" w:w="1701"/>
+          </w:tcPr>
+          <w:p>
+            <w:r>
+              <w:rPr>
+                <w:rFonts w:ascii="Times New Roman" w:hAnsi="Times New Roman" w:cs="Times New Roman"/>
+                <w:b w:val="0"/>
+                <w:i w:val="0"/>
+                <w:sz w:val="22"/>
+              </w:rPr>
+              <w:t>19</w:t>
+            </w:r>
+          </w:p>
+        </w:tc>
+        <w:tc>
+          <w:tcPr>
+            <w:tcW w:type="dxa" w:w="4535"/>
+          </w:tcPr>
+          <w:p>
+            <w:r>
+              <w:rPr>
+                <w:rFonts w:ascii="Times New Roman" w:hAnsi="Times New Roman" w:cs="Times New Roman"/>
+                <w:b w:val="0"/>
+                <w:i w:val="0"/>
+                <w:sz w:val="22"/>
+              </w:rPr>
+              <w:t>—</w:t>
+            </w:r>
+          </w:p>
+        </w:tc>
+      </w:tr>
+      <w:tr>
+        <w:tc>
+          <w:tcPr>
+            <w:tcW w:type="dxa" w:w="3118"/>
+            <w:shd w:val="clear" w:color="auto" w:fill="EEF4FB"/>
+          </w:tcPr>
+          <w:p>
+            <w:r>
+              <w:rPr>
+                <w:rFonts w:ascii="Times New Roman" w:hAnsi="Times New Roman" w:cs="Times New Roman"/>
+                <w:b w:val="0"/>
+                <w:i w:val="0"/>
+                <w:sz w:val="22"/>
+              </w:rPr>
+              <w:t>Đăng ký mẫu</w:t>
+            </w:r>
+          </w:p>
+        </w:tc>
+        <w:tc>
+          <w:tcPr>
+            <w:tcW w:type="dxa" w:w="1701"/>
+            <w:shd w:val="clear" w:color="auto" w:fill="EEF4FB"/>
+          </w:tcPr>
+          <w:p>
+            <w:r>
+              <w:rPr>
+                <w:rFonts w:ascii="Times New Roman" w:hAnsi="Times New Roman" w:cs="Times New Roman"/>
+                <w:b w:val="0"/>
+                <w:i w:val="0"/>
+                <w:sz w:val="22"/>
+              </w:rPr>
+              <w:t>13</w:t>
+            </w:r>
+          </w:p>
+        </w:tc>
+        <w:tc>
+          <w:tcPr>
+            <w:tcW w:type="dxa" w:w="4535"/>
+            <w:shd w:val="clear" w:color="auto" w:fill="EEF4FB"/>
+          </w:tcPr>
+          <w:p>
+            <w:r>
+              <w:rPr>
+                <w:rFonts w:ascii="Times New Roman" w:hAnsi="Times New Roman" w:cs="Times New Roman"/>
+                <w:b w:val="0"/>
+                <w:i w:val="0"/>
+                <w:sz w:val="22"/>
+              </w:rPr>
+              <w:t>—</w:t>
             </w:r>
           </w:p>
         </w:tc>
@@ -1345,6 +1588,607 @@
       <w:pPr>
         <w:spacing w:after="40"/>
       </w:pPr>
+    </w:p>
+    <w:p>
+      <w:pPr>
+        <w:spacing w:before="80" w:after="0"/>
+        <w:ind w:left="227" w:right="227"/>
+        <w:shd w:val="clear" w:color="auto" w:fill="FCE4D6"/>
+      </w:pPr>
+      <w:r>
+        <w:rPr>
+          <w:rFonts w:ascii="Times New Roman" w:hAnsi="Times New Roman" w:cs="Times New Roman"/>
+          <w:b/>
+          <w:i w:val="0"/>
+          <w:color w:val="C05000"/>
+          <w:sz w:val="22"/>
+        </w:rPr>
+        <w:t xml:space="preserve">  Quan trọng</w:t>
+      </w:r>
+    </w:p>
+    <w:p>
+      <w:pPr>
+        <w:spacing w:before="0" w:after="120"/>
+        <w:ind w:left="227" w:right="227"/>
+        <w:shd w:val="clear" w:color="auto" w:fill="FCE4D6"/>
+      </w:pPr>
+      <w:r>
+        <w:rPr>
+          <w:rFonts w:ascii="Times New Roman" w:hAnsi="Times New Roman" w:cs="Times New Roman"/>
+          <w:b w:val="0"/>
+          <w:i/>
+          <w:sz w:val="22"/>
+        </w:rPr>
+        <w:t xml:space="preserve">  Nút chỉ hoạt động khi database chưa có dữ liệu (bảng giáo viên còn trống). Nếu đã có dữ liệu, hệ thống báo lỗi và không thực hiện. KHÔNG sử dụng tính năng này trên môi trường vận hành thực tế.</w:t>
+      </w:r>
+    </w:p>
+    <w:p>
+      <w:pPr>
+        <w:pStyle w:val="Heading2"/>
+      </w:pPr>
+      <w:r>
+        <w:rPr>
+          <w:rFonts w:ascii="Times New Roman" w:hAnsi="Times New Roman" w:cs="Times New Roman"/>
+          <w:b/>
+          <w:color w:val="0E74B5"/>
+          <w:sz w:val="24"/>
+        </w:rPr>
+        <w:t>3.1. Quản lý Giáo viên</w:t>
+      </w:r>
+    </w:p>
+    <w:p>
+      <w:pPr>
+        <w:pStyle w:val="Heading3"/>
+      </w:pPr>
+      <w:r>
+        <w:rPr>
+          <w:rFonts w:ascii="Times New Roman" w:hAnsi="Times New Roman" w:cs="Times New Roman"/>
+          <w:b/>
+          <w:color w:val="1F7489"/>
+          <w:sz w:val="24"/>
+        </w:rPr>
+        <w:t>3.1.1. Xem danh sách</w:t>
+      </w:r>
+    </w:p>
+    <w:p>
+      <w:pPr>
+        <w:spacing w:after="60"/>
+      </w:pPr>
+      <w:r>
+        <w:rPr>
+          <w:rFonts w:ascii="Times New Roman" w:hAnsi="Times New Roman" w:cs="Times New Roman"/>
+          <w:b w:val="0"/>
+          <w:i w:val="0"/>
+          <w:sz w:val="24"/>
+        </w:rPr>
+        <w:t>Bảng danh sách gồm: STT, CCCD, Họ tên, Giới tính, Tổ bộ môn, Email, Trạng thái TK (Đã/Chưa kích hoạt), Thao tác.</w:t>
+      </w:r>
+    </w:p>
+    <w:p>
+      <w:pPr>
+        <w:spacing w:after="60"/>
+      </w:pPr>
+      <w:r>
+        <w:rPr>
+          <w:rFonts w:ascii="Times New Roman" w:hAnsi="Times New Roman" w:cs="Times New Roman"/>
+          <w:b w:val="0"/>
+          <w:i w:val="0"/>
+          <w:sz w:val="24"/>
+        </w:rPr>
+        <w:t>Ô tìm kiếm phía trên bảng lọc theo Họ tên hoặc CCCD ngay lập tức.</w:t>
+      </w:r>
+    </w:p>
+    <w:p>
+      <w:pPr>
+        <w:pStyle w:val="Heading3"/>
+      </w:pPr>
+      <w:r>
+        <w:rPr>
+          <w:rFonts w:ascii="Times New Roman" w:hAnsi="Times New Roman" w:cs="Times New Roman"/>
+          <w:b/>
+          <w:color w:val="1F7489"/>
+          <w:sz w:val="24"/>
+        </w:rPr>
+        <w:t>3.1.2. Thêm giáo viên</w:t>
+      </w:r>
+    </w:p>
+    <w:p>
+      <w:pPr>
+        <w:pStyle w:val="ListNumber"/>
+        <w:spacing w:after="40"/>
+        <w:ind w:left="454"/>
+      </w:pPr>
+      <w:r>
+        <w:rPr>
+          <w:rFonts w:ascii="Times New Roman" w:hAnsi="Times New Roman" w:cs="Times New Roman"/>
+          <w:b w:val="0"/>
+          <w:i w:val="0"/>
+          <w:sz w:val="24"/>
+        </w:rPr>
+        <w:t>Nhấn nút Thêm GV phía trên bảng.</w:t>
+      </w:r>
+    </w:p>
+    <w:p>
+      <w:pPr>
+        <w:pStyle w:val="ListNumber"/>
+        <w:spacing w:after="40"/>
+        <w:ind w:left="454"/>
+      </w:pPr>
+      <w:r>
+        <w:rPr>
+          <w:rFonts w:ascii="Times New Roman" w:hAnsi="Times New Roman" w:cs="Times New Roman"/>
+          <w:b w:val="0"/>
+          <w:i w:val="0"/>
+          <w:sz w:val="24"/>
+        </w:rPr>
+        <w:t>Điền thông tin: CCCD, Họ tên, Giới tính, Tổ bộ môn, Email (tuỳ chọn), Mật khẩu.</w:t>
+      </w:r>
+    </w:p>
+    <w:p>
+      <w:pPr>
+        <w:pStyle w:val="ListNumber"/>
+        <w:spacing w:after="40"/>
+        <w:ind w:left="454"/>
+      </w:pPr>
+      <w:r>
+        <w:rPr>
+          <w:rFonts w:ascii="Times New Roman" w:hAnsi="Times New Roman" w:cs="Times New Roman"/>
+          <w:b w:val="0"/>
+          <w:i w:val="0"/>
+          <w:sz w:val="24"/>
+        </w:rPr>
+        <w:t>Nhấn Lưu. Thông báo xác nhận xuất hiện.</w:t>
+      </w:r>
+    </w:p>
+    <w:p>
+      <w:pPr>
+        <w:pStyle w:val="Heading3"/>
+      </w:pPr>
+      <w:r>
+        <w:rPr>
+          <w:rFonts w:ascii="Times New Roman" w:hAnsi="Times New Roman" w:cs="Times New Roman"/>
+          <w:b/>
+          <w:color w:val="1F7489"/>
+          <w:sz w:val="24"/>
+        </w:rPr>
+        <w:t>3.1.3. Sửa thông tin</w:t>
+      </w:r>
+    </w:p>
+    <w:p>
+      <w:pPr>
+        <w:pStyle w:val="ListNumber"/>
+        <w:spacing w:after="40"/>
+        <w:ind w:left="454"/>
+      </w:pPr>
+      <w:r>
+        <w:rPr>
+          <w:rFonts w:ascii="Times New Roman" w:hAnsi="Times New Roman" w:cs="Times New Roman"/>
+          <w:b w:val="0"/>
+          <w:i w:val="0"/>
+          <w:sz w:val="24"/>
+        </w:rPr>
+        <w:t>Nhấn nút icon Sửa (bút chì) ở cột Thao tác.</w:t>
+      </w:r>
+    </w:p>
+    <w:p>
+      <w:pPr>
+        <w:pStyle w:val="ListNumber"/>
+        <w:spacing w:after="40"/>
+        <w:ind w:left="454"/>
+      </w:pPr>
+      <w:r>
+        <w:rPr>
+          <w:rFonts w:ascii="Times New Roman" w:hAnsi="Times New Roman" w:cs="Times New Roman"/>
+          <w:b w:val="0"/>
+          <w:i w:val="0"/>
+          <w:sz w:val="24"/>
+        </w:rPr>
+        <w:t>Cập nhật thông tin trong form.</w:t>
+      </w:r>
+    </w:p>
+    <w:p>
+      <w:pPr>
+        <w:pStyle w:val="ListNumber"/>
+        <w:spacing w:after="40"/>
+        <w:ind w:left="454"/>
+      </w:pPr>
+      <w:r>
+        <w:rPr>
+          <w:rFonts w:ascii="Times New Roman" w:hAnsi="Times New Roman" w:cs="Times New Roman"/>
+          <w:b w:val="0"/>
+          <w:i w:val="0"/>
+          <w:sz w:val="24"/>
+        </w:rPr>
+        <w:t>Nhấn Lưu thay đổi.</w:t>
+      </w:r>
+    </w:p>
+    <w:p>
+      <w:pPr>
+        <w:pStyle w:val="Heading3"/>
+      </w:pPr>
+      <w:r>
+        <w:rPr>
+          <w:rFonts w:ascii="Times New Roman" w:hAnsi="Times New Roman" w:cs="Times New Roman"/>
+          <w:b/>
+          <w:color w:val="1F7489"/>
+          <w:sz w:val="24"/>
+        </w:rPr>
+        <w:t>3.1.4. Xoá giáo viên</w:t>
+      </w:r>
+    </w:p>
+    <w:p>
+      <w:pPr>
+        <w:pStyle w:val="ListNumber"/>
+        <w:spacing w:after="40"/>
+        <w:ind w:left="454"/>
+      </w:pPr>
+      <w:r>
+        <w:rPr>
+          <w:rFonts w:ascii="Times New Roman" w:hAnsi="Times New Roman" w:cs="Times New Roman"/>
+          <w:b w:val="0"/>
+          <w:i w:val="0"/>
+          <w:sz w:val="24"/>
+        </w:rPr>
+        <w:t>Nhấn nút icon Xoá (thùng rác) ở cột Thao tác.</w:t>
+      </w:r>
+    </w:p>
+    <w:p>
+      <w:pPr>
+        <w:pStyle w:val="ListNumber"/>
+        <w:spacing w:after="40"/>
+        <w:ind w:left="454"/>
+      </w:pPr>
+      <w:r>
+        <w:rPr>
+          <w:rFonts w:ascii="Times New Roman" w:hAnsi="Times New Roman" w:cs="Times New Roman"/>
+          <w:b w:val="0"/>
+          <w:i w:val="0"/>
+          <w:sz w:val="24"/>
+        </w:rPr>
+        <w:t>Xác nhận trong hộp thoại. Xoá GV sẽ xoá toàn bộ lớp học GV đó đã đăng ký.</w:t>
+      </w:r>
+    </w:p>
+    <w:p>
+      <w:pPr>
+        <w:pStyle w:val="Heading3"/>
+      </w:pPr>
+      <w:r>
+        <w:rPr>
+          <w:rFonts w:ascii="Times New Roman" w:hAnsi="Times New Roman" w:cs="Times New Roman"/>
+          <w:b/>
+          <w:color w:val="1F7489"/>
+          <w:sz w:val="24"/>
+        </w:rPr>
+        <w:t>3.1.5. Khôi phục mật khẩu</w:t>
+      </w:r>
+    </w:p>
+    <w:p>
+      <w:pPr>
+        <w:spacing w:after="60"/>
+      </w:pPr>
+      <w:r>
+        <w:rPr>
+          <w:rFonts w:ascii="Times New Roman" w:hAnsi="Times New Roman" w:cs="Times New Roman"/>
+          <w:b w:val="0"/>
+          <w:i w:val="0"/>
+          <w:sz w:val="24"/>
+        </w:rPr>
+        <w:t>Chỉ hiện với tài khoản đã kích hoạt:</w:t>
+      </w:r>
+    </w:p>
+    <w:p>
+      <w:pPr>
+        <w:pStyle w:val="ListNumber"/>
+        <w:spacing w:after="40"/>
+        <w:ind w:left="454"/>
+      </w:pPr>
+      <w:r>
+        <w:rPr>
+          <w:rFonts w:ascii="Times New Roman" w:hAnsi="Times New Roman" w:cs="Times New Roman"/>
+          <w:b w:val="0"/>
+          <w:i w:val="0"/>
+          <w:sz w:val="24"/>
+        </w:rPr>
+        <w:t>Nhấn nút icon chìa khoá (màu cam) ở cột Thao tác.</w:t>
+      </w:r>
+    </w:p>
+    <w:p>
+      <w:pPr>
+        <w:pStyle w:val="ListNumber"/>
+        <w:spacing w:after="40"/>
+        <w:ind w:left="454"/>
+      </w:pPr>
+      <w:r>
+        <w:rPr>
+          <w:rFonts w:ascii="Times New Roman" w:hAnsi="Times New Roman" w:cs="Times New Roman"/>
+          <w:b w:val="0"/>
+          <w:i w:val="0"/>
+          <w:sz w:val="24"/>
+        </w:rPr>
+        <w:t>Xác nhận trong hộp thoại.</w:t>
+      </w:r>
+    </w:p>
+    <w:p>
+      <w:pPr>
+        <w:pStyle w:val="ListNumber"/>
+        <w:spacing w:after="40"/>
+        <w:ind w:left="454"/>
+      </w:pPr>
+      <w:r>
+        <w:rPr>
+          <w:rFonts w:ascii="Times New Roman" w:hAnsi="Times New Roman" w:cs="Times New Roman"/>
+          <w:b w:val="0"/>
+          <w:i w:val="0"/>
+          <w:sz w:val="24"/>
+        </w:rPr>
+        <w:t>Hệ thống tạo mật khẩu tạm thời 12 ký tự ngẫu nhiên, hiển thị trong modal màu vàng.</w:t>
+      </w:r>
+    </w:p>
+    <w:p>
+      <w:pPr>
+        <w:pStyle w:val="ListNumber"/>
+        <w:spacing w:after="40"/>
+        <w:ind w:left="454"/>
+      </w:pPr>
+      <w:r>
+        <w:rPr>
+          <w:rFonts w:ascii="Times New Roman" w:hAnsi="Times New Roman" w:cs="Times New Roman"/>
+          <w:b w:val="0"/>
+          <w:i w:val="0"/>
+          <w:sz w:val="24"/>
+        </w:rPr>
+        <w:t>Sao chép mật khẩu (nút Copy) và cung cấp cho giáo viên.</w:t>
+      </w:r>
+    </w:p>
+    <w:p>
+      <w:pPr>
+        <w:pStyle w:val="ListNumber"/>
+        <w:spacing w:after="40"/>
+        <w:ind w:left="454"/>
+      </w:pPr>
+      <w:r>
+        <w:rPr>
+          <w:rFonts w:ascii="Times New Roman" w:hAnsi="Times New Roman" w:cs="Times New Roman"/>
+          <w:b w:val="0"/>
+          <w:i w:val="0"/>
+          <w:sz w:val="24"/>
+        </w:rPr>
+        <w:t>Giáo viên đăng nhập bằng MK tạm → hệ thống tự chuyển đến trang Đổi MK bắt buộc.</w:t>
+      </w:r>
+    </w:p>
+    <w:p>
+      <w:pPr>
+        <w:spacing w:before="80" w:after="0"/>
+        <w:ind w:left="227" w:right="227"/>
+        <w:shd w:val="clear" w:color="auto" w:fill="FCE4D6"/>
+      </w:pPr>
+      <w:r>
+        <w:rPr>
+          <w:rFonts w:ascii="Times New Roman" w:hAnsi="Times New Roman" w:cs="Times New Roman"/>
+          <w:b/>
+          <w:i w:val="0"/>
+          <w:color w:val="C05000"/>
+          <w:sz w:val="22"/>
+        </w:rPr>
+        <w:t xml:space="preserve">  Quan trọng</w:t>
+      </w:r>
+    </w:p>
+    <w:p>
+      <w:pPr>
+        <w:spacing w:before="0" w:after="120"/>
+        <w:ind w:left="227" w:right="227"/>
+        <w:shd w:val="clear" w:color="auto" w:fill="FCE4D6"/>
+      </w:pPr>
+      <w:r>
+        <w:rPr>
+          <w:rFonts w:ascii="Times New Roman" w:hAnsi="Times New Roman" w:cs="Times New Roman"/>
+          <w:b w:val="0"/>
+          <w:i/>
+          <w:sz w:val="22"/>
+        </w:rPr>
+        <w:t xml:space="preserve">  Mật khẩu tạm CHỈ hiển thị một lần. Sao chép ngay trước khi đóng modal.</w:t>
+      </w:r>
+    </w:p>
+    <w:p>
+      <w:pPr>
+        <w:pStyle w:val="Heading3"/>
+      </w:pPr>
+      <w:r>
+        <w:rPr>
+          <w:rFonts w:ascii="Times New Roman" w:hAnsi="Times New Roman" w:cs="Times New Roman"/>
+          <w:b/>
+          <w:color w:val="1F7489"/>
+          <w:sz w:val="24"/>
+        </w:rPr>
+        <w:t>3.1.6. Nhập danh sách từ Excel</w:t>
+      </w:r>
+    </w:p>
+    <w:p>
+      <w:pPr>
+        <w:pStyle w:val="ListNumber"/>
+        <w:spacing w:after="40"/>
+        <w:ind w:left="454"/>
+      </w:pPr>
+      <w:r>
+        <w:rPr>
+          <w:rFonts w:ascii="Times New Roman" w:hAnsi="Times New Roman" w:cs="Times New Roman"/>
+          <w:b w:val="0"/>
+          <w:i w:val="0"/>
+          <w:sz w:val="24"/>
+        </w:rPr>
+        <w:t>Nhấn nút Tải mẫu Excel để tải file mẫu về máy.</w:t>
+      </w:r>
+    </w:p>
+    <w:p>
+      <w:pPr>
+        <w:pStyle w:val="ListNumber"/>
+        <w:spacing w:after="40"/>
+        <w:ind w:left="454"/>
+      </w:pPr>
+      <w:r>
+        <w:rPr>
+          <w:rFonts w:ascii="Times New Roman" w:hAnsi="Times New Roman" w:cs="Times New Roman"/>
+          <w:b w:val="0"/>
+          <w:i w:val="0"/>
+          <w:sz w:val="24"/>
+        </w:rPr>
+        <w:t>Điền dữ liệu vào file mẫu (CCCD, Họ tên, Giới tính, Tổ bộ môn, Email, MK).</w:t>
+      </w:r>
+    </w:p>
+    <w:p>
+      <w:pPr>
+        <w:pStyle w:val="ListNumber"/>
+        <w:spacing w:after="40"/>
+        <w:ind w:left="454"/>
+      </w:pPr>
+      <w:r>
+        <w:rPr>
+          <w:rFonts w:ascii="Times New Roman" w:hAnsi="Times New Roman" w:cs="Times New Roman"/>
+          <w:b w:val="0"/>
+          <w:i w:val="0"/>
+          <w:sz w:val="24"/>
+        </w:rPr>
+        <w:t>Nhấn Nhập Excel, chọn file đã điền.</w:t>
+      </w:r>
+    </w:p>
+    <w:p>
+      <w:pPr>
+        <w:pStyle w:val="ListNumber"/>
+        <w:spacing w:after="40"/>
+        <w:ind w:left="454"/>
+      </w:pPr>
+      <w:r>
+        <w:rPr>
+          <w:rFonts w:ascii="Times New Roman" w:hAnsi="Times New Roman" w:cs="Times New Roman"/>
+          <w:b w:val="0"/>
+          <w:i w:val="0"/>
+          <w:sz w:val="24"/>
+        </w:rPr>
+        <w:t>Hệ thống xử lý và hiển thị báo cáo: số bản ghi thành công / lỗi và lý do.</w:t>
+      </w:r>
+    </w:p>
+    <w:p>
+      <w:pPr>
+        <w:pStyle w:val="Heading2"/>
+      </w:pPr>
+      <w:r>
+        <w:rPr>
+          <w:rFonts w:ascii="Times New Roman" w:hAnsi="Times New Roman" w:cs="Times New Roman"/>
+          <w:b/>
+          <w:color w:val="0E74B5"/>
+          <w:sz w:val="24"/>
+        </w:rPr>
+        <w:t>3.2. Quản lý Học sinh</w:t>
+      </w:r>
+    </w:p>
+    <w:p>
+      <w:pPr>
+        <w:spacing w:after="60"/>
+      </w:pPr>
+      <w:r>
+        <w:rPr>
+          <w:rFonts w:ascii="Times New Roman" w:hAnsi="Times New Roman" w:cs="Times New Roman"/>
+          <w:b w:val="0"/>
+          <w:i w:val="0"/>
+          <w:sz w:val="24"/>
+        </w:rPr>
+        <w:t>Thao tác tương tự Quản lý Giáo viên. Bảng gồm: STT, CCCD, Họ tên, Khối, Lớp, Email, Trạng thái TK, Thao tác.</w:t>
+      </w:r>
+    </w:p>
+    <w:p>
+      <w:pPr>
+        <w:spacing w:after="60"/>
+      </w:pPr>
+      <w:r>
+        <w:rPr>
+          <w:rFonts w:ascii="Times New Roman" w:hAnsi="Times New Roman" w:cs="Times New Roman"/>
+          <w:b w:val="0"/>
+          <w:i w:val="0"/>
+          <w:sz w:val="24"/>
+        </w:rPr>
+        <w:t>File Excel mẫu gồm các cột: CCCD, Họ tên, Khối (10/11/12), Lớp, Email, Mật khẩu.</w:t>
+      </w:r>
+    </w:p>
+    <w:p>
+      <w:r>
+        <w:br w:type="page"/>
+      </w:r>
+    </w:p>
+    <w:p>
+      <w:pPr>
+        <w:pStyle w:val="Heading2"/>
+      </w:pPr>
+      <w:r>
+        <w:rPr>
+          <w:rFonts w:ascii="Times New Roman" w:hAnsi="Times New Roman" w:cs="Times New Roman"/>
+          <w:b/>
+          <w:color w:val="0E74B5"/>
+          <w:sz w:val="24"/>
+        </w:rPr>
+        <w:t>3.3. Quản lý Đăng ký Mở lớp — Giai đoạn 1 (/admin/class-reg)</w:t>
+      </w:r>
+    </w:p>
+    <w:p>
+      <w:pPr>
+        <w:pStyle w:val="Heading3"/>
+      </w:pPr>
+      <w:r>
+        <w:rPr>
+          <w:rFonts w:ascii="Times New Roman" w:hAnsi="Times New Roman" w:cs="Times New Roman"/>
+          <w:b/>
+          <w:color w:val="1F7489"/>
+          <w:sz w:val="24"/>
+        </w:rPr>
+        <w:t>3.3.1. Mở và đóng Giai đoạn 1</w:t>
+      </w:r>
+    </w:p>
+    <w:p>
+      <w:pPr>
+        <w:pStyle w:val="ListNumber"/>
+        <w:spacing w:after="40"/>
+        <w:ind w:left="454"/>
+      </w:pPr>
+      <w:r>
+        <w:rPr>
+          <w:rFonts w:ascii="Times New Roman" w:hAnsi="Times New Roman" w:cs="Times New Roman"/>
+          <w:b w:val="0"/>
+          <w:i w:val="0"/>
+          <w:sz w:val="24"/>
+        </w:rPr>
+        <w:t>Vào Admin → Quản lý đăng ký mở lớp (hoặc URL /admin/class-reg).</w:t>
+      </w:r>
+    </w:p>
+    <w:p>
+      <w:pPr>
+        <w:pStyle w:val="ListNumber"/>
+        <w:spacing w:after="40"/>
+        <w:ind w:left="454"/>
+      </w:pPr>
+      <w:r>
+        <w:rPr>
+          <w:rFonts w:ascii="Times New Roman" w:hAnsi="Times New Roman" w:cs="Times New Roman"/>
+          <w:b w:val="0"/>
+          <w:i w:val="0"/>
+          <w:sz w:val="24"/>
+        </w:rPr>
+        <w:t>Nhấn Mở đăng ký GV để giáo viên bắt đầu đăng ký lịch.</w:t>
+      </w:r>
+    </w:p>
+    <w:p>
+      <w:pPr>
+        <w:pStyle w:val="ListNumber"/>
+        <w:spacing w:after="40"/>
+        <w:ind w:left="454"/>
+      </w:pPr>
+      <w:r>
+        <w:rPr>
+          <w:rFonts w:ascii="Times New Roman" w:hAnsi="Times New Roman" w:cs="Times New Roman"/>
+          <w:b w:val="0"/>
+          <w:i w:val="0"/>
+          <w:sz w:val="24"/>
+        </w:rPr>
+        <w:t>Sau khi thu thập đủ đăng ký, nhấn Đóng đăng ký GV.</w:t>
+      </w:r>
     </w:p>
     <w:p>
       <w:pPr>
@@ -1360,12 +2204,12 @@
           <w:color w:val="BF8F00"/>
           <w:sz w:val="22"/>
         </w:rPr>
-        <w:t xml:space="preserve">  Lưu ý Giai đoạn 1</w:t>
+        <w:t xml:space="preserve">  Lưu ý</w:t>
       </w:r>
     </w:p>
     <w:p>
       <w:pPr>
-        <w:spacing w:before="0" w:after="100"/>
+        <w:spacing w:before="0" w:after="120"/>
         <w:ind w:left="227" w:right="227"/>
         <w:shd w:val="clear" w:color="auto" w:fill="FFF2CC"/>
       </w:pPr>
@@ -1376,7 +2220,147 @@
           <w:i/>
           <w:sz w:val="22"/>
         </w:rPr>
-        <w:t xml:space="preserve">  Lớp có viền đỏ = chưa có phòng hoặc sĩ số tối đa → cần bổ sung trước khi mở Giai đoạn 2. Phòng &amp; sĩ số lưu tự động khi nhấn Enter hoặc click ra ngoài ô.</w:t>
+        <w:t xml:space="preserve">  Sau khi đóng, giáo viên không thể thêm hoặc xoá lớp.</w:t>
+      </w:r>
+    </w:p>
+    <w:p>
+      <w:pPr>
+        <w:pStyle w:val="Heading3"/>
+      </w:pPr>
+      <w:r>
+        <w:rPr>
+          <w:rFonts w:ascii="Times New Roman" w:hAnsi="Times New Roman" w:cs="Times New Roman"/>
+          <w:b/>
+          <w:color w:val="1F7489"/>
+          <w:sz w:val="24"/>
+        </w:rPr>
+        <w:t>3.3.2. Điền phòng học và sĩ số tối đa</w:t>
+      </w:r>
+    </w:p>
+    <w:p>
+      <w:pPr>
+        <w:pStyle w:val="ListNumber"/>
+        <w:spacing w:after="40"/>
+        <w:ind w:left="454"/>
+      </w:pPr>
+      <w:r>
+        <w:rPr>
+          <w:rFonts w:ascii="Times New Roman" w:hAnsi="Times New Roman" w:cs="Times New Roman"/>
+          <w:b w:val="0"/>
+          <w:i w:val="0"/>
+          <w:sz w:val="24"/>
+        </w:rPr>
+        <w:t>Nhấn vào tên giáo viên để xem danh sách lớp đã đăng ký.</w:t>
+      </w:r>
+    </w:p>
+    <w:p>
+      <w:pPr>
+        <w:pStyle w:val="ListNumber"/>
+        <w:spacing w:after="40"/>
+        <w:ind w:left="454"/>
+      </w:pPr>
+      <w:r>
+        <w:rPr>
+          <w:rFonts w:ascii="Times New Roman" w:hAnsi="Times New Roman" w:cs="Times New Roman"/>
+          <w:b w:val="0"/>
+          <w:i w:val="0"/>
+          <w:sz w:val="24"/>
+        </w:rPr>
+        <w:t>Tại cột Địa điểm, nhập tên phòng học (ví dụ: A201) rồi nhấn Enter hoặc click ra ngoài.</w:t>
+      </w:r>
+    </w:p>
+    <w:p>
+      <w:pPr>
+        <w:pStyle w:val="ListNumber"/>
+        <w:spacing w:after="40"/>
+        <w:ind w:left="454"/>
+      </w:pPr>
+      <w:r>
+        <w:rPr>
+          <w:rFonts w:ascii="Times New Roman" w:hAnsi="Times New Roman" w:cs="Times New Roman"/>
+          <w:b w:val="0"/>
+          <w:i w:val="0"/>
+          <w:sz w:val="24"/>
+        </w:rPr>
+        <w:t>Tại cột Sĩ số, nhập số học sinh tối đa rồi nhấn Enter hoặc click ra ngoài.</w:t>
+      </w:r>
+    </w:p>
+    <w:p>
+      <w:pPr>
+        <w:pStyle w:val="ListNumber"/>
+        <w:spacing w:after="40"/>
+        <w:ind w:left="454"/>
+      </w:pPr>
+      <w:r>
+        <w:rPr>
+          <w:rFonts w:ascii="Times New Roman" w:hAnsi="Times New Roman" w:cs="Times New Roman"/>
+          <w:b w:val="0"/>
+          <w:i w:val="0"/>
+          <w:sz w:val="24"/>
+        </w:rPr>
+        <w:t>Dữ liệu lưu tự động — ô chuyển màu xanh nhạt khi lưu thành công.</w:t>
+      </w:r>
+    </w:p>
+    <w:p>
+      <w:pPr>
+        <w:pStyle w:val="ListNumber"/>
+        <w:spacing w:after="40"/>
+        <w:ind w:left="454"/>
+      </w:pPr>
+      <w:r>
+        <w:rPr>
+          <w:rFonts w:ascii="Times New Roman" w:hAnsi="Times New Roman" w:cs="Times New Roman"/>
+          <w:b w:val="0"/>
+          <w:i w:val="0"/>
+          <w:sz w:val="24"/>
+        </w:rPr>
+        <w:t>Lớp có viền đỏ = còn thiếu thông tin → cần bổ sung trước khi mở Giai đoạn 2.</w:t>
+      </w:r>
+    </w:p>
+    <w:p>
+      <w:pPr>
+        <w:pStyle w:val="Heading3"/>
+      </w:pPr>
+      <w:r>
+        <w:rPr>
+          <w:rFonts w:ascii="Times New Roman" w:hAnsi="Times New Roman" w:cs="Times New Roman"/>
+          <w:b/>
+          <w:color w:val="1F7489"/>
+          <w:sz w:val="24"/>
+        </w:rPr>
+        <w:t>3.3.3. Xuất / Upload file phân phòng</w:t>
+      </w:r>
+    </w:p>
+    <w:p>
+      <w:pPr>
+        <w:pStyle w:val="ListBullet"/>
+        <w:spacing w:after="40"/>
+        <w:ind w:left="454"/>
+      </w:pPr>
+      <w:r>
+        <w:rPr>
+          <w:rFonts w:ascii="Times New Roman" w:hAnsi="Times New Roman" w:cs="Times New Roman"/>
+          <w:b w:val="0"/>
+          <w:i w:val="0"/>
+          <w:sz w:val="24"/>
+        </w:rPr>
+        <w:t>Xuất Excel: nhấn Tải Excel phân phòng → file .xlsx tải về máy chứa toàn bộ thông tin lớp.</w:t>
+      </w:r>
+    </w:p>
+    <w:p>
+      <w:pPr>
+        <w:pStyle w:val="ListBullet"/>
+        <w:spacing w:after="40"/>
+        <w:ind w:left="454"/>
+      </w:pPr>
+      <w:r>
+        <w:rPr>
+          <w:rFonts w:ascii="Times New Roman" w:hAnsi="Times New Roman" w:cs="Times New Roman"/>
+          <w:b w:val="0"/>
+          <w:i w:val="0"/>
+          <w:sz w:val="24"/>
+        </w:rPr>
+        <w:t>Upload: điền phòng/sĩ số vào file Excel → nhấn Upload phân phòng → hệ thống cập nhật hàng loạt.</w:t>
       </w:r>
     </w:p>
     <w:p>
@@ -1390,12 +2374,28 @@
           <w:color w:val="0E74B5"/>
           <w:sz w:val="24"/>
         </w:rPr>
-        <w:t>3.3. Quản lý Đăng ký Môn học (/admin/enrollment)</w:t>
+        <w:t>3.4. Quản lý Đăng ký Môn học — Giai đoạn 2 (/admin/enrollment)</w:t>
       </w:r>
     </w:p>
     <w:p>
       <w:pPr>
-        <w:spacing w:after="60"/>
+        <w:pStyle w:val="Heading3"/>
+      </w:pPr>
+      <w:r>
+        <w:rPr>
+          <w:rFonts w:ascii="Times New Roman" w:hAnsi="Times New Roman" w:cs="Times New Roman"/>
+          <w:b/>
+          <w:color w:val="1F7489"/>
+          <w:sz w:val="24"/>
+        </w:rPr>
+        <w:t>3.4.1. Mở và đóng Giai đoạn 2</w:t>
+      </w:r>
+    </w:p>
+    <w:p>
+      <w:pPr>
+        <w:pStyle w:val="ListNumber"/>
+        <w:spacing w:after="40"/>
+        <w:ind w:left="454"/>
       </w:pPr>
       <w:r>
         <w:rPr>
@@ -1404,12 +2404,14 @@
           <w:i w:val="0"/>
           <w:sz w:val="24"/>
         </w:rPr>
-        <w:t>Bảng hiển thị tất cả lớp đã publish: ID, GV, Môn, Khối, Thời gian (Thứ X – Sáng/Chiều – Tiết X–Y), Địa điểm, Sĩ số (cập nhật mỗi 5 giây).</w:t>
+        <w:t>Kiểm tra: tất cả lớp phải có Địa điểm và Sĩ số tối đa (không còn viền đỏ).</w:t>
       </w:r>
     </w:p>
     <w:p>
       <w:pPr>
-        <w:spacing w:after="60"/>
+        <w:pStyle w:val="ListNumber"/>
+        <w:spacing w:after="40"/>
+        <w:ind w:left="454"/>
       </w:pPr>
       <w:r>
         <w:rPr>
@@ -1418,12 +2420,14 @@
           <w:i w:val="0"/>
           <w:sz w:val="24"/>
         </w:rPr>
-        <w:t>Nhấn Xem HS → modal danh sách học sinh đã đăng ký (STT, Họ tên, CCCD, Khối, Lớp).</w:t>
+        <w:t>Nhấn Mở đăng ký HS để học sinh bắt đầu đăng ký.</w:t>
       </w:r>
     </w:p>
     <w:p>
       <w:pPr>
-        <w:spacing w:after="60"/>
+        <w:pStyle w:val="ListNumber"/>
+        <w:spacing w:after="40"/>
+        <w:ind w:left="454"/>
       </w:pPr>
       <w:r>
         <w:rPr>
@@ -1432,7 +2436,146 @@
           <w:i w:val="0"/>
           <w:sz w:val="24"/>
         </w:rPr>
-        <w:t>Thanh công cụ phía trên bảng: Thêm lớp thủ công · Xuất Excel · Upload phân phòng.</w:t>
+        <w:t>Sau thời hạn, nhấn Đóng đăng ký HS.</w:t>
+      </w:r>
+    </w:p>
+    <w:p>
+      <w:pPr>
+        <w:spacing w:before="80" w:after="0"/>
+        <w:ind w:left="227" w:right="227"/>
+        <w:shd w:val="clear" w:color="auto" w:fill="FCE4D6"/>
+      </w:pPr>
+      <w:r>
+        <w:rPr>
+          <w:rFonts w:ascii="Times New Roman" w:hAnsi="Times New Roman" w:cs="Times New Roman"/>
+          <w:b/>
+          <w:i w:val="0"/>
+          <w:color w:val="C05000"/>
+          <w:sz w:val="22"/>
+        </w:rPr>
+        <w:t xml:space="preserve">  Lưu ý quan trọng</w:t>
+      </w:r>
+    </w:p>
+    <w:p>
+      <w:pPr>
+        <w:spacing w:before="0" w:after="120"/>
+        <w:ind w:left="227" w:right="227"/>
+        <w:shd w:val="clear" w:color="auto" w:fill="FCE4D6"/>
+      </w:pPr>
+      <w:r>
+        <w:rPr>
+          <w:rFonts w:ascii="Times New Roman" w:hAnsi="Times New Roman" w:cs="Times New Roman"/>
+          <w:b w:val="0"/>
+          <w:i/>
+          <w:sz w:val="22"/>
+        </w:rPr>
+        <w:t xml:space="preserve">  Khi Giai đoạn 2 mở, học sinh có thể đăng ký VÀ huỷ. Sau khi đóng, không ai thay đổi được.</w:t>
+      </w:r>
+    </w:p>
+    <w:p>
+      <w:pPr>
+        <w:pStyle w:val="Heading3"/>
+      </w:pPr>
+      <w:r>
+        <w:rPr>
+          <w:rFonts w:ascii="Times New Roman" w:hAnsi="Times New Roman" w:cs="Times New Roman"/>
+          <w:b/>
+          <w:color w:val="1F7489"/>
+          <w:sz w:val="24"/>
+        </w:rPr>
+        <w:t>3.4.2. Xem danh sách học sinh theo lớp</w:t>
+      </w:r>
+    </w:p>
+    <w:p>
+      <w:pPr>
+        <w:spacing w:after="60"/>
+      </w:pPr>
+      <w:r>
+        <w:rPr>
+          <w:rFonts w:ascii="Times New Roman" w:hAnsi="Times New Roman" w:cs="Times New Roman"/>
+          <w:b w:val="0"/>
+          <w:i w:val="0"/>
+          <w:sz w:val="24"/>
+        </w:rPr>
+        <w:t>Bảng hiển thị: ID lớp, Giáo viên, Môn/Tổ, Khối, Thời gian (Thứ X – Sáng/Chiều – Tiết X–Y), Địa điểm, Sĩ số (cập nhật tự động mỗi 5 giây).</w:t>
+      </w:r>
+    </w:p>
+    <w:p>
+      <w:pPr>
+        <w:pStyle w:val="ListNumber"/>
+        <w:spacing w:after="40"/>
+        <w:ind w:left="454"/>
+      </w:pPr>
+      <w:r>
+        <w:rPr>
+          <w:rFonts w:ascii="Times New Roman" w:hAnsi="Times New Roman" w:cs="Times New Roman"/>
+          <w:b w:val="0"/>
+          <w:i w:val="0"/>
+          <w:sz w:val="24"/>
+        </w:rPr>
+        <w:t>Nhấn nút Xem HS ở cột Thao tác.</w:t>
+      </w:r>
+    </w:p>
+    <w:p>
+      <w:pPr>
+        <w:pStyle w:val="ListNumber"/>
+        <w:spacing w:after="40"/>
+        <w:ind w:left="454"/>
+      </w:pPr>
+      <w:r>
+        <w:rPr>
+          <w:rFonts w:ascii="Times New Roman" w:hAnsi="Times New Roman" w:cs="Times New Roman"/>
+          <w:b w:val="0"/>
+          <w:i w:val="0"/>
+          <w:sz w:val="24"/>
+        </w:rPr>
+        <w:t>Modal hiển thị danh sách HS đã đăng ký: STT, Họ tên, CCCD, Khối, Lớp.</w:t>
+      </w:r>
+    </w:p>
+    <w:p>
+      <w:pPr>
+        <w:pStyle w:val="Heading3"/>
+      </w:pPr>
+      <w:r>
+        <w:rPr>
+          <w:rFonts w:ascii="Times New Roman" w:hAnsi="Times New Roman" w:cs="Times New Roman"/>
+          <w:b/>
+          <w:color w:val="1F7489"/>
+          <w:sz w:val="24"/>
+        </w:rPr>
+        <w:t>3.4.3. Xuất kết quả đăng ký</w:t>
+      </w:r>
+    </w:p>
+    <w:p>
+      <w:pPr>
+        <w:pStyle w:val="ListNumber"/>
+        <w:spacing w:after="40"/>
+        <w:ind w:left="454"/>
+      </w:pPr>
+      <w:r>
+        <w:rPr>
+          <w:rFonts w:ascii="Times New Roman" w:hAnsi="Times New Roman" w:cs="Times New Roman"/>
+          <w:b w:val="0"/>
+          <w:i w:val="0"/>
+          <w:sz w:val="24"/>
+        </w:rPr>
+        <w:t>Nhấn Xuất Excel ở thanh công cụ phía trên bảng.</w:t>
+      </w:r>
+    </w:p>
+    <w:p>
+      <w:pPr>
+        <w:pStyle w:val="ListNumber"/>
+        <w:spacing w:after="40"/>
+        <w:ind w:left="454"/>
+      </w:pPr>
+      <w:r>
+        <w:rPr>
+          <w:rFonts w:ascii="Times New Roman" w:hAnsi="Times New Roman" w:cs="Times New Roman"/>
+          <w:b w:val="0"/>
+          <w:i w:val="0"/>
+          <w:sz w:val="24"/>
+        </w:rPr>
+        <w:t>File .xlsx tải về chứa danh sách từng lớp và HS đã đăng ký.</w:t>
       </w:r>
     </w:p>
     <w:p>
@@ -1451,7 +2594,21 @@
           <w:color w:val="1F497D"/>
           <w:sz w:val="28"/>
         </w:rPr>
-        <w:t>4. GIÁO VIÊN (/teacher/schedule)</w:t>
+        <w:t>4. HƯỚNG DẪN GIÁO VIÊN (/teacher/schedule)</w:t>
+      </w:r>
+    </w:p>
+    <w:p>
+      <w:pPr>
+        <w:spacing w:after="60"/>
+      </w:pPr>
+      <w:r>
+        <w:rPr>
+          <w:rFonts w:ascii="Times New Roman" w:hAnsi="Times New Roman" w:cs="Times New Roman"/>
+          <w:b w:val="0"/>
+          <w:i w:val="0"/>
+          <w:sz w:val="24"/>
+        </w:rPr>
+        <w:t>Sau khi đăng nhập, giáo viên thấy bảng thời khoá biểu dạng lưới (Thứ 2–7, Buổi Sáng/Chiều, Tiết 1–4). Ô trống = chưa có lớp; ô tô màu = đã đăng ký lớp.</w:t>
       </w:r>
     </w:p>
     <w:tbl>
@@ -1483,7 +2640,7 @@
                 <w:color w:val="FFFFFF"/>
                 <w:sz w:val="22"/>
               </w:rPr>
-              <w:t>Trạng thái</w:t>
+              <w:t>Trạng thái hệ thống</w:t>
             </w:r>
           </w:p>
         </w:tc>
@@ -1538,7 +2695,7 @@
                 <w:i w:val="0"/>
                 <w:sz w:val="22"/>
               </w:rPr>
-              <w:t>Click ô lịch trống → chọn Khối &amp; số tiết → đăng ký lớp. Hover ô đã có → nút X để xoá.</w:t>
+              <w:t>Click ô lịch trống để đăng ký lớp. Hover ô đã có → nút X để xoá.</w:t>
             </w:r>
           </w:p>
         </w:tc>
@@ -1574,7 +2731,7 @@
                 <w:i w:val="0"/>
                 <w:sz w:val="22"/>
               </w:rPr>
-              <w:t>Chỉ xem thời khoá biểu, không thể thêm/xoá lớp.</w:t>
+              <w:t>Chỉ xem thời khoá biểu — không thể thêm hoặc xoá lớp.</w:t>
             </w:r>
           </w:p>
         </w:tc>
@@ -1608,7 +2765,7 @@
                 <w:i w:val="0"/>
                 <w:sz w:val="22"/>
               </w:rPr>
-              <w:t>Xem TKB; badge số HS/phòng cập nhật trực tiếp mỗi 5 giây.</w:t>
+              <w:t>Xem TKB; badge số HS và phòng học cập nhật trực tiếp mỗi 5 giây.</w:t>
             </w:r>
           </w:p>
         </w:tc>
@@ -1657,26 +2814,40 @@
     </w:p>
     <w:p>
       <w:pPr>
+        <w:pStyle w:val="Heading2"/>
+      </w:pPr>
+      <w:r>
+        <w:rPr>
+          <w:rFonts w:ascii="Times New Roman" w:hAnsi="Times New Roman" w:cs="Times New Roman"/>
+          <w:b/>
+          <w:color w:val="0E74B5"/>
+          <w:sz w:val="24"/>
+        </w:rPr>
+        <w:t>4.1. Đăng ký mở lớp</w:t>
+      </w:r>
+    </w:p>
+    <w:p>
+      <w:pPr>
         <w:spacing w:before="80" w:after="0"/>
         <w:ind w:left="227" w:right="227"/>
-        <w:shd w:val="clear" w:color="auto" w:fill="FFF2CC"/>
+        <w:shd w:val="clear" w:color="auto" w:fill="DEEAF1"/>
       </w:pPr>
       <w:r>
         <w:rPr>
           <w:rFonts w:ascii="Times New Roman" w:hAnsi="Times New Roman" w:cs="Times New Roman"/>
           <w:b/>
           <w:i w:val="0"/>
-          <w:color w:val="BF8F00"/>
+          <w:color w:val="1F497D"/>
           <w:sz w:val="22"/>
         </w:rPr>
-        <w:t xml:space="preserve">  Lưu ý</w:t>
+        <w:t xml:space="preserve">  Điều kiện</w:t>
       </w:r>
     </w:p>
     <w:p>
       <w:pPr>
-        <w:spacing w:before="0" w:after="100"/>
+        <w:spacing w:before="0" w:after="120"/>
         <w:ind w:left="227" w:right="227"/>
-        <w:shd w:val="clear" w:color="auto" w:fill="FFF2CC"/>
+        <w:shd w:val="clear" w:color="auto" w:fill="DEEAF1"/>
       </w:pPr>
       <w:r>
         <w:rPr>
@@ -1685,7 +2856,155 @@
           <w:i/>
           <w:sz w:val="22"/>
         </w:rPr>
-        <w:t xml:space="preserve">  Một ô lịch chỉ có thể đăng ký một lớp. Xoá lớp sẽ xoá toàn bộ đăng ký HS trong lớp đó.</w:t>
+        <w:t xml:space="preserve">  Chỉ thực hiện được khi Giai đoạn 1 đang MỞ.</w:t>
+      </w:r>
+    </w:p>
+    <w:p>
+      <w:pPr>
+        <w:pStyle w:val="ListNumber"/>
+        <w:spacing w:after="40"/>
+        <w:ind w:left="454"/>
+      </w:pPr>
+      <w:r>
+        <w:rPr>
+          <w:rFonts w:ascii="Times New Roman" w:hAnsi="Times New Roman" w:cs="Times New Roman"/>
+          <w:b w:val="0"/>
+          <w:i w:val="0"/>
+          <w:sz w:val="24"/>
+        </w:rPr>
+        <w:t>Click vào ô lịch trống tương ứng (thứ, buổi, tiết muốn dạy).</w:t>
+      </w:r>
+    </w:p>
+    <w:p>
+      <w:pPr>
+        <w:pStyle w:val="ListNumber"/>
+        <w:spacing w:after="40"/>
+        <w:ind w:left="454"/>
+      </w:pPr>
+      <w:r>
+        <w:rPr>
+          <w:rFonts w:ascii="Times New Roman" w:hAnsi="Times New Roman" w:cs="Times New Roman"/>
+          <w:b w:val="0"/>
+          <w:i w:val="0"/>
+          <w:sz w:val="24"/>
+        </w:rPr>
+        <w:t>Modal đăng ký hiện ra. Chọn Khối (10 / 11 / 12) và nhập Số tiết.</w:t>
+      </w:r>
+    </w:p>
+    <w:p>
+      <w:pPr>
+        <w:pStyle w:val="ListNumber"/>
+        <w:spacing w:after="40"/>
+        <w:ind w:left="454"/>
+      </w:pPr>
+      <w:r>
+        <w:rPr>
+          <w:rFonts w:ascii="Times New Roman" w:hAnsi="Times New Roman" w:cs="Times New Roman"/>
+          <w:b w:val="0"/>
+          <w:i w:val="0"/>
+          <w:sz w:val="24"/>
+        </w:rPr>
+        <w:t>Nhấn Xác nhận. Ô lịch chuyển màu và hiển thị thông tin lớp vừa đăng ký.</w:t>
+      </w:r>
+    </w:p>
+    <w:p>
+      <w:pPr>
+        <w:pStyle w:val="Heading2"/>
+      </w:pPr>
+      <w:r>
+        <w:rPr>
+          <w:rFonts w:ascii="Times New Roman" w:hAnsi="Times New Roman" w:cs="Times New Roman"/>
+          <w:b/>
+          <w:color w:val="0E74B5"/>
+          <w:sz w:val="24"/>
+        </w:rPr>
+        <w:t>4.2. Xoá lớp đã đăng ký</w:t>
+      </w:r>
+    </w:p>
+    <w:p>
+      <w:pPr>
+        <w:spacing w:before="80" w:after="0"/>
+        <w:ind w:left="227" w:right="227"/>
+        <w:shd w:val="clear" w:color="auto" w:fill="DEEAF1"/>
+      </w:pPr>
+      <w:r>
+        <w:rPr>
+          <w:rFonts w:ascii="Times New Roman" w:hAnsi="Times New Roman" w:cs="Times New Roman"/>
+          <w:b/>
+          <w:i w:val="0"/>
+          <w:color w:val="1F497D"/>
+          <w:sz w:val="22"/>
+        </w:rPr>
+        <w:t xml:space="preserve">  Điều kiện</w:t>
+      </w:r>
+    </w:p>
+    <w:p>
+      <w:pPr>
+        <w:spacing w:before="0" w:after="120"/>
+        <w:ind w:left="227" w:right="227"/>
+        <w:shd w:val="clear" w:color="auto" w:fill="DEEAF1"/>
+      </w:pPr>
+      <w:r>
+        <w:rPr>
+          <w:rFonts w:ascii="Times New Roman" w:hAnsi="Times New Roman" w:cs="Times New Roman"/>
+          <w:b w:val="0"/>
+          <w:i/>
+          <w:sz w:val="22"/>
+        </w:rPr>
+        <w:t xml:space="preserve">  Chỉ thực hiện được khi Giai đoạn 1 đang MỞ.</w:t>
+      </w:r>
+    </w:p>
+    <w:p>
+      <w:pPr>
+        <w:pStyle w:val="ListNumber"/>
+        <w:spacing w:after="40"/>
+        <w:ind w:left="454"/>
+      </w:pPr>
+      <w:r>
+        <w:rPr>
+          <w:rFonts w:ascii="Times New Roman" w:hAnsi="Times New Roman" w:cs="Times New Roman"/>
+          <w:b w:val="0"/>
+          <w:i w:val="0"/>
+          <w:sz w:val="24"/>
+        </w:rPr>
+        <w:t>Di chuột (hover) vào ô lịch đã có lớp.</w:t>
+      </w:r>
+    </w:p>
+    <w:p>
+      <w:pPr>
+        <w:pStyle w:val="ListNumber"/>
+        <w:spacing w:after="40"/>
+        <w:ind w:left="454"/>
+      </w:pPr>
+      <w:r>
+        <w:rPr>
+          <w:rFonts w:ascii="Times New Roman" w:hAnsi="Times New Roman" w:cs="Times New Roman"/>
+          <w:b w:val="0"/>
+          <w:i w:val="0"/>
+          <w:sz w:val="24"/>
+        </w:rPr>
+        <w:t>Nhấn nút X màu đỏ xuất hiện ở góc trên phải của ô.</w:t>
+      </w:r>
+    </w:p>
+    <w:p>
+      <w:pPr>
+        <w:pStyle w:val="ListNumber"/>
+        <w:spacing w:after="40"/>
+        <w:ind w:left="454"/>
+      </w:pPr>
+      <w:r>
+        <w:rPr>
+          <w:rFonts w:ascii="Times New Roman" w:hAnsi="Times New Roman" w:cs="Times New Roman"/>
+          <w:b w:val="0"/>
+          <w:i w:val="0"/>
+          <w:sz w:val="24"/>
+        </w:rPr>
+        <w:t>Xác nhận trong hộp thoại. Ô trở về trạng thái trống.</w:t>
+      </w:r>
+    </w:p>
+    <w:p>
+      <w:r>
+        <w:br w:type="page"/>
       </w:r>
     </w:p>
     <w:p>
@@ -1699,7 +3018,21 @@
           <w:color w:val="1F497D"/>
           <w:sz w:val="28"/>
         </w:rPr>
-        <w:t>5. HỌC SINH (/student/schedule)</w:t>
+        <w:t>5. HƯỚNG DẪN HỌC SINH (/student/schedule)</w:t>
+      </w:r>
+    </w:p>
+    <w:p>
+      <w:pPr>
+        <w:spacing w:after="60"/>
+      </w:pPr>
+      <w:r>
+        <w:rPr>
+          <w:rFonts w:ascii="Times New Roman" w:hAnsi="Times New Roman" w:cs="Times New Roman"/>
+          <w:b w:val="0"/>
+          <w:i w:val="0"/>
+          <w:sz w:val="24"/>
+        </w:rPr>
+        <w:t>Giao diện học sinh gồm hai tab: Thời khoá biểu (chỉ đọc) và Đăng ký môn học.</w:t>
       </w:r>
     </w:p>
     <w:tbl>
@@ -1731,7 +3064,7 @@
                 <w:color w:val="FFFFFF"/>
                 <w:sz w:val="22"/>
               </w:rPr>
-              <w:t>Trạng thái</w:t>
+              <w:t>Trạng thái hệ thống</w:t>
             </w:r>
           </w:p>
         </w:tc>
@@ -1822,7 +3155,7 @@
                 <w:i w:val="0"/>
                 <w:sz w:val="22"/>
               </w:rPr>
-              <w:t>Đăng ký và huỷ môn học. Badge sĩ số cập nhật tự động. Hệ thống kiểm tra trùng lịch.</w:t>
+              <w:t>Đăng ký và huỷ môn học. Badge sĩ số cập nhật tự động mỗi 5 giây.</w:t>
             </w:r>
           </w:p>
         </w:tc>
@@ -1869,40 +3202,190 @@
     </w:p>
     <w:p>
       <w:pPr>
+        <w:pStyle w:val="Heading2"/>
+      </w:pPr>
+      <w:r>
+        <w:rPr>
+          <w:rFonts w:ascii="Times New Roman" w:hAnsi="Times New Roman" w:cs="Times New Roman"/>
+          <w:b/>
+          <w:color w:val="0E74B5"/>
+          <w:sz w:val="24"/>
+        </w:rPr>
+        <w:t>5.1. Tab Thời khoá biểu</w:t>
+      </w:r>
+    </w:p>
+    <w:p>
+      <w:pPr>
         <w:spacing w:after="60"/>
       </w:pPr>
       <w:r>
         <w:rPr>
           <w:rFonts w:ascii="Times New Roman" w:hAnsi="Times New Roman" w:cs="Times New Roman"/>
           <w:b w:val="0"/>
-          <w:i/>
+          <w:i w:val="0"/>
           <w:sz w:val="24"/>
         </w:rPr>
-        <w:t>Badge sĩ số: Xanh = còn chỗ · Vàng = gần đầy (≥ 2/3) · Xám = đã đầy (không đăng ký được).</w:t>
+        <w:t>Hiển thị lịch tuần cá nhân của học sinh (chỉ đọc). Ô lịch tô màu = đã đăng ký môn học đó, kèm tên môn, GV, phòng học.</w:t>
       </w:r>
     </w:p>
     <w:p>
       <w:pPr>
+        <w:pStyle w:val="Heading2"/>
+      </w:pPr>
+      <w:r>
+        <w:rPr>
+          <w:rFonts w:ascii="Times New Roman" w:hAnsi="Times New Roman" w:cs="Times New Roman"/>
+          <w:b/>
+          <w:color w:val="0E74B5"/>
+          <w:sz w:val="24"/>
+        </w:rPr>
+        <w:t>5.2. Tab Đăng ký môn học</w:t>
+      </w:r>
+    </w:p>
+    <w:p>
+      <w:pPr>
+        <w:spacing w:after="60"/>
+      </w:pPr>
+      <w:r>
+        <w:rPr>
+          <w:rFonts w:ascii="Times New Roman" w:hAnsi="Times New Roman" w:cs="Times New Roman"/>
+          <w:b w:val="0"/>
+          <w:i w:val="0"/>
+          <w:sz w:val="24"/>
+        </w:rPr>
+        <w:t>Gồm hai khu vực:</w:t>
+      </w:r>
+    </w:p>
+    <w:p>
+      <w:pPr>
+        <w:pStyle w:val="ListBullet"/>
+        <w:spacing w:after="40"/>
+        <w:ind w:left="454"/>
+      </w:pPr>
+      <w:r>
+        <w:rPr>
+          <w:rFonts w:ascii="Times New Roman" w:hAnsi="Times New Roman" w:cs="Times New Roman"/>
+          <w:b w:val="0"/>
+          <w:i w:val="0"/>
+          <w:sz w:val="24"/>
+        </w:rPr>
+        <w:t>Khu vực trên — Môn đã đăng ký: danh sách các lớp HS đã chọn, mỗi thẻ có nút Huỷ đăng ký.</w:t>
+      </w:r>
+    </w:p>
+    <w:p>
+      <w:pPr>
+        <w:pStyle w:val="ListBullet"/>
+        <w:spacing w:after="40"/>
+        <w:ind w:left="454"/>
+      </w:pPr>
+      <w:r>
+        <w:rPr>
+          <w:rFonts w:ascii="Times New Roman" w:hAnsi="Times New Roman" w:cs="Times New Roman"/>
+          <w:b w:val="0"/>
+          <w:i w:val="0"/>
+          <w:sz w:val="24"/>
+        </w:rPr>
+        <w:t>Khu vực dưới — Danh sách lớp có thể đăng ký: tất cả lớp phù hợp với khối của HS (đã có đủ địa điểm và sĩ số).</w:t>
+      </w:r>
+    </w:p>
+    <w:p>
+      <w:pPr>
+        <w:spacing w:after="60"/>
+      </w:pPr>
+      <w:r>
+        <w:rPr>
+          <w:rFonts w:ascii="Times New Roman" w:hAnsi="Times New Roman" w:cs="Times New Roman"/>
+          <w:b w:val="0"/>
+          <w:i w:val="0"/>
+          <w:sz w:val="24"/>
+        </w:rPr>
+        <w:t>Badge sĩ số trên mỗi thẻ lớp:</w:t>
+      </w:r>
+    </w:p>
+    <w:p>
+      <w:pPr>
+        <w:pStyle w:val="ListBullet"/>
+        <w:spacing w:after="40"/>
+        <w:ind w:left="454"/>
+      </w:pPr>
+      <w:r>
+        <w:rPr>
+          <w:rFonts w:ascii="Times New Roman" w:hAnsi="Times New Roman" w:cs="Times New Roman"/>
+          <w:b w:val="0"/>
+          <w:i w:val="0"/>
+          <w:sz w:val="24"/>
+        </w:rPr>
+        <w:t>Xanh lá = còn nhiều chỗ trống.</w:t>
+      </w:r>
+    </w:p>
+    <w:p>
+      <w:pPr>
+        <w:pStyle w:val="ListBullet"/>
+        <w:spacing w:after="40"/>
+        <w:ind w:left="454"/>
+      </w:pPr>
+      <w:r>
+        <w:rPr>
+          <w:rFonts w:ascii="Times New Roman" w:hAnsi="Times New Roman" w:cs="Times New Roman"/>
+          <w:b w:val="0"/>
+          <w:i w:val="0"/>
+          <w:sz w:val="24"/>
+        </w:rPr>
+        <w:t>Vàng = gần đầy (≥ 2/3 sĩ số đã đăng ký).</w:t>
+      </w:r>
+    </w:p>
+    <w:p>
+      <w:pPr>
+        <w:pStyle w:val="ListBullet"/>
+        <w:spacing w:after="40"/>
+        <w:ind w:left="454"/>
+      </w:pPr>
+      <w:r>
+        <w:rPr>
+          <w:rFonts w:ascii="Times New Roman" w:hAnsi="Times New Roman" w:cs="Times New Roman"/>
+          <w:b w:val="0"/>
+          <w:i w:val="0"/>
+          <w:sz w:val="24"/>
+        </w:rPr>
+        <w:t>Xám = đã đầy — không thể đăng ký thêm.</w:t>
+      </w:r>
+    </w:p>
+    <w:p>
+      <w:pPr>
+        <w:pStyle w:val="Heading2"/>
+      </w:pPr>
+      <w:r>
+        <w:rPr>
+          <w:rFonts w:ascii="Times New Roman" w:hAnsi="Times New Roman" w:cs="Times New Roman"/>
+          <w:b/>
+          <w:color w:val="0E74B5"/>
+          <w:sz w:val="24"/>
+        </w:rPr>
+        <w:t>5.3. Đăng ký môn học</w:t>
+      </w:r>
+    </w:p>
+    <w:p>
+      <w:pPr>
         <w:spacing w:before="80" w:after="0"/>
         <w:ind w:left="227" w:right="227"/>
-        <w:shd w:val="clear" w:color="auto" w:fill="FFF2CC"/>
+        <w:shd w:val="clear" w:color="auto" w:fill="DEEAF1"/>
       </w:pPr>
       <w:r>
         <w:rPr>
           <w:rFonts w:ascii="Times New Roman" w:hAnsi="Times New Roman" w:cs="Times New Roman"/>
           <w:b/>
           <w:i w:val="0"/>
-          <w:color w:val="BF8F00"/>
+          <w:color w:val="1F497D"/>
           <w:sz w:val="22"/>
         </w:rPr>
-        <w:t xml:space="preserve">  Đổi mật khẩu bắt buộc</w:t>
+        <w:t xml:space="preserve">  Điều kiện</w:t>
       </w:r>
     </w:p>
     <w:p>
       <w:pPr>
-        <w:spacing w:before="0" w:after="100"/>
+        <w:spacing w:before="0" w:after="120"/>
         <w:ind w:left="227" w:right="227"/>
-        <w:shd w:val="clear" w:color="auto" w:fill="FFF2CC"/>
+        <w:shd w:val="clear" w:color="auto" w:fill="DEEAF1"/>
       </w:pPr>
       <w:r>
         <w:rPr>
@@ -1911,7 +3394,256 @@
           <w:i/>
           <w:sz w:val="22"/>
         </w:rPr>
-        <w:t xml:space="preserve">  Lần đầu đăng nhập hoặc sau khi Admin khôi phục MK: hệ thống tự chuyển đến trang Đổi mật khẩu bắt buộc trước khi vào trang chính.</w:t>
+        <w:t xml:space="preserve">  Chỉ thực hiện được khi Giai đoạn 2 đang MỞ.</w:t>
+      </w:r>
+    </w:p>
+    <w:p>
+      <w:pPr>
+        <w:pStyle w:val="ListNumber"/>
+        <w:spacing w:after="40"/>
+        <w:ind w:left="454"/>
+      </w:pPr>
+      <w:r>
+        <w:rPr>
+          <w:rFonts w:ascii="Times New Roman" w:hAnsi="Times New Roman" w:cs="Times New Roman"/>
+          <w:b w:val="0"/>
+          <w:i w:val="0"/>
+          <w:sz w:val="24"/>
+        </w:rPr>
+        <w:t>Chuyển sang tab Đăng ký môn học.</w:t>
+      </w:r>
+    </w:p>
+    <w:p>
+      <w:pPr>
+        <w:pStyle w:val="ListNumber"/>
+        <w:spacing w:after="40"/>
+        <w:ind w:left="454"/>
+      </w:pPr>
+      <w:r>
+        <w:rPr>
+          <w:rFonts w:ascii="Times New Roman" w:hAnsi="Times New Roman" w:cs="Times New Roman"/>
+          <w:b w:val="0"/>
+          <w:i w:val="0"/>
+          <w:sz w:val="24"/>
+        </w:rPr>
+        <w:t>Xem danh sách lớp ở khu vực dưới. Chú ý badge màu sĩ số.</w:t>
+      </w:r>
+    </w:p>
+    <w:p>
+      <w:pPr>
+        <w:pStyle w:val="ListNumber"/>
+        <w:spacing w:after="40"/>
+        <w:ind w:left="454"/>
+      </w:pPr>
+      <w:r>
+        <w:rPr>
+          <w:rFonts w:ascii="Times New Roman" w:hAnsi="Times New Roman" w:cs="Times New Roman"/>
+          <w:b w:val="0"/>
+          <w:i w:val="0"/>
+          <w:sz w:val="24"/>
+        </w:rPr>
+        <w:t>Nhấn nút Đăng ký trên thẻ lớp muốn học.</w:t>
+      </w:r>
+    </w:p>
+    <w:p>
+      <w:pPr>
+        <w:pStyle w:val="ListNumber"/>
+        <w:spacing w:after="40"/>
+        <w:ind w:left="454"/>
+      </w:pPr>
+      <w:r>
+        <w:rPr>
+          <w:rFonts w:ascii="Times New Roman" w:hAnsi="Times New Roman" w:cs="Times New Roman"/>
+          <w:b w:val="0"/>
+          <w:i w:val="0"/>
+          <w:sz w:val="24"/>
+        </w:rPr>
+        <w:t>Nếu không trùng lịch và còn chỗ: thông báo xanh xác nhận thành công.</w:t>
+      </w:r>
+    </w:p>
+    <w:p>
+      <w:pPr>
+        <w:pStyle w:val="ListNumber"/>
+        <w:spacing w:after="40"/>
+        <w:ind w:left="454"/>
+      </w:pPr>
+      <w:r>
+        <w:rPr>
+          <w:rFonts w:ascii="Times New Roman" w:hAnsi="Times New Roman" w:cs="Times New Roman"/>
+          <w:b w:val="0"/>
+          <w:i w:val="0"/>
+          <w:sz w:val="24"/>
+        </w:rPr>
+        <w:t>Lớp vừa đăng ký xuất hiện ở khu vực trên và trong Tab Thời khoá biểu.</w:t>
+      </w:r>
+    </w:p>
+    <w:p>
+      <w:pPr>
+        <w:pStyle w:val="Heading2"/>
+      </w:pPr>
+      <w:r>
+        <w:rPr>
+          <w:rFonts w:ascii="Times New Roman" w:hAnsi="Times New Roman" w:cs="Times New Roman"/>
+          <w:b/>
+          <w:color w:val="0E74B5"/>
+          <w:sz w:val="24"/>
+        </w:rPr>
+        <w:t>5.4. Huỷ đăng ký</w:t>
+      </w:r>
+    </w:p>
+    <w:p>
+      <w:pPr>
+        <w:spacing w:before="80" w:after="0"/>
+        <w:ind w:left="227" w:right="227"/>
+        <w:shd w:val="clear" w:color="auto" w:fill="DEEAF1"/>
+      </w:pPr>
+      <w:r>
+        <w:rPr>
+          <w:rFonts w:ascii="Times New Roman" w:hAnsi="Times New Roman" w:cs="Times New Roman"/>
+          <w:b/>
+          <w:i w:val="0"/>
+          <w:color w:val="1F497D"/>
+          <w:sz w:val="22"/>
+        </w:rPr>
+        <w:t xml:space="preserve">  Điều kiện</w:t>
+      </w:r>
+    </w:p>
+    <w:p>
+      <w:pPr>
+        <w:spacing w:before="0" w:after="120"/>
+        <w:ind w:left="227" w:right="227"/>
+        <w:shd w:val="clear" w:color="auto" w:fill="DEEAF1"/>
+      </w:pPr>
+      <w:r>
+        <w:rPr>
+          <w:rFonts w:ascii="Times New Roman" w:hAnsi="Times New Roman" w:cs="Times New Roman"/>
+          <w:b w:val="0"/>
+          <w:i/>
+          <w:sz w:val="22"/>
+        </w:rPr>
+        <w:t xml:space="preserve">  Chỉ thực hiện được khi Giai đoạn 2 đang MỞ.</w:t>
+      </w:r>
+    </w:p>
+    <w:p>
+      <w:pPr>
+        <w:spacing w:after="60"/>
+      </w:pPr>
+      <w:r>
+        <w:rPr>
+          <w:rFonts w:ascii="Times New Roman" w:hAnsi="Times New Roman" w:cs="Times New Roman"/>
+          <w:b w:val="0"/>
+          <w:i w:val="0"/>
+          <w:sz w:val="24"/>
+        </w:rPr>
+        <w:t>Có hai cách:</w:t>
+      </w:r>
+    </w:p>
+    <w:p>
+      <w:pPr>
+        <w:pStyle w:val="ListBullet"/>
+        <w:spacing w:after="40"/>
+        <w:ind w:left="454"/>
+      </w:pPr>
+      <w:r>
+        <w:rPr>
+          <w:rFonts w:ascii="Times New Roman" w:hAnsi="Times New Roman" w:cs="Times New Roman"/>
+          <w:b w:val="0"/>
+          <w:i w:val="0"/>
+          <w:sz w:val="24"/>
+        </w:rPr>
+        <w:t>Từ khu vực trên: nhấn nút Huỷ đăng ký trên thẻ môn đã đăng ký → xác nhận.</w:t>
+      </w:r>
+    </w:p>
+    <w:p>
+      <w:pPr>
+        <w:pStyle w:val="ListBullet"/>
+        <w:spacing w:after="40"/>
+        <w:ind w:left="454"/>
+      </w:pPr>
+      <w:r>
+        <w:rPr>
+          <w:rFonts w:ascii="Times New Roman" w:hAnsi="Times New Roman" w:cs="Times New Roman"/>
+          <w:b w:val="0"/>
+          <w:i w:val="0"/>
+          <w:sz w:val="24"/>
+        </w:rPr>
+        <w:t>Từ danh sách lớp (khu vực dưới): tìm thẻ đang có nút Huỷ đăng ký màu đỏ → nhấn → xác nhận.</w:t>
+      </w:r>
+    </w:p>
+    <w:p>
+      <w:pPr>
+        <w:pStyle w:val="Heading2"/>
+      </w:pPr>
+      <w:r>
+        <w:rPr>
+          <w:rFonts w:ascii="Times New Roman" w:hAnsi="Times New Roman" w:cs="Times New Roman"/>
+          <w:b/>
+          <w:color w:val="0E74B5"/>
+          <w:sz w:val="24"/>
+        </w:rPr>
+        <w:t>5.5. Xử lý trùng lịch</w:t>
+      </w:r>
+    </w:p>
+    <w:p>
+      <w:pPr>
+        <w:spacing w:after="60"/>
+      </w:pPr>
+      <w:r>
+        <w:rPr>
+          <w:rFonts w:ascii="Times New Roman" w:hAnsi="Times New Roman" w:cs="Times New Roman"/>
+          <w:b w:val="0"/>
+          <w:i w:val="0"/>
+          <w:sz w:val="24"/>
+        </w:rPr>
+        <w:t>Khi đăng ký một lớp có lịch trùng với lớp đã chọn trước:</w:t>
+      </w:r>
+    </w:p>
+    <w:p>
+      <w:pPr>
+        <w:pStyle w:val="ListNumber"/>
+        <w:spacing w:after="40"/>
+        <w:ind w:left="454"/>
+      </w:pPr>
+      <w:r>
+        <w:rPr>
+          <w:rFonts w:ascii="Times New Roman" w:hAnsi="Times New Roman" w:cs="Times New Roman"/>
+          <w:b w:val="0"/>
+          <w:i w:val="0"/>
+          <w:sz w:val="24"/>
+        </w:rPr>
+        <w:t>Hệ thống dừng đăng ký và hiển thị modal thông báo trùng lịch.</w:t>
+      </w:r>
+    </w:p>
+    <w:p>
+      <w:pPr>
+        <w:pStyle w:val="ListNumber"/>
+        <w:spacing w:after="40"/>
+        <w:ind w:left="454"/>
+      </w:pPr>
+      <w:r>
+        <w:rPr>
+          <w:rFonts w:ascii="Times New Roman" w:hAnsi="Times New Roman" w:cs="Times New Roman"/>
+          <w:b w:val="0"/>
+          <w:i w:val="0"/>
+          <w:sz w:val="24"/>
+        </w:rPr>
+        <w:t>Modal hiển thị tên môn, giáo viên và lịch của lớp đang bị trùng.</w:t>
+      </w:r>
+    </w:p>
+    <w:p>
+      <w:pPr>
+        <w:pStyle w:val="ListNumber"/>
+        <w:spacing w:after="40"/>
+        <w:ind w:left="454"/>
+      </w:pPr>
+      <w:r>
+        <w:rPr>
+          <w:rFonts w:ascii="Times New Roman" w:hAnsi="Times New Roman" w:cs="Times New Roman"/>
+          <w:b w:val="0"/>
+          <w:i w:val="0"/>
+          <w:sz w:val="24"/>
+        </w:rPr>
+        <w:t>Nhấn Đóng để quay lại, sau đó chọn lớp khác phù hợp.</w:t>
       </w:r>
     </w:p>
     <w:p>
@@ -1984,7 +3716,7 @@
                 <w:color w:val="FFFFFF"/>
                 <w:sz w:val="22"/>
               </w:rPr>
-              <w:t>Nguyên nhân</w:t>
+              <w:t>Nguyên nhân thường gặp</w:t>
             </w:r>
           </w:p>
         </w:tc>
@@ -2023,7 +3755,7 @@
                 <w:i w:val="0"/>
                 <w:sz w:val="22"/>
               </w:rPr>
-              <w:t>Sai mật khẩu</w:t>
+              <w:t>Sai mật khẩu khi đăng nhập</w:t>
             </w:r>
           </w:p>
         </w:tc>
@@ -2039,7 +3771,7 @@
                 <w:i w:val="0"/>
                 <w:sz w:val="22"/>
               </w:rPr>
-              <w:t>Nhập sai hoặc quên MK</w:t>
+              <w:t>Nhập sai hoặc quên mật khẩu</w:t>
             </w:r>
           </w:p>
         </w:tc>
@@ -2055,7 +3787,7 @@
                 <w:i w:val="0"/>
                 <w:sz w:val="22"/>
               </w:rPr>
-              <w:t>Liên hệ Admin khôi phục MK → nhận MK tạm → đổi ngay</w:t>
+              <w:t>Liên hệ Admin → khôi phục MK → nhận MK tạm 12 ký tự → đăng nhập → đổi MK mới</w:t>
             </w:r>
           </w:p>
         </w:tc>
@@ -2108,7 +3840,7 @@
                 <w:i w:val="0"/>
                 <w:sz w:val="22"/>
               </w:rPr>
-              <w:t>Admin vào /admin/class-reg → Mở đăng ký GV</w:t>
+              <w:t>Admin vào /admin/class-reg → nhấn Mở đăng ký GV</w:t>
             </w:r>
           </w:p>
         </w:tc>
@@ -2142,7 +3874,7 @@
                 <w:i w:val="0"/>
                 <w:sz w:val="22"/>
               </w:rPr>
-              <w:t>Giai đoạn 2 chưa mở hoặc lớp đã đầy (badge xám)</w:t>
+              <w:t>GĐ2 chưa mở, hoặc lớp đã đầy (badge xám)</w:t>
             </w:r>
           </w:p>
         </w:tc>
@@ -2158,7 +3890,7 @@
                 <w:i w:val="0"/>
                 <w:sz w:val="22"/>
               </w:rPr>
-              <w:t>Kiểm tra badge màu; nếu không xám → Admin mở Giai đoạn 2</w:t>
+              <w:t>Kiểm tra badge; nếu không xám → Admin mở Giai đoạn 2</w:t>
             </w:r>
           </w:p>
         </w:tc>
@@ -2211,7 +3943,7 @@
                 <w:i w:val="0"/>
                 <w:sz w:val="22"/>
               </w:rPr>
-              <w:t>Admin vào /admin/class-reg → điền phòng &amp; sĩ số</w:t>
+              <w:t>Admin vào /admin/class-reg → điền đủ phòng học &amp; sĩ số cho lớp đó</w:t>
             </w:r>
           </w:p>
         </w:tc>
@@ -2229,7 +3961,7 @@
                 <w:i w:val="0"/>
                 <w:sz w:val="22"/>
               </w:rPr>
-              <w:t>Lỗi nhập Excel</w:t>
+              <w:t>Lỗi khi nhập file Excel</w:t>
             </w:r>
           </w:p>
         </w:tc>
@@ -2245,7 +3977,7 @@
                 <w:i w:val="0"/>
                 <w:sz w:val="22"/>
               </w:rPr>
-              <w:t>Sai định dạng cột hoặc dữ liệu trùng</w:t>
+              <w:t>Sai định dạng cột hoặc CCCD/Mã GV trùng</w:t>
             </w:r>
           </w:p>
         </w:tc>
@@ -2261,7 +3993,7 @@
                 <w:i w:val="0"/>
                 <w:sz w:val="22"/>
               </w:rPr>
-              <w:t>Tải file mẫu mới; không đổi tên cột; kiểm tra CCCD không trùng</w:t>
+              <w:t>Tải lại file mẫu mới nhất; không đổi tên cột; kiểm tra dữ liệu trùng lặp</w:t>
             </w:r>
           </w:p>
         </w:tc>
@@ -2280,7 +4012,7 @@
                 <w:i w:val="0"/>
                 <w:sz w:val="22"/>
               </w:rPr>
-              <w:t>Trang tải chậm / lỗi kết nối</w:t>
+              <w:t>Trang tải chậm hoặc báo lỗi</w:t>
             </w:r>
           </w:p>
         </w:tc>
@@ -2314,7 +4046,7 @@
                 <w:i w:val="0"/>
                 <w:sz w:val="22"/>
               </w:rPr>
-              <w:t>Nhấn F5 tải lại; báo bộ phận kỹ thuật nếu kéo dài</w:t>
+              <w:t>Nhấn F5 tải lại trang; báo bộ phận kỹ thuật nếu lỗi kéo dài hơn 5 phút</w:t>
             </w:r>
           </w:p>
         </w:tc>
@@ -2324,6 +4056,194 @@
       <w:pPr>
         <w:spacing w:after="40"/>
       </w:pPr>
+    </w:p>
+    <w:p>
+      <w:pPr>
+        <w:pStyle w:val="Heading1"/>
+      </w:pPr>
+      <w:r>
+        <w:rPr>
+          <w:rFonts w:ascii="Times New Roman" w:hAnsi="Times New Roman" w:cs="Times New Roman"/>
+          <w:b/>
+          <w:color w:val="1F497D"/>
+          <w:sz w:val="28"/>
+        </w:rPr>
+        <w:t>7. QUY TRÌNH VẬN HÀNH TỔNG QUÁT</w:t>
+      </w:r>
+    </w:p>
+    <w:p>
+      <w:pPr>
+        <w:spacing w:after="60"/>
+      </w:pPr>
+      <w:r>
+        <w:rPr>
+          <w:rFonts w:ascii="Times New Roman" w:hAnsi="Times New Roman" w:cs="Times New Roman"/>
+          <w:b w:val="0"/>
+          <w:i w:val="0"/>
+          <w:sz w:val="24"/>
+        </w:rPr>
+        <w:t>Dưới đây là trình tự đúng để vận hành một chu kỳ đăng ký đầy đủ:</w:t>
+      </w:r>
+    </w:p>
+    <w:p>
+      <w:pPr>
+        <w:pStyle w:val="ListNumber"/>
+        <w:spacing w:after="40"/>
+        <w:ind w:left="454"/>
+      </w:pPr>
+      <w:r>
+        <w:rPr>
+          <w:rFonts w:ascii="Times New Roman" w:hAnsi="Times New Roman" w:cs="Times New Roman"/>
+          <w:b w:val="0"/>
+          <w:i w:val="0"/>
+          <w:sz w:val="24"/>
+        </w:rPr>
+        <w:t>Admin tạo tài khoản GV và HS (thủ công, nhập Excel, hoặc dùng nút Tạo dữ liệu mẫu nếu kiểm thử).</w:t>
+      </w:r>
+    </w:p>
+    <w:p>
+      <w:pPr>
+        <w:pStyle w:val="ListNumber"/>
+        <w:spacing w:after="40"/>
+        <w:ind w:left="454"/>
+      </w:pPr>
+      <w:r>
+        <w:rPr>
+          <w:rFonts w:ascii="Times New Roman" w:hAnsi="Times New Roman" w:cs="Times New Roman"/>
+          <w:b w:val="0"/>
+          <w:i w:val="0"/>
+          <w:sz w:val="24"/>
+        </w:rPr>
+        <w:t>Admin vào /admin/class-reg → nhấn Mở đăng ký GV (bắt đầu Giai đoạn 1).</w:t>
+      </w:r>
+    </w:p>
+    <w:p>
+      <w:pPr>
+        <w:pStyle w:val="ListNumber"/>
+        <w:spacing w:after="40"/>
+        <w:ind w:left="454"/>
+      </w:pPr>
+      <w:r>
+        <w:rPr>
+          <w:rFonts w:ascii="Times New Roman" w:hAnsi="Times New Roman" w:cs="Times New Roman"/>
+          <w:b w:val="0"/>
+          <w:i w:val="0"/>
+          <w:sz w:val="24"/>
+        </w:rPr>
+        <w:t>Giáo viên đăng nhập → đăng ký lịch mở lớp trên bảng thời khoá biểu.</w:t>
+      </w:r>
+    </w:p>
+    <w:p>
+      <w:pPr>
+        <w:pStyle w:val="ListNumber"/>
+        <w:spacing w:after="40"/>
+        <w:ind w:left="454"/>
+      </w:pPr>
+      <w:r>
+        <w:rPr>
+          <w:rFonts w:ascii="Times New Roman" w:hAnsi="Times New Roman" w:cs="Times New Roman"/>
+          <w:b w:val="0"/>
+          <w:i w:val="0"/>
+          <w:sz w:val="24"/>
+        </w:rPr>
+        <w:t>Admin nhấn Đóng đăng ký GV (kết thúc Giai đoạn 1).</w:t>
+      </w:r>
+    </w:p>
+    <w:p>
+      <w:pPr>
+        <w:pStyle w:val="ListNumber"/>
+        <w:spacing w:after="40"/>
+        <w:ind w:left="454"/>
+      </w:pPr>
+      <w:r>
+        <w:rPr>
+          <w:rFonts w:ascii="Times New Roman" w:hAnsi="Times New Roman" w:cs="Times New Roman"/>
+          <w:b w:val="0"/>
+          <w:i w:val="0"/>
+          <w:sz w:val="24"/>
+        </w:rPr>
+        <w:t>Admin điền phòng học và sĩ số tối đa cho từng lớp tại /admin/class-reg.</w:t>
+      </w:r>
+    </w:p>
+    <w:p>
+      <w:pPr>
+        <w:pStyle w:val="ListNumber"/>
+        <w:spacing w:after="40"/>
+        <w:ind w:left="454"/>
+      </w:pPr>
+      <w:r>
+        <w:rPr>
+          <w:rFonts w:ascii="Times New Roman" w:hAnsi="Times New Roman" w:cs="Times New Roman"/>
+          <w:b w:val="0"/>
+          <w:i w:val="0"/>
+          <w:sz w:val="24"/>
+        </w:rPr>
+        <w:t>Kiểm tra: không còn lớp nào có viền đỏ cảnh báo.</w:t>
+      </w:r>
+    </w:p>
+    <w:p>
+      <w:pPr>
+        <w:pStyle w:val="ListNumber"/>
+        <w:spacing w:after="40"/>
+        <w:ind w:left="454"/>
+      </w:pPr>
+      <w:r>
+        <w:rPr>
+          <w:rFonts w:ascii="Times New Roman" w:hAnsi="Times New Roman" w:cs="Times New Roman"/>
+          <w:b w:val="0"/>
+          <w:i w:val="0"/>
+          <w:sz w:val="24"/>
+        </w:rPr>
+        <w:t>Admin vào /admin/enrollment → nhấn Mở đăng ký HS (bắt đầu Giai đoạn 2).</w:t>
+      </w:r>
+    </w:p>
+    <w:p>
+      <w:pPr>
+        <w:pStyle w:val="ListNumber"/>
+        <w:spacing w:after="40"/>
+        <w:ind w:left="454"/>
+      </w:pPr>
+      <w:r>
+        <w:rPr>
+          <w:rFonts w:ascii="Times New Roman" w:hAnsi="Times New Roman" w:cs="Times New Roman"/>
+          <w:b w:val="0"/>
+          <w:i w:val="0"/>
+          <w:sz w:val="24"/>
+        </w:rPr>
+        <w:t>Học sinh đăng nhập → đăng ký các môn học theo khối.</w:t>
+      </w:r>
+    </w:p>
+    <w:p>
+      <w:pPr>
+        <w:pStyle w:val="ListNumber"/>
+        <w:spacing w:after="40"/>
+        <w:ind w:left="454"/>
+      </w:pPr>
+      <w:r>
+        <w:rPr>
+          <w:rFonts w:ascii="Times New Roman" w:hAnsi="Times New Roman" w:cs="Times New Roman"/>
+          <w:b w:val="0"/>
+          <w:i w:val="0"/>
+          <w:sz w:val="24"/>
+        </w:rPr>
+        <w:t>Admin nhấn Đóng đăng ký HS (kết thúc Giai đoạn 2).</w:t>
+      </w:r>
+    </w:p>
+    <w:p>
+      <w:pPr>
+        <w:pStyle w:val="ListNumber"/>
+        <w:spacing w:after="40"/>
+        <w:ind w:left="454"/>
+      </w:pPr>
+      <w:r>
+        <w:rPr>
+          <w:rFonts w:ascii="Times New Roman" w:hAnsi="Times New Roman" w:cs="Times New Roman"/>
+          <w:b w:val="0"/>
+          <w:i w:val="0"/>
+          <w:sz w:val="24"/>
+        </w:rPr>
+        <w:t>Admin xuất file Excel kết quả tại /admin/enrollment → dùng để lập danh sách lớp, báo cáo.</w:t>
+      </w:r>
     </w:p>
     <w:p/>
     <w:p>

</xml_diff>